<commit_message>
update resume: seperate uni and dissertation project
</commit_message>
<xml_diff>
--- a/apache2/www/public/engineer/engineer-resume.docx
+++ b/apache2/www/public/engineer/engineer-resume.docx
@@ -1808,7 +1808,7 @@
         <w:pStyle w:val="ListParagraph"/>
         <w:numPr>
           <w:ilvl w:val="0"/>
-          <w:numId w:val="6"/>
+          <w:numId w:val="3"/>
         </w:numPr>
         <w:pBdr>
           <w:top w:val="nil"/>
@@ -1828,32 +1828,622 @@
       <w:r>
         <w:rPr>
           <w:rFonts w:ascii="Arial" w:eastAsia="Calibri" w:hAnsi="Arial" w:cs="Arial"/>
-          <w:bCs/>
-          <w:color w:val="000000"/>
-          <w:sz w:val="20"/>
-          <w:szCs w:val="20"/>
-        </w:rPr>
-        <w:t>Pioneered creation of dung beetle biorobot</w:t>
-      </w:r>
-      <w:r>
-        <w:rPr>
-          <w:rFonts w:ascii="Arial" w:eastAsia="Calibri" w:hAnsi="Arial" w:cs="Arial"/>
-          <w:bCs/>
-          <w:color w:val="000000"/>
-          <w:sz w:val="20"/>
-          <w:szCs w:val="20"/>
-        </w:rPr>
-        <w:t xml:space="preserve"> with sophisticated neural model </w:t>
-      </w:r>
-      <w:r>
-        <w:rPr>
-          <w:rFonts w:ascii="Arial" w:eastAsia="Calibri" w:hAnsi="Arial" w:cs="Arial"/>
-          <w:bCs/>
-          <w:color w:val="000000"/>
-          <w:sz w:val="20"/>
-          <w:szCs w:val="20"/>
-        </w:rPr>
-        <w:t>during dissertation project (82%).</w:t>
+          <w:color w:val="000000"/>
+          <w:sz w:val="20"/>
+          <w:szCs w:val="20"/>
+        </w:rPr>
+        <w:t xml:space="preserve">Awarded </w:t>
+      </w:r>
+      <w:r>
+        <w:rPr>
+          <w:rFonts w:ascii="Arial" w:eastAsia="Calibri" w:hAnsi="Arial" w:cs="Arial"/>
+          <w:color w:val="000000"/>
+          <w:sz w:val="20"/>
+          <w:szCs w:val="20"/>
+        </w:rPr>
+        <w:t>British Computer Society</w:t>
+      </w:r>
+      <w:r>
+        <w:rPr>
+          <w:rFonts w:ascii="Arial" w:eastAsia="Calibri" w:hAnsi="Arial" w:cs="Arial"/>
+          <w:color w:val="000000"/>
+          <w:sz w:val="20"/>
+          <w:szCs w:val="20"/>
+        </w:rPr>
+        <w:t xml:space="preserve"> (BCS)</w:t>
+      </w:r>
+      <w:r>
+        <w:rPr>
+          <w:rFonts w:ascii="Arial" w:eastAsia="Calibri" w:hAnsi="Arial" w:cs="Arial"/>
+          <w:color w:val="000000"/>
+          <w:sz w:val="20"/>
+          <w:szCs w:val="20"/>
+        </w:rPr>
+        <w:t xml:space="preserve"> Prize for </w:t>
+      </w:r>
+      <w:r>
+        <w:rPr>
+          <w:rFonts w:ascii="Arial" w:eastAsia="Calibri" w:hAnsi="Arial" w:cs="Arial"/>
+          <w:color w:val="000000"/>
+          <w:sz w:val="20"/>
+          <w:szCs w:val="20"/>
+        </w:rPr>
+        <w:t xml:space="preserve">Top Performance in </w:t>
+      </w:r>
+      <w:r>
+        <w:rPr>
+          <w:rFonts w:ascii="Arial" w:eastAsia="Calibri" w:hAnsi="Arial" w:cs="Arial"/>
+          <w:color w:val="000000"/>
+          <w:sz w:val="20"/>
+          <w:szCs w:val="20"/>
+        </w:rPr>
+        <w:t>Professional Issues</w:t>
+      </w:r>
+      <w:r>
+        <w:rPr>
+          <w:rFonts w:ascii="Arial" w:eastAsia="Calibri" w:hAnsi="Arial" w:cs="Arial"/>
+          <w:color w:val="000000"/>
+          <w:sz w:val="20"/>
+          <w:szCs w:val="20"/>
+        </w:rPr>
+        <w:t xml:space="preserve"> (99%).</w:t>
+      </w:r>
+    </w:p>
+    <w:p>
+      <w:pPr>
+        <w:pBdr>
+          <w:top w:val="nil"/>
+          <w:left w:val="nil"/>
+          <w:bottom w:val="single" w:sz="4" w:space="1" w:color="000000"/>
+          <w:right w:val="nil"/>
+          <w:between w:val="nil"/>
+        </w:pBdr>
+        <w:rPr>
+          <w:rFonts w:ascii="Arial" w:eastAsia="Calibri" w:hAnsi="Arial" w:cs="Arial"/>
+          <w:b/>
+          <w:smallCaps/>
+          <w:color w:val="000000"/>
+          <w:sz w:val="20"/>
+          <w:szCs w:val="20"/>
+        </w:rPr>
+      </w:pPr>
+    </w:p>
+    <w:p>
+      <w:pPr>
+        <w:pBdr>
+          <w:top w:val="nil"/>
+          <w:left w:val="nil"/>
+          <w:bottom w:val="nil"/>
+          <w:right w:val="nil"/>
+          <w:between w:val="nil"/>
+        </w:pBdr>
+        <w:spacing w:before="120"/>
+        <w:rPr>
+          <w:rFonts w:ascii="Arial" w:eastAsia="Calibri" w:hAnsi="Arial" w:cs="Arial"/>
+          <w:b/>
+          <w:color w:val="000000"/>
+          <w:sz w:val="22"/>
+          <w:szCs w:val="22"/>
+        </w:rPr>
+      </w:pPr>
+      <w:r>
+        <w:rPr>
+          <w:rFonts w:ascii="Arial" w:eastAsia="Calibri" w:hAnsi="Arial" w:cs="Arial"/>
+          <w:b/>
+          <w:color w:val="000000"/>
+          <w:sz w:val="22"/>
+          <w:szCs w:val="22"/>
+        </w:rPr>
+        <w:t>PROJECTS</w:t>
+      </w:r>
+    </w:p>
+    <w:p>
+      <w:pPr>
+        <w:pBdr>
+          <w:top w:val="nil"/>
+          <w:left w:val="nil"/>
+          <w:bottom w:val="nil"/>
+          <w:right w:val="nil"/>
+          <w:between w:val="nil"/>
+        </w:pBdr>
+        <w:spacing w:before="120"/>
+        <w:rPr>
+          <w:rFonts w:ascii="Arial" w:eastAsia="Calibri" w:hAnsi="Arial" w:cs="Arial"/>
+          <w:b/>
+          <w:color w:val="000000"/>
+          <w:sz w:val="20"/>
+          <w:szCs w:val="20"/>
+        </w:rPr>
+      </w:pPr>
+      <w:r>
+        <w:rPr>
+          <w:rFonts w:ascii="Arial" w:eastAsia="Calibri" w:hAnsi="Arial" w:cs="Arial"/>
+          <w:b/>
+          <w:color w:val="000000"/>
+          <w:sz w:val="20"/>
+          <w:szCs w:val="20"/>
+        </w:rPr>
+        <w:t>P</w:t>
+      </w:r>
+      <w:r>
+        <w:rPr>
+          <w:rFonts w:ascii="Arial" w:eastAsia="Calibri" w:hAnsi="Arial" w:cs="Arial"/>
+          <w:b/>
+          <w:color w:val="000000"/>
+          <w:sz w:val="20"/>
+          <w:szCs w:val="20"/>
+        </w:rPr>
+        <w:t>ersonal website</w:t>
+      </w:r>
+      <w:r>
+        <w:rPr>
+          <w:rFonts w:ascii="Arial" w:eastAsia="Calibri" w:hAnsi="Arial" w:cs="Arial"/>
+          <w:b/>
+          <w:color w:val="000000"/>
+          <w:sz w:val="20"/>
+          <w:szCs w:val="20"/>
+        </w:rPr>
+        <w:t xml:space="preserve"> / </w:t>
+      </w:r>
+      <w:hyperlink r:id="rId12" w:history="1">
+        <w:r>
+          <w:rPr>
+            <w:rStyle w:val="Hyperlink"/>
+            <w:rFonts w:ascii="Arial" w:eastAsia="Calibri" w:hAnsi="Arial" w:cs="Arial"/>
+            <w:b/>
+            <w:sz w:val="20"/>
+            <w:szCs w:val="20"/>
+          </w:rPr>
+          <w:t>https://rmsy.me</w:t>
+        </w:r>
+      </w:hyperlink>
+      <w:r>
+        <w:rPr>
+          <w:rFonts w:ascii="Arial" w:eastAsia="Calibri" w:hAnsi="Arial" w:cs="Arial"/>
+          <w:b/>
+          <w:color w:val="000000"/>
+          <w:sz w:val="20"/>
+          <w:szCs w:val="20"/>
+        </w:rPr>
+        <w:t xml:space="preserve"> /</w:t>
+      </w:r>
+      <w:r>
+        <w:rPr>
+          <w:rFonts w:ascii="Arial" w:eastAsia="Calibri" w:hAnsi="Arial" w:cs="Arial"/>
+          <w:b/>
+          <w:color w:val="000000"/>
+          <w:sz w:val="20"/>
+          <w:szCs w:val="20"/>
+        </w:rPr>
+        <w:t xml:space="preserve"> </w:t>
+      </w:r>
+      <w:hyperlink r:id="rId13" w:history="1">
+        <w:r>
+          <w:rPr>
+            <w:rStyle w:val="Hyperlink"/>
+            <w:rFonts w:ascii="Arial" w:eastAsia="Calibri" w:hAnsi="Arial" w:cs="Arial"/>
+            <w:b/>
+            <w:sz w:val="20"/>
+            <w:szCs w:val="20"/>
+          </w:rPr>
+          <w:t>https://github.com/relnaggar/rmsy.me</w:t>
+        </w:r>
+      </w:hyperlink>
+    </w:p>
+    <w:p>
+      <w:pPr>
+        <w:pStyle w:val="ListParagraph"/>
+        <w:numPr>
+          <w:ilvl w:val="0"/>
+          <w:numId w:val="2"/>
+        </w:numPr>
+        <w:pBdr>
+          <w:top w:val="nil"/>
+          <w:left w:val="nil"/>
+          <w:bottom w:val="nil"/>
+          <w:right w:val="nil"/>
+          <w:between w:val="nil"/>
+        </w:pBdr>
+        <w:rPr>
+          <w:rFonts w:ascii="Arial" w:eastAsia="Calibri" w:hAnsi="Arial" w:cs="Arial"/>
+          <w:color w:val="000000"/>
+          <w:sz w:val="20"/>
+          <w:szCs w:val="20"/>
+        </w:rPr>
+      </w:pPr>
+      <w:r>
+        <w:rPr>
+          <w:rFonts w:ascii="Arial" w:eastAsia="Calibri" w:hAnsi="Arial" w:cs="Arial"/>
+          <w:color w:val="000000"/>
+          <w:sz w:val="20"/>
+          <w:szCs w:val="20"/>
+        </w:rPr>
+        <w:t>D</w:t>
+      </w:r>
+      <w:r>
+        <w:rPr>
+          <w:rFonts w:ascii="Arial" w:eastAsia="Calibri" w:hAnsi="Arial" w:cs="Arial"/>
+          <w:color w:val="000000"/>
+          <w:sz w:val="20"/>
+          <w:szCs w:val="20"/>
+        </w:rPr>
+        <w:t xml:space="preserve">esigned </w:t>
+      </w:r>
+      <w:r>
+        <w:rPr>
+          <w:rFonts w:ascii="Arial" w:eastAsia="Calibri" w:hAnsi="Arial" w:cs="Arial"/>
+          <w:color w:val="000000"/>
+          <w:sz w:val="20"/>
+          <w:szCs w:val="20"/>
+        </w:rPr>
+        <w:t xml:space="preserve">responsive </w:t>
+      </w:r>
+      <w:r>
+        <w:rPr>
+          <w:rFonts w:ascii="Arial" w:eastAsia="Calibri" w:hAnsi="Arial" w:cs="Arial"/>
+          <w:color w:val="000000"/>
+          <w:sz w:val="20"/>
+          <w:szCs w:val="20"/>
+        </w:rPr>
+        <w:t xml:space="preserve">front-end </w:t>
+      </w:r>
+      <w:r>
+        <w:rPr>
+          <w:rFonts w:ascii="Arial" w:eastAsia="Calibri" w:hAnsi="Arial" w:cs="Arial"/>
+          <w:color w:val="000000"/>
+          <w:sz w:val="20"/>
+          <w:szCs w:val="20"/>
+        </w:rPr>
+        <w:t>HTML/CSS templates</w:t>
+      </w:r>
+      <w:r>
+        <w:rPr>
+          <w:rFonts w:ascii="Arial" w:eastAsia="Calibri" w:hAnsi="Arial" w:cs="Arial"/>
+          <w:color w:val="000000"/>
+          <w:sz w:val="20"/>
+          <w:szCs w:val="20"/>
+        </w:rPr>
+        <w:t xml:space="preserve"> with Bootstrap.</w:t>
+      </w:r>
+    </w:p>
+    <w:p>
+      <w:pPr>
+        <w:pStyle w:val="ListParagraph"/>
+        <w:numPr>
+          <w:ilvl w:val="0"/>
+          <w:numId w:val="2"/>
+        </w:numPr>
+        <w:pBdr>
+          <w:top w:val="nil"/>
+          <w:left w:val="nil"/>
+          <w:bottom w:val="nil"/>
+          <w:right w:val="nil"/>
+          <w:between w:val="nil"/>
+        </w:pBdr>
+        <w:rPr>
+          <w:rFonts w:ascii="Arial" w:eastAsia="Calibri" w:hAnsi="Arial" w:cs="Arial"/>
+          <w:color w:val="000000"/>
+          <w:sz w:val="20"/>
+          <w:szCs w:val="20"/>
+        </w:rPr>
+      </w:pPr>
+      <w:r>
+        <w:rPr>
+          <w:rFonts w:ascii="Arial" w:eastAsia="Calibri" w:hAnsi="Arial" w:cs="Arial"/>
+          <w:color w:val="000000"/>
+          <w:sz w:val="20"/>
+          <w:szCs w:val="20"/>
+        </w:rPr>
+        <w:t>B</w:t>
+      </w:r>
+      <w:r>
+        <w:rPr>
+          <w:rFonts w:ascii="Arial" w:eastAsia="Calibri" w:hAnsi="Arial" w:cs="Arial"/>
+          <w:color w:val="000000"/>
+          <w:sz w:val="20"/>
+          <w:szCs w:val="20"/>
+        </w:rPr>
+        <w:t xml:space="preserve">uilt reusable </w:t>
+      </w:r>
+      <w:r>
+        <w:rPr>
+          <w:rFonts w:ascii="Arial" w:eastAsia="Calibri" w:hAnsi="Arial" w:cs="Arial"/>
+          <w:color w:val="000000"/>
+          <w:sz w:val="20"/>
+          <w:szCs w:val="20"/>
+        </w:rPr>
+        <w:t xml:space="preserve">back-end </w:t>
+      </w:r>
+      <w:r>
+        <w:rPr>
+          <w:rFonts w:ascii="Arial" w:eastAsia="Calibri" w:hAnsi="Arial" w:cs="Arial"/>
+          <w:color w:val="000000"/>
+          <w:sz w:val="20"/>
+          <w:szCs w:val="20"/>
+        </w:rPr>
+        <w:t>PHP framework</w:t>
+      </w:r>
+      <w:r>
+        <w:rPr>
+          <w:rFonts w:ascii="Arial" w:eastAsia="Calibri" w:hAnsi="Arial" w:cs="Arial"/>
+          <w:color w:val="000000"/>
+          <w:sz w:val="20"/>
+          <w:szCs w:val="20"/>
+        </w:rPr>
+        <w:t xml:space="preserve"> from scratch</w:t>
+      </w:r>
+      <w:r>
+        <w:rPr>
+          <w:rFonts w:ascii="Arial" w:eastAsia="Calibri" w:hAnsi="Arial" w:cs="Arial"/>
+          <w:color w:val="000000"/>
+          <w:sz w:val="20"/>
+          <w:szCs w:val="20"/>
+        </w:rPr>
+        <w:t>.</w:t>
+      </w:r>
+    </w:p>
+    <w:p>
+      <w:pPr>
+        <w:pStyle w:val="ListParagraph"/>
+        <w:numPr>
+          <w:ilvl w:val="0"/>
+          <w:numId w:val="2"/>
+        </w:numPr>
+        <w:pBdr>
+          <w:top w:val="nil"/>
+          <w:left w:val="nil"/>
+          <w:bottom w:val="nil"/>
+          <w:right w:val="nil"/>
+          <w:between w:val="nil"/>
+        </w:pBdr>
+        <w:rPr>
+          <w:rFonts w:ascii="Arial" w:eastAsia="Calibri" w:hAnsi="Arial" w:cs="Arial"/>
+          <w:color w:val="000000"/>
+          <w:sz w:val="20"/>
+          <w:szCs w:val="20"/>
+        </w:rPr>
+      </w:pPr>
+      <w:r>
+        <w:rPr>
+          <w:rFonts w:ascii="Arial" w:eastAsia="Calibri" w:hAnsi="Arial" w:cs="Arial"/>
+          <w:color w:val="000000"/>
+          <w:sz w:val="20"/>
+          <w:szCs w:val="20"/>
+        </w:rPr>
+        <w:t>C</w:t>
+      </w:r>
+      <w:r>
+        <w:rPr>
+          <w:rFonts w:ascii="Arial" w:eastAsia="Calibri" w:hAnsi="Arial" w:cs="Arial"/>
+          <w:color w:val="000000"/>
+          <w:sz w:val="20"/>
+          <w:szCs w:val="20"/>
+        </w:rPr>
+        <w:t>ontaineri</w:t>
+      </w:r>
+      <w:r>
+        <w:rPr>
+          <w:rFonts w:ascii="Arial" w:eastAsia="Calibri" w:hAnsi="Arial" w:cs="Arial"/>
+          <w:color w:val="000000"/>
+          <w:sz w:val="20"/>
+          <w:szCs w:val="20"/>
+        </w:rPr>
+        <w:t>s</w:t>
+      </w:r>
+      <w:r>
+        <w:rPr>
+          <w:rFonts w:ascii="Arial" w:eastAsia="Calibri" w:hAnsi="Arial" w:cs="Arial"/>
+          <w:color w:val="000000"/>
+          <w:sz w:val="20"/>
+          <w:szCs w:val="20"/>
+        </w:rPr>
+        <w:t>ed</w:t>
+      </w:r>
+      <w:r>
+        <w:rPr>
+          <w:rFonts w:ascii="Arial" w:eastAsia="Calibri" w:hAnsi="Arial" w:cs="Arial"/>
+          <w:color w:val="000000"/>
+          <w:sz w:val="20"/>
+          <w:szCs w:val="20"/>
+        </w:rPr>
+        <w:t xml:space="preserve"> application </w:t>
+      </w:r>
+      <w:r>
+        <w:rPr>
+          <w:rFonts w:ascii="Arial" w:eastAsia="Calibri" w:hAnsi="Arial" w:cs="Arial"/>
+          <w:color w:val="000000"/>
+          <w:sz w:val="20"/>
+          <w:szCs w:val="20"/>
+        </w:rPr>
+        <w:t xml:space="preserve">using Docker, built </w:t>
+      </w:r>
+      <w:r>
+        <w:rPr>
+          <w:rFonts w:ascii="Arial" w:eastAsia="Calibri" w:hAnsi="Arial" w:cs="Arial"/>
+          <w:color w:val="000000"/>
+          <w:sz w:val="20"/>
+          <w:szCs w:val="20"/>
+        </w:rPr>
+        <w:t>a</w:t>
+      </w:r>
+      <w:r>
+        <w:rPr>
+          <w:rFonts w:ascii="Arial" w:eastAsia="Calibri" w:hAnsi="Arial" w:cs="Arial"/>
+          <w:color w:val="000000"/>
+          <w:sz w:val="20"/>
+          <w:szCs w:val="20"/>
+        </w:rPr>
+        <w:t xml:space="preserve">utomated </w:t>
+      </w:r>
+      <w:r>
+        <w:rPr>
+          <w:rFonts w:ascii="Arial" w:eastAsia="Calibri" w:hAnsi="Arial" w:cs="Arial"/>
+          <w:color w:val="000000"/>
+          <w:sz w:val="20"/>
+          <w:szCs w:val="20"/>
+        </w:rPr>
+        <w:t xml:space="preserve">DevOps </w:t>
+      </w:r>
+      <w:r>
+        <w:rPr>
+          <w:rFonts w:ascii="Arial" w:eastAsia="Calibri" w:hAnsi="Arial" w:cs="Arial"/>
+          <w:color w:val="000000"/>
+          <w:sz w:val="20"/>
+          <w:szCs w:val="20"/>
+        </w:rPr>
+        <w:t xml:space="preserve">pipeline </w:t>
+      </w:r>
+      <w:r>
+        <w:rPr>
+          <w:rFonts w:ascii="Arial" w:eastAsia="Calibri" w:hAnsi="Arial" w:cs="Arial"/>
+          <w:color w:val="000000"/>
+          <w:sz w:val="20"/>
+          <w:szCs w:val="20"/>
+        </w:rPr>
+        <w:t>using</w:t>
+      </w:r>
+      <w:r>
+        <w:rPr>
+          <w:rFonts w:ascii="Arial" w:eastAsia="Calibri" w:hAnsi="Arial" w:cs="Arial"/>
+          <w:color w:val="000000"/>
+          <w:sz w:val="20"/>
+          <w:szCs w:val="20"/>
+        </w:rPr>
+        <w:t xml:space="preserve"> Bash scripts</w:t>
+      </w:r>
+      <w:r>
+        <w:rPr>
+          <w:rFonts w:ascii="Arial" w:eastAsia="Calibri" w:hAnsi="Arial" w:cs="Arial"/>
+          <w:color w:val="000000"/>
+          <w:sz w:val="20"/>
+          <w:szCs w:val="20"/>
+        </w:rPr>
+        <w:t xml:space="preserve"> and Git hooks;</w:t>
+      </w:r>
+      <w:r>
+        <w:rPr>
+          <w:rFonts w:ascii="Arial" w:eastAsia="Calibri" w:hAnsi="Arial" w:cs="Arial"/>
+          <w:color w:val="000000"/>
+          <w:sz w:val="20"/>
+          <w:szCs w:val="20"/>
+        </w:rPr>
+        <w:t xml:space="preserve"> </w:t>
+      </w:r>
+      <w:r>
+        <w:rPr>
+          <w:rFonts w:ascii="Arial" w:eastAsia="Calibri" w:hAnsi="Arial" w:cs="Arial"/>
+          <w:color w:val="000000"/>
+          <w:sz w:val="20"/>
+          <w:szCs w:val="20"/>
+        </w:rPr>
+        <w:t>c</w:t>
+      </w:r>
+      <w:r>
+        <w:rPr>
+          <w:rFonts w:ascii="Arial" w:eastAsia="Calibri" w:hAnsi="Arial" w:cs="Arial"/>
+          <w:color w:val="000000"/>
+          <w:sz w:val="20"/>
+          <w:szCs w:val="20"/>
+        </w:rPr>
+        <w:t xml:space="preserve">onfigured AWS EC2 instance and Apache </w:t>
+      </w:r>
+      <w:r>
+        <w:rPr>
+          <w:rFonts w:ascii="Arial" w:eastAsia="Calibri" w:hAnsi="Arial" w:cs="Arial"/>
+          <w:color w:val="000000"/>
+          <w:sz w:val="20"/>
+          <w:szCs w:val="20"/>
+        </w:rPr>
+        <w:t xml:space="preserve">HTTP </w:t>
+      </w:r>
+      <w:r>
+        <w:rPr>
+          <w:rFonts w:ascii="Arial" w:eastAsia="Calibri" w:hAnsi="Arial" w:cs="Arial"/>
+          <w:color w:val="000000"/>
+          <w:sz w:val="20"/>
+          <w:szCs w:val="20"/>
+        </w:rPr>
+        <w:t>Server manually</w:t>
+      </w:r>
+      <w:r>
+        <w:rPr>
+          <w:rFonts w:ascii="Arial" w:eastAsia="Calibri" w:hAnsi="Arial" w:cs="Arial"/>
+          <w:color w:val="000000"/>
+          <w:sz w:val="20"/>
+          <w:szCs w:val="20"/>
+        </w:rPr>
+        <w:t>.</w:t>
+      </w:r>
+    </w:p>
+    <w:p>
+      <w:pPr>
+        <w:pBdr>
+          <w:top w:val="nil"/>
+          <w:left w:val="nil"/>
+          <w:bottom w:val="nil"/>
+          <w:right w:val="nil"/>
+          <w:between w:val="nil"/>
+        </w:pBdr>
+        <w:spacing w:before="120"/>
+        <w:rPr>
+          <w:rFonts w:ascii="Arial" w:eastAsia="Calibri" w:hAnsi="Arial" w:cs="Arial"/>
+          <w:b/>
+          <w:color w:val="000000"/>
+          <w:sz w:val="20"/>
+          <w:szCs w:val="20"/>
+        </w:rPr>
+      </w:pPr>
+      <w:r>
+        <w:rPr>
+          <w:rFonts w:ascii="Arial" w:eastAsia="Calibri" w:hAnsi="Arial" w:cs="Arial"/>
+          <w:b/>
+          <w:color w:val="000000"/>
+          <w:sz w:val="20"/>
+          <w:szCs w:val="20"/>
+        </w:rPr>
+        <w:t>Dung Beetle Biorobot (</w:t>
+      </w:r>
+      <w:proofErr w:type="gramStart"/>
+      <w:r>
+        <w:rPr>
+          <w:rFonts w:ascii="Arial" w:eastAsia="Calibri" w:hAnsi="Arial" w:cs="Arial"/>
+          <w:b/>
+          <w:color w:val="000000"/>
+          <w:sz w:val="20"/>
+          <w:szCs w:val="20"/>
+        </w:rPr>
+        <w:t>Master's</w:t>
+      </w:r>
+      <w:proofErr w:type="gramEnd"/>
+      <w:r>
+        <w:rPr>
+          <w:rFonts w:ascii="Arial" w:eastAsia="Calibri" w:hAnsi="Arial" w:cs="Arial"/>
+          <w:b/>
+          <w:color w:val="000000"/>
+          <w:sz w:val="20"/>
+          <w:szCs w:val="20"/>
+        </w:rPr>
+        <w:t xml:space="preserve"> Dissertation</w:t>
+      </w:r>
+      <w:r>
+        <w:rPr>
+          <w:rFonts w:ascii="Arial" w:eastAsia="Calibri" w:hAnsi="Arial" w:cs="Arial"/>
+          <w:b/>
+          <w:color w:val="000000"/>
+          <w:sz w:val="20"/>
+          <w:szCs w:val="20"/>
+        </w:rPr>
+        <w:t xml:space="preserve"> Project</w:t>
+      </w:r>
+      <w:r>
+        <w:rPr>
+          <w:rFonts w:ascii="Arial" w:eastAsia="Calibri" w:hAnsi="Arial" w:cs="Arial"/>
+          <w:b/>
+          <w:color w:val="000000"/>
+          <w:sz w:val="20"/>
+          <w:szCs w:val="20"/>
+        </w:rPr>
+        <w:t>, 82%) / University of Edinburgh</w:t>
       </w:r>
     </w:p>
     <w:p>
@@ -1886,7 +2476,7 @@
           <w:sz w:val="20"/>
           <w:szCs w:val="20"/>
         </w:rPr>
-        <w:t xml:space="preserve">Secured exclusive research grant </w:t>
+        <w:t>Pioneered creation of dung beetle biorobot</w:t>
       </w:r>
       <w:r>
         <w:rPr>
@@ -1896,7 +2486,7 @@
           <w:sz w:val="20"/>
           <w:szCs w:val="20"/>
         </w:rPr>
-        <w:t xml:space="preserve">to travel to </w:t>
+        <w:t>; adapt</w:t>
       </w:r>
       <w:r>
         <w:rPr>
@@ -1906,7 +2496,7 @@
           <w:sz w:val="20"/>
           <w:szCs w:val="20"/>
         </w:rPr>
-        <w:t xml:space="preserve">South Africa to </w:t>
+        <w:t>ed</w:t>
       </w:r>
       <w:r>
         <w:rPr>
@@ -1916,7 +2506,37 @@
           <w:sz w:val="20"/>
           <w:szCs w:val="20"/>
         </w:rPr>
-        <w:t>test the robot alongside real dung beetles.</w:t>
+        <w:t xml:space="preserve"> sophisticated </w:t>
+      </w:r>
+      <w:r>
+        <w:rPr>
+          <w:rFonts w:ascii="Arial" w:eastAsia="Calibri" w:hAnsi="Arial" w:cs="Arial"/>
+          <w:bCs/>
+          <w:color w:val="000000"/>
+          <w:sz w:val="20"/>
+          <w:szCs w:val="20"/>
+        </w:rPr>
+        <w:t>neural model</w:t>
+      </w:r>
+      <w:r>
+        <w:rPr>
+          <w:rFonts w:ascii="Arial" w:eastAsia="Calibri" w:hAnsi="Arial" w:cs="Arial"/>
+          <w:bCs/>
+          <w:color w:val="000000"/>
+          <w:sz w:val="20"/>
+          <w:szCs w:val="20"/>
+        </w:rPr>
+        <w:t xml:space="preserve"> into the robot's programming</w:t>
+      </w:r>
+      <w:r>
+        <w:rPr>
+          <w:rFonts w:ascii="Arial" w:eastAsia="Calibri" w:hAnsi="Arial" w:cs="Arial"/>
+          <w:bCs/>
+          <w:color w:val="000000"/>
+          <w:sz w:val="20"/>
+          <w:szCs w:val="20"/>
+        </w:rPr>
+        <w:t>.</w:t>
       </w:r>
     </w:p>
     <w:p>
@@ -1924,7 +2544,7 @@
         <w:pStyle w:val="ListParagraph"/>
         <w:numPr>
           <w:ilvl w:val="0"/>
-          <w:numId w:val="3"/>
+          <w:numId w:val="6"/>
         </w:numPr>
         <w:pBdr>
           <w:top w:val="nil"/>
@@ -1944,551 +2564,42 @@
       <w:r>
         <w:rPr>
           <w:rFonts w:ascii="Arial" w:eastAsia="Calibri" w:hAnsi="Arial" w:cs="Arial"/>
-          <w:color w:val="000000"/>
-          <w:sz w:val="20"/>
-          <w:szCs w:val="20"/>
-        </w:rPr>
-        <w:t xml:space="preserve">Awarded </w:t>
-      </w:r>
-      <w:r>
-        <w:rPr>
-          <w:rFonts w:ascii="Arial" w:eastAsia="Calibri" w:hAnsi="Arial" w:cs="Arial"/>
-          <w:color w:val="000000"/>
-          <w:sz w:val="20"/>
-          <w:szCs w:val="20"/>
-        </w:rPr>
-        <w:t>British Computer Society</w:t>
-      </w:r>
-      <w:r>
-        <w:rPr>
-          <w:rFonts w:ascii="Arial" w:eastAsia="Calibri" w:hAnsi="Arial" w:cs="Arial"/>
-          <w:color w:val="000000"/>
-          <w:sz w:val="20"/>
-          <w:szCs w:val="20"/>
-        </w:rPr>
-        <w:t xml:space="preserve"> (BCS)</w:t>
-      </w:r>
-      <w:r>
-        <w:rPr>
-          <w:rFonts w:ascii="Arial" w:eastAsia="Calibri" w:hAnsi="Arial" w:cs="Arial"/>
-          <w:color w:val="000000"/>
-          <w:sz w:val="20"/>
-          <w:szCs w:val="20"/>
-        </w:rPr>
-        <w:t xml:space="preserve"> Prize for </w:t>
-      </w:r>
-      <w:r>
-        <w:rPr>
-          <w:rFonts w:ascii="Arial" w:eastAsia="Calibri" w:hAnsi="Arial" w:cs="Arial"/>
-          <w:color w:val="000000"/>
-          <w:sz w:val="20"/>
-          <w:szCs w:val="20"/>
-        </w:rPr>
-        <w:t xml:space="preserve">Top Performance in </w:t>
-      </w:r>
-      <w:r>
-        <w:rPr>
-          <w:rFonts w:ascii="Arial" w:eastAsia="Calibri" w:hAnsi="Arial" w:cs="Arial"/>
-          <w:color w:val="000000"/>
-          <w:sz w:val="20"/>
-          <w:szCs w:val="20"/>
-        </w:rPr>
-        <w:t>Professional Issues</w:t>
-      </w:r>
-      <w:r>
-        <w:rPr>
-          <w:rFonts w:ascii="Arial" w:eastAsia="Calibri" w:hAnsi="Arial" w:cs="Arial"/>
-          <w:color w:val="000000"/>
-          <w:sz w:val="20"/>
-          <w:szCs w:val="20"/>
-        </w:rPr>
-        <w:t xml:space="preserve"> (99%).</w:t>
-      </w:r>
-    </w:p>
-    <w:p>
-      <w:pPr>
-        <w:pBdr>
-          <w:top w:val="nil"/>
-          <w:left w:val="nil"/>
-          <w:bottom w:val="single" w:sz="4" w:space="1" w:color="000000"/>
-          <w:right w:val="nil"/>
-          <w:between w:val="nil"/>
-        </w:pBdr>
-        <w:rPr>
-          <w:rFonts w:ascii="Arial" w:eastAsia="Calibri" w:hAnsi="Arial" w:cs="Arial"/>
-          <w:b/>
-          <w:smallCaps/>
-          <w:color w:val="000000"/>
-          <w:sz w:val="20"/>
-          <w:szCs w:val="20"/>
-        </w:rPr>
-      </w:pPr>
-    </w:p>
-    <w:p>
-      <w:pPr>
-        <w:pBdr>
-          <w:top w:val="nil"/>
-          <w:left w:val="nil"/>
-          <w:bottom w:val="nil"/>
-          <w:right w:val="nil"/>
-          <w:between w:val="nil"/>
-        </w:pBdr>
-        <w:spacing w:before="120"/>
-        <w:rPr>
-          <w:rFonts w:ascii="Arial" w:eastAsia="Calibri" w:hAnsi="Arial" w:cs="Arial"/>
-          <w:b/>
-          <w:color w:val="000000"/>
-          <w:sz w:val="22"/>
-          <w:szCs w:val="22"/>
-        </w:rPr>
-      </w:pPr>
-      <w:r>
-        <w:rPr>
-          <w:rFonts w:ascii="Arial" w:eastAsia="Calibri" w:hAnsi="Arial" w:cs="Arial"/>
-          <w:b/>
-          <w:color w:val="000000"/>
-          <w:sz w:val="22"/>
-          <w:szCs w:val="22"/>
-        </w:rPr>
-        <w:t>PROJECTS</w:t>
-      </w:r>
-    </w:p>
-    <w:p>
-      <w:pPr>
-        <w:pBdr>
-          <w:top w:val="nil"/>
-          <w:left w:val="nil"/>
-          <w:bottom w:val="nil"/>
-          <w:right w:val="nil"/>
-          <w:between w:val="nil"/>
-        </w:pBdr>
-        <w:spacing w:before="120"/>
-        <w:rPr>
-          <w:rFonts w:ascii="Arial" w:eastAsia="Calibri" w:hAnsi="Arial" w:cs="Arial"/>
-          <w:b/>
-          <w:color w:val="000000"/>
-          <w:sz w:val="20"/>
-          <w:szCs w:val="20"/>
-        </w:rPr>
-      </w:pPr>
-      <w:r>
-        <w:rPr>
-          <w:rFonts w:ascii="Arial" w:eastAsia="Calibri" w:hAnsi="Arial" w:cs="Arial"/>
-          <w:b/>
-          <w:color w:val="000000"/>
-          <w:sz w:val="20"/>
-          <w:szCs w:val="20"/>
-        </w:rPr>
-        <w:t>P</w:t>
-      </w:r>
-      <w:r>
-        <w:rPr>
-          <w:rFonts w:ascii="Arial" w:eastAsia="Calibri" w:hAnsi="Arial" w:cs="Arial"/>
-          <w:b/>
-          <w:color w:val="000000"/>
-          <w:sz w:val="20"/>
-          <w:szCs w:val="20"/>
-        </w:rPr>
-        <w:t>ersonal website</w:t>
-      </w:r>
-      <w:r>
-        <w:rPr>
-          <w:rFonts w:ascii="Arial" w:eastAsia="Calibri" w:hAnsi="Arial" w:cs="Arial"/>
-          <w:b/>
-          <w:color w:val="000000"/>
-          <w:sz w:val="20"/>
-          <w:szCs w:val="20"/>
-        </w:rPr>
-        <w:t xml:space="preserve"> / </w:t>
-      </w:r>
-      <w:hyperlink r:id="rId12" w:history="1">
-        <w:r>
-          <w:rPr>
-            <w:rStyle w:val="Hyperlink"/>
-            <w:rFonts w:ascii="Arial" w:eastAsia="Calibri" w:hAnsi="Arial" w:cs="Arial"/>
-            <w:b/>
-            <w:sz w:val="20"/>
-            <w:szCs w:val="20"/>
-          </w:rPr>
-          <w:t>https://rmsy.me</w:t>
-        </w:r>
-      </w:hyperlink>
-      <w:r>
-        <w:rPr>
-          <w:rFonts w:ascii="Arial" w:eastAsia="Calibri" w:hAnsi="Arial" w:cs="Arial"/>
-          <w:b/>
-          <w:color w:val="000000"/>
-          <w:sz w:val="20"/>
-          <w:szCs w:val="20"/>
-        </w:rPr>
-        <w:t xml:space="preserve"> /</w:t>
-      </w:r>
-      <w:r>
-        <w:rPr>
-          <w:rFonts w:ascii="Arial" w:eastAsia="Calibri" w:hAnsi="Arial" w:cs="Arial"/>
-          <w:b/>
-          <w:color w:val="000000"/>
-          <w:sz w:val="20"/>
-          <w:szCs w:val="20"/>
-        </w:rPr>
-        <w:t xml:space="preserve"> </w:t>
-      </w:r>
-      <w:hyperlink r:id="rId13" w:history="1">
-        <w:r>
-          <w:rPr>
-            <w:rStyle w:val="Hyperlink"/>
-            <w:rFonts w:ascii="Arial" w:eastAsia="Calibri" w:hAnsi="Arial" w:cs="Arial"/>
-            <w:b/>
-            <w:sz w:val="20"/>
-            <w:szCs w:val="20"/>
-          </w:rPr>
-          <w:t>https://github.com/relnaggar/rmsy.me</w:t>
-        </w:r>
-      </w:hyperlink>
-    </w:p>
-    <w:p>
-      <w:pPr>
-        <w:pStyle w:val="ListParagraph"/>
-        <w:numPr>
-          <w:ilvl w:val="0"/>
-          <w:numId w:val="2"/>
-        </w:numPr>
-        <w:pBdr>
-          <w:top w:val="nil"/>
-          <w:left w:val="nil"/>
-          <w:bottom w:val="nil"/>
-          <w:right w:val="nil"/>
-          <w:between w:val="nil"/>
-        </w:pBdr>
-        <w:rPr>
-          <w:rFonts w:ascii="Arial" w:eastAsia="Calibri" w:hAnsi="Arial" w:cs="Arial"/>
-          <w:color w:val="000000"/>
-          <w:sz w:val="20"/>
-          <w:szCs w:val="20"/>
-        </w:rPr>
-      </w:pPr>
-      <w:r>
-        <w:rPr>
-          <w:rFonts w:ascii="Arial" w:eastAsia="Calibri" w:hAnsi="Arial" w:cs="Arial"/>
-          <w:color w:val="000000"/>
-          <w:sz w:val="20"/>
-          <w:szCs w:val="20"/>
-        </w:rPr>
-        <w:t>D</w:t>
-      </w:r>
-      <w:r>
-        <w:rPr>
-          <w:rFonts w:ascii="Arial" w:eastAsia="Calibri" w:hAnsi="Arial" w:cs="Arial"/>
-          <w:color w:val="000000"/>
-          <w:sz w:val="20"/>
-          <w:szCs w:val="20"/>
-        </w:rPr>
-        <w:t xml:space="preserve">esigned </w:t>
-      </w:r>
-      <w:r>
-        <w:rPr>
-          <w:rFonts w:ascii="Arial" w:eastAsia="Calibri" w:hAnsi="Arial" w:cs="Arial"/>
-          <w:color w:val="000000"/>
-          <w:sz w:val="20"/>
-          <w:szCs w:val="20"/>
-        </w:rPr>
-        <w:t xml:space="preserve">responsive </w:t>
-      </w:r>
-      <w:r>
-        <w:rPr>
-          <w:rFonts w:ascii="Arial" w:eastAsia="Calibri" w:hAnsi="Arial" w:cs="Arial"/>
-          <w:color w:val="000000"/>
-          <w:sz w:val="20"/>
-          <w:szCs w:val="20"/>
-        </w:rPr>
-        <w:t xml:space="preserve">front-end </w:t>
-      </w:r>
-      <w:r>
-        <w:rPr>
-          <w:rFonts w:ascii="Arial" w:eastAsia="Calibri" w:hAnsi="Arial" w:cs="Arial"/>
-          <w:color w:val="000000"/>
-          <w:sz w:val="20"/>
-          <w:szCs w:val="20"/>
-        </w:rPr>
-        <w:t>HTML/CSS templates</w:t>
-      </w:r>
-      <w:r>
-        <w:rPr>
-          <w:rFonts w:ascii="Arial" w:eastAsia="Calibri" w:hAnsi="Arial" w:cs="Arial"/>
-          <w:color w:val="000000"/>
-          <w:sz w:val="20"/>
-          <w:szCs w:val="20"/>
-        </w:rPr>
-        <w:t xml:space="preserve"> with Bootstrap.</w:t>
-      </w:r>
-    </w:p>
-    <w:p>
-      <w:pPr>
-        <w:pStyle w:val="ListParagraph"/>
-        <w:numPr>
-          <w:ilvl w:val="0"/>
-          <w:numId w:val="2"/>
-        </w:numPr>
-        <w:pBdr>
-          <w:top w:val="nil"/>
-          <w:left w:val="nil"/>
-          <w:bottom w:val="nil"/>
-          <w:right w:val="nil"/>
-          <w:between w:val="nil"/>
-        </w:pBdr>
-        <w:rPr>
-          <w:rFonts w:ascii="Arial" w:eastAsia="Calibri" w:hAnsi="Arial" w:cs="Arial"/>
-          <w:color w:val="000000"/>
-          <w:sz w:val="20"/>
-          <w:szCs w:val="20"/>
-        </w:rPr>
-      </w:pPr>
-      <w:r>
-        <w:rPr>
-          <w:rFonts w:ascii="Arial" w:eastAsia="Calibri" w:hAnsi="Arial" w:cs="Arial"/>
-          <w:color w:val="000000"/>
-          <w:sz w:val="20"/>
-          <w:szCs w:val="20"/>
-        </w:rPr>
-        <w:t>B</w:t>
-      </w:r>
-      <w:r>
-        <w:rPr>
-          <w:rFonts w:ascii="Arial" w:eastAsia="Calibri" w:hAnsi="Arial" w:cs="Arial"/>
-          <w:color w:val="000000"/>
-          <w:sz w:val="20"/>
-          <w:szCs w:val="20"/>
-        </w:rPr>
-        <w:t xml:space="preserve">uilt reusable </w:t>
-      </w:r>
-      <w:r>
-        <w:rPr>
-          <w:rFonts w:ascii="Arial" w:eastAsia="Calibri" w:hAnsi="Arial" w:cs="Arial"/>
-          <w:color w:val="000000"/>
-          <w:sz w:val="20"/>
-          <w:szCs w:val="20"/>
-        </w:rPr>
-        <w:t xml:space="preserve">back-end </w:t>
-      </w:r>
-      <w:r>
-        <w:rPr>
-          <w:rFonts w:ascii="Arial" w:eastAsia="Calibri" w:hAnsi="Arial" w:cs="Arial"/>
-          <w:color w:val="000000"/>
-          <w:sz w:val="20"/>
-          <w:szCs w:val="20"/>
-        </w:rPr>
-        <w:t>PHP framework</w:t>
-      </w:r>
-      <w:r>
-        <w:rPr>
-          <w:rFonts w:ascii="Arial" w:eastAsia="Calibri" w:hAnsi="Arial" w:cs="Arial"/>
-          <w:color w:val="000000"/>
-          <w:sz w:val="20"/>
-          <w:szCs w:val="20"/>
-        </w:rPr>
-        <w:t xml:space="preserve"> from scratch</w:t>
-      </w:r>
-      <w:r>
-        <w:rPr>
-          <w:rFonts w:ascii="Arial" w:eastAsia="Calibri" w:hAnsi="Arial" w:cs="Arial"/>
-          <w:color w:val="000000"/>
-          <w:sz w:val="20"/>
-          <w:szCs w:val="20"/>
-        </w:rPr>
-        <w:t>.</w:t>
-      </w:r>
-    </w:p>
-    <w:p>
-      <w:pPr>
-        <w:pStyle w:val="ListParagraph"/>
-        <w:numPr>
-          <w:ilvl w:val="0"/>
-          <w:numId w:val="2"/>
-        </w:numPr>
-        <w:pBdr>
-          <w:top w:val="nil"/>
-          <w:left w:val="nil"/>
-          <w:bottom w:val="nil"/>
-          <w:right w:val="nil"/>
-          <w:between w:val="nil"/>
-        </w:pBdr>
-        <w:rPr>
-          <w:rFonts w:ascii="Arial" w:eastAsia="Calibri" w:hAnsi="Arial" w:cs="Arial"/>
-          <w:color w:val="000000"/>
-          <w:sz w:val="20"/>
-          <w:szCs w:val="20"/>
-        </w:rPr>
-      </w:pPr>
-      <w:r>
-        <w:rPr>
-          <w:rFonts w:ascii="Arial" w:eastAsia="Calibri" w:hAnsi="Arial" w:cs="Arial"/>
-          <w:color w:val="000000"/>
-          <w:sz w:val="20"/>
-          <w:szCs w:val="20"/>
-        </w:rPr>
-        <w:t>C</w:t>
-      </w:r>
-      <w:r>
-        <w:rPr>
-          <w:rFonts w:ascii="Arial" w:eastAsia="Calibri" w:hAnsi="Arial" w:cs="Arial"/>
-          <w:color w:val="000000"/>
-          <w:sz w:val="20"/>
-          <w:szCs w:val="20"/>
-        </w:rPr>
-        <w:t>ontaineri</w:t>
-      </w:r>
-      <w:r>
-        <w:rPr>
-          <w:rFonts w:ascii="Arial" w:eastAsia="Calibri" w:hAnsi="Arial" w:cs="Arial"/>
-          <w:color w:val="000000"/>
-          <w:sz w:val="20"/>
-          <w:szCs w:val="20"/>
-        </w:rPr>
-        <w:t>s</w:t>
-      </w:r>
-      <w:r>
-        <w:rPr>
-          <w:rFonts w:ascii="Arial" w:eastAsia="Calibri" w:hAnsi="Arial" w:cs="Arial"/>
-          <w:color w:val="000000"/>
-          <w:sz w:val="20"/>
-          <w:szCs w:val="20"/>
-        </w:rPr>
-        <w:t>ed</w:t>
-      </w:r>
-      <w:r>
-        <w:rPr>
-          <w:rFonts w:ascii="Arial" w:eastAsia="Calibri" w:hAnsi="Arial" w:cs="Arial"/>
-          <w:color w:val="000000"/>
-          <w:sz w:val="20"/>
-          <w:szCs w:val="20"/>
-        </w:rPr>
-        <w:t xml:space="preserve"> application </w:t>
-      </w:r>
-      <w:r>
-        <w:rPr>
-          <w:rFonts w:ascii="Arial" w:eastAsia="Calibri" w:hAnsi="Arial" w:cs="Arial"/>
-          <w:color w:val="000000"/>
-          <w:sz w:val="20"/>
-          <w:szCs w:val="20"/>
-        </w:rPr>
-        <w:t xml:space="preserve">using Docker, built </w:t>
-      </w:r>
-      <w:r>
-        <w:rPr>
-          <w:rFonts w:ascii="Arial" w:eastAsia="Calibri" w:hAnsi="Arial" w:cs="Arial"/>
-          <w:color w:val="000000"/>
-          <w:sz w:val="20"/>
-          <w:szCs w:val="20"/>
-        </w:rPr>
-        <w:t>a</w:t>
-      </w:r>
-      <w:r>
-        <w:rPr>
-          <w:rFonts w:ascii="Arial" w:eastAsia="Calibri" w:hAnsi="Arial" w:cs="Arial"/>
-          <w:color w:val="000000"/>
-          <w:sz w:val="20"/>
-          <w:szCs w:val="20"/>
-        </w:rPr>
-        <w:t xml:space="preserve">utomated </w:t>
-      </w:r>
-      <w:r>
-        <w:rPr>
-          <w:rFonts w:ascii="Arial" w:eastAsia="Calibri" w:hAnsi="Arial" w:cs="Arial"/>
-          <w:color w:val="000000"/>
-          <w:sz w:val="20"/>
-          <w:szCs w:val="20"/>
-        </w:rPr>
-        <w:t xml:space="preserve">DevOps </w:t>
-      </w:r>
-      <w:r>
-        <w:rPr>
-          <w:rFonts w:ascii="Arial" w:eastAsia="Calibri" w:hAnsi="Arial" w:cs="Arial"/>
-          <w:color w:val="000000"/>
-          <w:sz w:val="20"/>
-          <w:szCs w:val="20"/>
-        </w:rPr>
-        <w:t xml:space="preserve">pipeline </w:t>
-      </w:r>
-      <w:r>
-        <w:rPr>
-          <w:rFonts w:ascii="Arial" w:eastAsia="Calibri" w:hAnsi="Arial" w:cs="Arial"/>
-          <w:color w:val="000000"/>
-          <w:sz w:val="20"/>
-          <w:szCs w:val="20"/>
-        </w:rPr>
-        <w:t>using</w:t>
-      </w:r>
-      <w:r>
-        <w:rPr>
-          <w:rFonts w:ascii="Arial" w:eastAsia="Calibri" w:hAnsi="Arial" w:cs="Arial"/>
-          <w:color w:val="000000"/>
-          <w:sz w:val="20"/>
-          <w:szCs w:val="20"/>
-        </w:rPr>
-        <w:t xml:space="preserve"> Bash scripts</w:t>
-      </w:r>
-      <w:r>
-        <w:rPr>
-          <w:rFonts w:ascii="Arial" w:eastAsia="Calibri" w:hAnsi="Arial" w:cs="Arial"/>
-          <w:color w:val="000000"/>
-          <w:sz w:val="20"/>
-          <w:szCs w:val="20"/>
-        </w:rPr>
-        <w:t xml:space="preserve"> and Git hooks;</w:t>
-      </w:r>
-      <w:r>
-        <w:rPr>
-          <w:rFonts w:ascii="Arial" w:eastAsia="Calibri" w:hAnsi="Arial" w:cs="Arial"/>
-          <w:color w:val="000000"/>
-          <w:sz w:val="20"/>
-          <w:szCs w:val="20"/>
-        </w:rPr>
-        <w:t xml:space="preserve"> </w:t>
-      </w:r>
-      <w:r>
-        <w:rPr>
-          <w:rFonts w:ascii="Arial" w:eastAsia="Calibri" w:hAnsi="Arial" w:cs="Arial"/>
-          <w:color w:val="000000"/>
-          <w:sz w:val="20"/>
-          <w:szCs w:val="20"/>
-        </w:rPr>
-        <w:t>c</w:t>
-      </w:r>
-      <w:r>
-        <w:rPr>
-          <w:rFonts w:ascii="Arial" w:eastAsia="Calibri" w:hAnsi="Arial" w:cs="Arial"/>
-          <w:color w:val="000000"/>
-          <w:sz w:val="20"/>
-          <w:szCs w:val="20"/>
-        </w:rPr>
-        <w:t xml:space="preserve">onfigured AWS EC2 instance and Apache </w:t>
-      </w:r>
-      <w:r>
-        <w:rPr>
-          <w:rFonts w:ascii="Arial" w:eastAsia="Calibri" w:hAnsi="Arial" w:cs="Arial"/>
-          <w:color w:val="000000"/>
-          <w:sz w:val="20"/>
-          <w:szCs w:val="20"/>
-        </w:rPr>
-        <w:t xml:space="preserve">HTTP </w:t>
-      </w:r>
-      <w:r>
-        <w:rPr>
-          <w:rFonts w:ascii="Arial" w:eastAsia="Calibri" w:hAnsi="Arial" w:cs="Arial"/>
-          <w:color w:val="000000"/>
-          <w:sz w:val="20"/>
-          <w:szCs w:val="20"/>
-        </w:rPr>
-        <w:t>Server manually</w:t>
-      </w:r>
-      <w:r>
-        <w:rPr>
-          <w:rFonts w:ascii="Arial" w:eastAsia="Calibri" w:hAnsi="Arial" w:cs="Arial"/>
-          <w:color w:val="000000"/>
-          <w:sz w:val="20"/>
-          <w:szCs w:val="20"/>
-        </w:rPr>
-        <w:t>.</w:t>
+          <w:bCs/>
+          <w:color w:val="000000"/>
+          <w:sz w:val="20"/>
+          <w:szCs w:val="20"/>
+        </w:rPr>
+        <w:t xml:space="preserve">Secured exclusive research grant </w:t>
+      </w:r>
+      <w:r>
+        <w:rPr>
+          <w:rFonts w:ascii="Arial" w:eastAsia="Calibri" w:hAnsi="Arial" w:cs="Arial"/>
+          <w:bCs/>
+          <w:color w:val="000000"/>
+          <w:sz w:val="20"/>
+          <w:szCs w:val="20"/>
+        </w:rPr>
+        <w:t xml:space="preserve">to travel to </w:t>
+      </w:r>
+      <w:r>
+        <w:rPr>
+          <w:rFonts w:ascii="Arial" w:eastAsia="Calibri" w:hAnsi="Arial" w:cs="Arial"/>
+          <w:bCs/>
+          <w:color w:val="000000"/>
+          <w:sz w:val="20"/>
+          <w:szCs w:val="20"/>
+        </w:rPr>
+        <w:t xml:space="preserve">South Africa to </w:t>
+      </w:r>
+      <w:r>
+        <w:rPr>
+          <w:rFonts w:ascii="Arial" w:eastAsia="Calibri" w:hAnsi="Arial" w:cs="Arial"/>
+          <w:bCs/>
+          <w:color w:val="000000"/>
+          <w:sz w:val="20"/>
+          <w:szCs w:val="20"/>
+        </w:rPr>
+        <w:t>test the robot alongside real dung beetles.</w:t>
       </w:r>
     </w:p>
     <w:p>

</xml_diff>

<commit_message>
update resume: reorganise projects
</commit_message>
<xml_diff>
--- a/apache2/www/public/engineer/engineer-resume.docx
+++ b/apache2/www/public/engineer/engineer-resume.docx
@@ -207,6 +207,15 @@
           <w:t>https://rmsy.me</w:t>
         </w:r>
       </w:hyperlink>
+      <w:r>
+        <w:rPr>
+          <w:rStyle w:val="Hyperlink"/>
+          <w:rFonts w:ascii="Arial" w:eastAsia="Calibri" w:hAnsi="Arial" w:cs="Arial"/>
+          <w:sz w:val="20"/>
+          <w:szCs w:val="20"/>
+        </w:rPr>
+        <w:t>/</w:t>
+      </w:r>
     </w:p>
     <w:p>
       <w:pPr>
@@ -1571,1798 +1580,6 @@
           <w:szCs w:val="20"/>
         </w:rPr>
         <w:t>courses.</w:t>
-      </w:r>
-    </w:p>
-    <w:p>
-      <w:pPr>
-        <w:pBdr>
-          <w:top w:val="nil"/>
-          <w:left w:val="nil"/>
-          <w:bottom w:val="single" w:sz="4" w:space="1" w:color="000000"/>
-          <w:right w:val="nil"/>
-          <w:between w:val="nil"/>
-        </w:pBdr>
-        <w:rPr>
-          <w:rFonts w:ascii="Arial" w:eastAsia="Calibri" w:hAnsi="Arial" w:cs="Arial"/>
-          <w:b/>
-          <w:smallCaps/>
-          <w:color w:val="000000"/>
-          <w:sz w:val="20"/>
-          <w:szCs w:val="20"/>
-        </w:rPr>
-      </w:pPr>
-    </w:p>
-    <w:p>
-      <w:pPr>
-        <w:pBdr>
-          <w:top w:val="nil"/>
-          <w:left w:val="nil"/>
-          <w:bottom w:val="nil"/>
-          <w:right w:val="nil"/>
-          <w:between w:val="nil"/>
-        </w:pBdr>
-        <w:spacing w:before="120"/>
-        <w:rPr>
-          <w:rFonts w:ascii="Arial" w:eastAsia="Calibri" w:hAnsi="Arial" w:cs="Arial"/>
-          <w:b/>
-          <w:color w:val="000000"/>
-          <w:sz w:val="22"/>
-          <w:szCs w:val="22"/>
-        </w:rPr>
-      </w:pPr>
-      <w:r>
-        <w:rPr>
-          <w:rFonts w:ascii="Arial" w:eastAsia="Calibri" w:hAnsi="Arial" w:cs="Arial"/>
-          <w:b/>
-          <w:color w:val="000000"/>
-          <w:sz w:val="22"/>
-          <w:szCs w:val="22"/>
-        </w:rPr>
-        <w:t>EDUCATION</w:t>
-      </w:r>
-    </w:p>
-    <w:p>
-      <w:pPr>
-        <w:pBdr>
-          <w:top w:val="nil"/>
-          <w:left w:val="nil"/>
-          <w:bottom w:val="nil"/>
-          <w:right w:val="nil"/>
-          <w:between w:val="nil"/>
-        </w:pBdr>
-        <w:tabs>
-          <w:tab w:val="right" w:pos="11340"/>
-        </w:tabs>
-        <w:spacing w:before="120"/>
-        <w:rPr>
-          <w:rFonts w:ascii="Arial" w:eastAsia="Calibri" w:hAnsi="Arial" w:cs="Arial"/>
-          <w:b/>
-          <w:color w:val="000000"/>
-          <w:sz w:val="20"/>
-          <w:szCs w:val="20"/>
-        </w:rPr>
-      </w:pPr>
-      <w:r>
-        <w:rPr>
-          <w:rFonts w:ascii="Arial" w:eastAsia="Calibri" w:hAnsi="Arial" w:cs="Arial"/>
-          <w:b/>
-          <w:color w:val="000000"/>
-          <w:sz w:val="20"/>
-          <w:szCs w:val="20"/>
-        </w:rPr>
-        <w:t>Master of Informatics</w:t>
-      </w:r>
-      <w:r>
-        <w:rPr>
-          <w:rFonts w:ascii="Arial" w:eastAsia="Calibri" w:hAnsi="Arial" w:cs="Arial"/>
-          <w:b/>
-          <w:color w:val="000000"/>
-          <w:sz w:val="20"/>
-          <w:szCs w:val="20"/>
-        </w:rPr>
-        <w:t xml:space="preserve"> (MInf, CEng, CITP, CSci) /</w:t>
-      </w:r>
-      <w:r>
-        <w:rPr>
-          <w:rFonts w:ascii="Arial" w:eastAsia="Calibri" w:hAnsi="Arial" w:cs="Arial"/>
-          <w:b/>
-          <w:color w:val="000000"/>
-          <w:sz w:val="20"/>
-          <w:szCs w:val="20"/>
-        </w:rPr>
-        <w:t xml:space="preserve"> </w:t>
-      </w:r>
-      <w:r>
-        <w:rPr>
-          <w:rFonts w:ascii="Arial" w:eastAsia="Calibri" w:hAnsi="Arial" w:cs="Arial"/>
-          <w:b/>
-          <w:color w:val="000000"/>
-          <w:sz w:val="20"/>
-          <w:szCs w:val="20"/>
-        </w:rPr>
-        <w:t>University of Edinburg</w:t>
-      </w:r>
-      <w:r>
-        <w:rPr>
-          <w:rFonts w:ascii="Arial" w:eastAsia="Calibri" w:hAnsi="Arial" w:cs="Arial"/>
-          <w:b/>
-          <w:color w:val="000000"/>
-          <w:sz w:val="20"/>
-          <w:szCs w:val="20"/>
-        </w:rPr>
-        <w:t>h</w:t>
-      </w:r>
-      <w:r>
-        <w:rPr>
-          <w:rFonts w:ascii="Arial" w:eastAsia="Calibri" w:hAnsi="Arial" w:cs="Arial"/>
-          <w:bCs/>
-          <w:color w:val="000000"/>
-          <w:sz w:val="20"/>
-          <w:szCs w:val="20"/>
-        </w:rPr>
-        <w:tab/>
-      </w:r>
-      <w:r>
-        <w:rPr>
-          <w:rFonts w:ascii="Arial" w:eastAsia="Calibri" w:hAnsi="Arial" w:cs="Arial"/>
-          <w:bCs/>
-          <w:color w:val="000000"/>
-          <w:sz w:val="20"/>
-          <w:szCs w:val="20"/>
-        </w:rPr>
-        <w:t>20</w:t>
-      </w:r>
-      <w:r>
-        <w:rPr>
-          <w:rFonts w:ascii="Arial" w:eastAsia="Calibri" w:hAnsi="Arial" w:cs="Arial"/>
-          <w:bCs/>
-          <w:color w:val="000000"/>
-          <w:sz w:val="20"/>
-          <w:szCs w:val="20"/>
-        </w:rPr>
-        <w:t>13-2018</w:t>
-      </w:r>
-    </w:p>
-    <w:p>
-      <w:pPr>
-        <w:pStyle w:val="ListParagraph"/>
-        <w:numPr>
-          <w:ilvl w:val="0"/>
-          <w:numId w:val="6"/>
-        </w:numPr>
-        <w:pBdr>
-          <w:top w:val="nil"/>
-          <w:left w:val="nil"/>
-          <w:bottom w:val="nil"/>
-          <w:right w:val="nil"/>
-          <w:between w:val="nil"/>
-        </w:pBdr>
-        <w:rPr>
-          <w:rFonts w:ascii="Arial" w:eastAsia="Calibri" w:hAnsi="Arial" w:cs="Arial"/>
-          <w:bCs/>
-          <w:color w:val="000000"/>
-          <w:sz w:val="20"/>
-          <w:szCs w:val="20"/>
-        </w:rPr>
-      </w:pPr>
-      <w:r>
-        <w:rPr>
-          <w:rFonts w:ascii="Arial" w:eastAsia="Calibri" w:hAnsi="Arial" w:cs="Arial"/>
-          <w:bCs/>
-          <w:color w:val="000000"/>
-          <w:sz w:val="20"/>
-          <w:szCs w:val="20"/>
-        </w:rPr>
-        <w:t xml:space="preserve">Graduated with </w:t>
-      </w:r>
-      <w:r>
-        <w:rPr>
-          <w:rFonts w:ascii="Arial" w:eastAsia="Calibri" w:hAnsi="Arial" w:cs="Arial"/>
-          <w:bCs/>
-          <w:color w:val="000000"/>
-          <w:sz w:val="20"/>
-          <w:szCs w:val="20"/>
-        </w:rPr>
-        <w:t>First Class Honours</w:t>
-      </w:r>
-      <w:r>
-        <w:rPr>
-          <w:rFonts w:ascii="Arial" w:eastAsia="Calibri" w:hAnsi="Arial" w:cs="Arial"/>
-          <w:bCs/>
-          <w:color w:val="000000"/>
-          <w:sz w:val="20"/>
-          <w:szCs w:val="20"/>
-        </w:rPr>
-        <w:t xml:space="preserve">, achieving </w:t>
-      </w:r>
-      <w:r>
-        <w:rPr>
-          <w:rFonts w:ascii="Arial" w:eastAsia="Calibri" w:hAnsi="Arial" w:cs="Arial"/>
-          <w:color w:val="000000"/>
-          <w:sz w:val="20"/>
-          <w:szCs w:val="20"/>
-        </w:rPr>
-        <w:t xml:space="preserve">83%-99% in all </w:t>
-      </w:r>
-      <w:r>
-        <w:rPr>
-          <w:rFonts w:ascii="Arial" w:eastAsia="Calibri" w:hAnsi="Arial" w:cs="Arial"/>
-          <w:color w:val="000000"/>
-          <w:sz w:val="20"/>
-          <w:szCs w:val="20"/>
-        </w:rPr>
-        <w:t xml:space="preserve">8 </w:t>
-      </w:r>
-      <w:r>
-        <w:rPr>
-          <w:rFonts w:ascii="Arial" w:eastAsia="Calibri" w:hAnsi="Arial" w:cs="Arial"/>
-          <w:color w:val="000000"/>
-          <w:sz w:val="20"/>
-          <w:szCs w:val="20"/>
-        </w:rPr>
-        <w:t>software engineering courses.</w:t>
-      </w:r>
-    </w:p>
-    <w:p>
-      <w:pPr>
-        <w:pStyle w:val="ListParagraph"/>
-        <w:numPr>
-          <w:ilvl w:val="0"/>
-          <w:numId w:val="3"/>
-        </w:numPr>
-        <w:pBdr>
-          <w:top w:val="nil"/>
-          <w:left w:val="nil"/>
-          <w:bottom w:val="nil"/>
-          <w:right w:val="nil"/>
-          <w:between w:val="nil"/>
-        </w:pBdr>
-        <w:rPr>
-          <w:rFonts w:ascii="Arial" w:eastAsia="Calibri" w:hAnsi="Arial" w:cs="Arial"/>
-          <w:bCs/>
-          <w:color w:val="000000"/>
-          <w:sz w:val="20"/>
-          <w:szCs w:val="20"/>
-        </w:rPr>
-      </w:pPr>
-      <w:r>
-        <w:rPr>
-          <w:rFonts w:ascii="Arial" w:eastAsia="Calibri" w:hAnsi="Arial" w:cs="Arial"/>
-          <w:color w:val="000000"/>
-          <w:sz w:val="20"/>
-          <w:szCs w:val="20"/>
-        </w:rPr>
-        <w:t xml:space="preserve">Awarded </w:t>
-      </w:r>
-      <w:r>
-        <w:rPr>
-          <w:rFonts w:ascii="Arial" w:eastAsia="Calibri" w:hAnsi="Arial" w:cs="Arial"/>
-          <w:color w:val="000000"/>
-          <w:sz w:val="20"/>
-          <w:szCs w:val="20"/>
-        </w:rPr>
-        <w:t>British Computer Society</w:t>
-      </w:r>
-      <w:r>
-        <w:rPr>
-          <w:rFonts w:ascii="Arial" w:eastAsia="Calibri" w:hAnsi="Arial" w:cs="Arial"/>
-          <w:color w:val="000000"/>
-          <w:sz w:val="20"/>
-          <w:szCs w:val="20"/>
-        </w:rPr>
-        <w:t xml:space="preserve"> (BCS)</w:t>
-      </w:r>
-      <w:r>
-        <w:rPr>
-          <w:rFonts w:ascii="Arial" w:eastAsia="Calibri" w:hAnsi="Arial" w:cs="Arial"/>
-          <w:color w:val="000000"/>
-          <w:sz w:val="20"/>
-          <w:szCs w:val="20"/>
-        </w:rPr>
-        <w:t xml:space="preserve"> Prize for </w:t>
-      </w:r>
-      <w:r>
-        <w:rPr>
-          <w:rFonts w:ascii="Arial" w:eastAsia="Calibri" w:hAnsi="Arial" w:cs="Arial"/>
-          <w:color w:val="000000"/>
-          <w:sz w:val="20"/>
-          <w:szCs w:val="20"/>
-        </w:rPr>
-        <w:t xml:space="preserve">Top Performance in </w:t>
-      </w:r>
-      <w:r>
-        <w:rPr>
-          <w:rFonts w:ascii="Arial" w:eastAsia="Calibri" w:hAnsi="Arial" w:cs="Arial"/>
-          <w:color w:val="000000"/>
-          <w:sz w:val="20"/>
-          <w:szCs w:val="20"/>
-        </w:rPr>
-        <w:t>Professional Issues</w:t>
-      </w:r>
-      <w:r>
-        <w:rPr>
-          <w:rFonts w:ascii="Arial" w:eastAsia="Calibri" w:hAnsi="Arial" w:cs="Arial"/>
-          <w:color w:val="000000"/>
-          <w:sz w:val="20"/>
-          <w:szCs w:val="20"/>
-        </w:rPr>
-        <w:t xml:space="preserve"> (99%).</w:t>
-      </w:r>
-    </w:p>
-    <w:p>
-      <w:pPr>
-        <w:pBdr>
-          <w:top w:val="nil"/>
-          <w:left w:val="nil"/>
-          <w:bottom w:val="single" w:sz="4" w:space="1" w:color="000000"/>
-          <w:right w:val="nil"/>
-          <w:between w:val="nil"/>
-        </w:pBdr>
-        <w:rPr>
-          <w:rFonts w:ascii="Arial" w:eastAsia="Calibri" w:hAnsi="Arial" w:cs="Arial"/>
-          <w:b/>
-          <w:smallCaps/>
-          <w:color w:val="000000"/>
-          <w:sz w:val="20"/>
-          <w:szCs w:val="20"/>
-        </w:rPr>
-      </w:pPr>
-    </w:p>
-    <w:p>
-      <w:pPr>
-        <w:pBdr>
-          <w:top w:val="nil"/>
-          <w:left w:val="nil"/>
-          <w:bottom w:val="nil"/>
-          <w:right w:val="nil"/>
-          <w:between w:val="nil"/>
-        </w:pBdr>
-        <w:spacing w:before="120"/>
-        <w:rPr>
-          <w:rFonts w:ascii="Arial" w:eastAsia="Calibri" w:hAnsi="Arial" w:cs="Arial"/>
-          <w:b/>
-          <w:color w:val="000000"/>
-          <w:sz w:val="22"/>
-          <w:szCs w:val="22"/>
-        </w:rPr>
-      </w:pPr>
-      <w:r>
-        <w:rPr>
-          <w:rFonts w:ascii="Arial" w:eastAsia="Calibri" w:hAnsi="Arial" w:cs="Arial"/>
-          <w:b/>
-          <w:color w:val="000000"/>
-          <w:sz w:val="22"/>
-          <w:szCs w:val="22"/>
-        </w:rPr>
-        <w:t>PROJECTS</w:t>
-      </w:r>
-    </w:p>
-    <w:p>
-      <w:pPr>
-        <w:pBdr>
-          <w:top w:val="nil"/>
-          <w:left w:val="nil"/>
-          <w:bottom w:val="nil"/>
-          <w:right w:val="nil"/>
-          <w:between w:val="nil"/>
-        </w:pBdr>
-        <w:spacing w:before="120"/>
-        <w:rPr>
-          <w:rFonts w:ascii="Arial" w:eastAsia="Calibri" w:hAnsi="Arial" w:cs="Arial"/>
-          <w:b/>
-          <w:color w:val="000000"/>
-          <w:sz w:val="20"/>
-          <w:szCs w:val="20"/>
-        </w:rPr>
-      </w:pPr>
-      <w:r>
-        <w:rPr>
-          <w:rFonts w:ascii="Arial" w:eastAsia="Calibri" w:hAnsi="Arial" w:cs="Arial"/>
-          <w:b/>
-          <w:color w:val="000000"/>
-          <w:sz w:val="20"/>
-          <w:szCs w:val="20"/>
-        </w:rPr>
-        <w:t>P</w:t>
-      </w:r>
-      <w:r>
-        <w:rPr>
-          <w:rFonts w:ascii="Arial" w:eastAsia="Calibri" w:hAnsi="Arial" w:cs="Arial"/>
-          <w:b/>
-          <w:color w:val="000000"/>
-          <w:sz w:val="20"/>
-          <w:szCs w:val="20"/>
-        </w:rPr>
-        <w:t>ersonal website</w:t>
-      </w:r>
-      <w:r>
-        <w:rPr>
-          <w:rFonts w:ascii="Arial" w:eastAsia="Calibri" w:hAnsi="Arial" w:cs="Arial"/>
-          <w:b/>
-          <w:color w:val="000000"/>
-          <w:sz w:val="20"/>
-          <w:szCs w:val="20"/>
-        </w:rPr>
-        <w:t xml:space="preserve"> / </w:t>
-      </w:r>
-      <w:hyperlink r:id="rId12" w:history="1">
-        <w:r>
-          <w:rPr>
-            <w:rStyle w:val="Hyperlink"/>
-            <w:rFonts w:ascii="Arial" w:eastAsia="Calibri" w:hAnsi="Arial" w:cs="Arial"/>
-            <w:b/>
-            <w:sz w:val="20"/>
-            <w:szCs w:val="20"/>
-          </w:rPr>
-          <w:t>https://rmsy.me</w:t>
-        </w:r>
-      </w:hyperlink>
-      <w:r>
-        <w:rPr>
-          <w:rFonts w:ascii="Arial" w:eastAsia="Calibri" w:hAnsi="Arial" w:cs="Arial"/>
-          <w:b/>
-          <w:color w:val="000000"/>
-          <w:sz w:val="20"/>
-          <w:szCs w:val="20"/>
-        </w:rPr>
-        <w:t xml:space="preserve"> /</w:t>
-      </w:r>
-      <w:r>
-        <w:rPr>
-          <w:rFonts w:ascii="Arial" w:eastAsia="Calibri" w:hAnsi="Arial" w:cs="Arial"/>
-          <w:b/>
-          <w:color w:val="000000"/>
-          <w:sz w:val="20"/>
-          <w:szCs w:val="20"/>
-        </w:rPr>
-        <w:t xml:space="preserve"> </w:t>
-      </w:r>
-      <w:hyperlink r:id="rId13" w:history="1">
-        <w:r>
-          <w:rPr>
-            <w:rStyle w:val="Hyperlink"/>
-            <w:rFonts w:ascii="Arial" w:eastAsia="Calibri" w:hAnsi="Arial" w:cs="Arial"/>
-            <w:b/>
-            <w:sz w:val="20"/>
-            <w:szCs w:val="20"/>
-          </w:rPr>
-          <w:t>https://github.com/relnaggar/rmsy.me</w:t>
-        </w:r>
-      </w:hyperlink>
-    </w:p>
-    <w:p>
-      <w:pPr>
-        <w:pStyle w:val="ListParagraph"/>
-        <w:numPr>
-          <w:ilvl w:val="0"/>
-          <w:numId w:val="2"/>
-        </w:numPr>
-        <w:pBdr>
-          <w:top w:val="nil"/>
-          <w:left w:val="nil"/>
-          <w:bottom w:val="nil"/>
-          <w:right w:val="nil"/>
-          <w:between w:val="nil"/>
-        </w:pBdr>
-        <w:rPr>
-          <w:rFonts w:ascii="Arial" w:eastAsia="Calibri" w:hAnsi="Arial" w:cs="Arial"/>
-          <w:color w:val="000000"/>
-          <w:sz w:val="20"/>
-          <w:szCs w:val="20"/>
-        </w:rPr>
-      </w:pPr>
-      <w:r>
-        <w:rPr>
-          <w:rFonts w:ascii="Arial" w:eastAsia="Calibri" w:hAnsi="Arial" w:cs="Arial"/>
-          <w:color w:val="000000"/>
-          <w:sz w:val="20"/>
-          <w:szCs w:val="20"/>
-        </w:rPr>
-        <w:t>D</w:t>
-      </w:r>
-      <w:r>
-        <w:rPr>
-          <w:rFonts w:ascii="Arial" w:eastAsia="Calibri" w:hAnsi="Arial" w:cs="Arial"/>
-          <w:color w:val="000000"/>
-          <w:sz w:val="20"/>
-          <w:szCs w:val="20"/>
-        </w:rPr>
-        <w:t xml:space="preserve">esigned </w:t>
-      </w:r>
-      <w:r>
-        <w:rPr>
-          <w:rFonts w:ascii="Arial" w:eastAsia="Calibri" w:hAnsi="Arial" w:cs="Arial"/>
-          <w:color w:val="000000"/>
-          <w:sz w:val="20"/>
-          <w:szCs w:val="20"/>
-        </w:rPr>
-        <w:t xml:space="preserve">responsive </w:t>
-      </w:r>
-      <w:r>
-        <w:rPr>
-          <w:rFonts w:ascii="Arial" w:eastAsia="Calibri" w:hAnsi="Arial" w:cs="Arial"/>
-          <w:color w:val="000000"/>
-          <w:sz w:val="20"/>
-          <w:szCs w:val="20"/>
-        </w:rPr>
-        <w:t xml:space="preserve">front-end </w:t>
-      </w:r>
-      <w:r>
-        <w:rPr>
-          <w:rFonts w:ascii="Arial" w:eastAsia="Calibri" w:hAnsi="Arial" w:cs="Arial"/>
-          <w:color w:val="000000"/>
-          <w:sz w:val="20"/>
-          <w:szCs w:val="20"/>
-        </w:rPr>
-        <w:t>HTML/CSS templates</w:t>
-      </w:r>
-      <w:r>
-        <w:rPr>
-          <w:rFonts w:ascii="Arial" w:eastAsia="Calibri" w:hAnsi="Arial" w:cs="Arial"/>
-          <w:color w:val="000000"/>
-          <w:sz w:val="20"/>
-          <w:szCs w:val="20"/>
-        </w:rPr>
-        <w:t xml:space="preserve"> with Bootstrap.</w:t>
-      </w:r>
-    </w:p>
-    <w:p>
-      <w:pPr>
-        <w:pStyle w:val="ListParagraph"/>
-        <w:numPr>
-          <w:ilvl w:val="0"/>
-          <w:numId w:val="2"/>
-        </w:numPr>
-        <w:pBdr>
-          <w:top w:val="nil"/>
-          <w:left w:val="nil"/>
-          <w:bottom w:val="nil"/>
-          <w:right w:val="nil"/>
-          <w:between w:val="nil"/>
-        </w:pBdr>
-        <w:rPr>
-          <w:rFonts w:ascii="Arial" w:eastAsia="Calibri" w:hAnsi="Arial" w:cs="Arial"/>
-          <w:color w:val="000000"/>
-          <w:sz w:val="20"/>
-          <w:szCs w:val="20"/>
-        </w:rPr>
-      </w:pPr>
-      <w:r>
-        <w:rPr>
-          <w:rFonts w:ascii="Arial" w:eastAsia="Calibri" w:hAnsi="Arial" w:cs="Arial"/>
-          <w:color w:val="000000"/>
-          <w:sz w:val="20"/>
-          <w:szCs w:val="20"/>
-        </w:rPr>
-        <w:t>B</w:t>
-      </w:r>
-      <w:r>
-        <w:rPr>
-          <w:rFonts w:ascii="Arial" w:eastAsia="Calibri" w:hAnsi="Arial" w:cs="Arial"/>
-          <w:color w:val="000000"/>
-          <w:sz w:val="20"/>
-          <w:szCs w:val="20"/>
-        </w:rPr>
-        <w:t xml:space="preserve">uilt reusable </w:t>
-      </w:r>
-      <w:r>
-        <w:rPr>
-          <w:rFonts w:ascii="Arial" w:eastAsia="Calibri" w:hAnsi="Arial" w:cs="Arial"/>
-          <w:color w:val="000000"/>
-          <w:sz w:val="20"/>
-          <w:szCs w:val="20"/>
-        </w:rPr>
-        <w:t xml:space="preserve">back-end </w:t>
-      </w:r>
-      <w:r>
-        <w:rPr>
-          <w:rFonts w:ascii="Arial" w:eastAsia="Calibri" w:hAnsi="Arial" w:cs="Arial"/>
-          <w:color w:val="000000"/>
-          <w:sz w:val="20"/>
-          <w:szCs w:val="20"/>
-        </w:rPr>
-        <w:t>PHP framework</w:t>
-      </w:r>
-      <w:r>
-        <w:rPr>
-          <w:rFonts w:ascii="Arial" w:eastAsia="Calibri" w:hAnsi="Arial" w:cs="Arial"/>
-          <w:color w:val="000000"/>
-          <w:sz w:val="20"/>
-          <w:szCs w:val="20"/>
-        </w:rPr>
-        <w:t xml:space="preserve"> from scratch</w:t>
-      </w:r>
-      <w:r>
-        <w:rPr>
-          <w:rFonts w:ascii="Arial" w:eastAsia="Calibri" w:hAnsi="Arial" w:cs="Arial"/>
-          <w:color w:val="000000"/>
-          <w:sz w:val="20"/>
-          <w:szCs w:val="20"/>
-        </w:rPr>
-        <w:t>.</w:t>
-      </w:r>
-    </w:p>
-    <w:p>
-      <w:pPr>
-        <w:pStyle w:val="ListParagraph"/>
-        <w:numPr>
-          <w:ilvl w:val="0"/>
-          <w:numId w:val="2"/>
-        </w:numPr>
-        <w:pBdr>
-          <w:top w:val="nil"/>
-          <w:left w:val="nil"/>
-          <w:bottom w:val="nil"/>
-          <w:right w:val="nil"/>
-          <w:between w:val="nil"/>
-        </w:pBdr>
-        <w:rPr>
-          <w:rFonts w:ascii="Arial" w:eastAsia="Calibri" w:hAnsi="Arial" w:cs="Arial"/>
-          <w:color w:val="000000"/>
-          <w:sz w:val="20"/>
-          <w:szCs w:val="20"/>
-        </w:rPr>
-      </w:pPr>
-      <w:r>
-        <w:rPr>
-          <w:rFonts w:ascii="Arial" w:eastAsia="Calibri" w:hAnsi="Arial" w:cs="Arial"/>
-          <w:color w:val="000000"/>
-          <w:sz w:val="20"/>
-          <w:szCs w:val="20"/>
-        </w:rPr>
-        <w:t>C</w:t>
-      </w:r>
-      <w:r>
-        <w:rPr>
-          <w:rFonts w:ascii="Arial" w:eastAsia="Calibri" w:hAnsi="Arial" w:cs="Arial"/>
-          <w:color w:val="000000"/>
-          <w:sz w:val="20"/>
-          <w:szCs w:val="20"/>
-        </w:rPr>
-        <w:t>ontaineri</w:t>
-      </w:r>
-      <w:r>
-        <w:rPr>
-          <w:rFonts w:ascii="Arial" w:eastAsia="Calibri" w:hAnsi="Arial" w:cs="Arial"/>
-          <w:color w:val="000000"/>
-          <w:sz w:val="20"/>
-          <w:szCs w:val="20"/>
-        </w:rPr>
-        <w:t>s</w:t>
-      </w:r>
-      <w:r>
-        <w:rPr>
-          <w:rFonts w:ascii="Arial" w:eastAsia="Calibri" w:hAnsi="Arial" w:cs="Arial"/>
-          <w:color w:val="000000"/>
-          <w:sz w:val="20"/>
-          <w:szCs w:val="20"/>
-        </w:rPr>
-        <w:t>ed</w:t>
-      </w:r>
-      <w:r>
-        <w:rPr>
-          <w:rFonts w:ascii="Arial" w:eastAsia="Calibri" w:hAnsi="Arial" w:cs="Arial"/>
-          <w:color w:val="000000"/>
-          <w:sz w:val="20"/>
-          <w:szCs w:val="20"/>
-        </w:rPr>
-        <w:t xml:space="preserve"> application </w:t>
-      </w:r>
-      <w:r>
-        <w:rPr>
-          <w:rFonts w:ascii="Arial" w:eastAsia="Calibri" w:hAnsi="Arial" w:cs="Arial"/>
-          <w:color w:val="000000"/>
-          <w:sz w:val="20"/>
-          <w:szCs w:val="20"/>
-        </w:rPr>
-        <w:t xml:space="preserve">using Docker, built </w:t>
-      </w:r>
-      <w:r>
-        <w:rPr>
-          <w:rFonts w:ascii="Arial" w:eastAsia="Calibri" w:hAnsi="Arial" w:cs="Arial"/>
-          <w:color w:val="000000"/>
-          <w:sz w:val="20"/>
-          <w:szCs w:val="20"/>
-        </w:rPr>
-        <w:t>a</w:t>
-      </w:r>
-      <w:r>
-        <w:rPr>
-          <w:rFonts w:ascii="Arial" w:eastAsia="Calibri" w:hAnsi="Arial" w:cs="Arial"/>
-          <w:color w:val="000000"/>
-          <w:sz w:val="20"/>
-          <w:szCs w:val="20"/>
-        </w:rPr>
-        <w:t xml:space="preserve">utomated </w:t>
-      </w:r>
-      <w:r>
-        <w:rPr>
-          <w:rFonts w:ascii="Arial" w:eastAsia="Calibri" w:hAnsi="Arial" w:cs="Arial"/>
-          <w:color w:val="000000"/>
-          <w:sz w:val="20"/>
-          <w:szCs w:val="20"/>
-        </w:rPr>
-        <w:t xml:space="preserve">DevOps </w:t>
-      </w:r>
-      <w:r>
-        <w:rPr>
-          <w:rFonts w:ascii="Arial" w:eastAsia="Calibri" w:hAnsi="Arial" w:cs="Arial"/>
-          <w:color w:val="000000"/>
-          <w:sz w:val="20"/>
-          <w:szCs w:val="20"/>
-        </w:rPr>
-        <w:t xml:space="preserve">pipeline </w:t>
-      </w:r>
-      <w:r>
-        <w:rPr>
-          <w:rFonts w:ascii="Arial" w:eastAsia="Calibri" w:hAnsi="Arial" w:cs="Arial"/>
-          <w:color w:val="000000"/>
-          <w:sz w:val="20"/>
-          <w:szCs w:val="20"/>
-        </w:rPr>
-        <w:t>using</w:t>
-      </w:r>
-      <w:r>
-        <w:rPr>
-          <w:rFonts w:ascii="Arial" w:eastAsia="Calibri" w:hAnsi="Arial" w:cs="Arial"/>
-          <w:color w:val="000000"/>
-          <w:sz w:val="20"/>
-          <w:szCs w:val="20"/>
-        </w:rPr>
-        <w:t xml:space="preserve"> Bash scripts</w:t>
-      </w:r>
-      <w:r>
-        <w:rPr>
-          <w:rFonts w:ascii="Arial" w:eastAsia="Calibri" w:hAnsi="Arial" w:cs="Arial"/>
-          <w:color w:val="000000"/>
-          <w:sz w:val="20"/>
-          <w:szCs w:val="20"/>
-        </w:rPr>
-        <w:t xml:space="preserve"> and Git hooks;</w:t>
-      </w:r>
-      <w:r>
-        <w:rPr>
-          <w:rFonts w:ascii="Arial" w:eastAsia="Calibri" w:hAnsi="Arial" w:cs="Arial"/>
-          <w:color w:val="000000"/>
-          <w:sz w:val="20"/>
-          <w:szCs w:val="20"/>
-        </w:rPr>
-        <w:t xml:space="preserve"> </w:t>
-      </w:r>
-      <w:r>
-        <w:rPr>
-          <w:rFonts w:ascii="Arial" w:eastAsia="Calibri" w:hAnsi="Arial" w:cs="Arial"/>
-          <w:color w:val="000000"/>
-          <w:sz w:val="20"/>
-          <w:szCs w:val="20"/>
-        </w:rPr>
-        <w:t>c</w:t>
-      </w:r>
-      <w:r>
-        <w:rPr>
-          <w:rFonts w:ascii="Arial" w:eastAsia="Calibri" w:hAnsi="Arial" w:cs="Arial"/>
-          <w:color w:val="000000"/>
-          <w:sz w:val="20"/>
-          <w:szCs w:val="20"/>
-        </w:rPr>
-        <w:t xml:space="preserve">onfigured AWS EC2 instance and Apache </w:t>
-      </w:r>
-      <w:r>
-        <w:rPr>
-          <w:rFonts w:ascii="Arial" w:eastAsia="Calibri" w:hAnsi="Arial" w:cs="Arial"/>
-          <w:color w:val="000000"/>
-          <w:sz w:val="20"/>
-          <w:szCs w:val="20"/>
-        </w:rPr>
-        <w:t xml:space="preserve">HTTP </w:t>
-      </w:r>
-      <w:r>
-        <w:rPr>
-          <w:rFonts w:ascii="Arial" w:eastAsia="Calibri" w:hAnsi="Arial" w:cs="Arial"/>
-          <w:color w:val="000000"/>
-          <w:sz w:val="20"/>
-          <w:szCs w:val="20"/>
-        </w:rPr>
-        <w:t>Server manually</w:t>
-      </w:r>
-      <w:r>
-        <w:rPr>
-          <w:rFonts w:ascii="Arial" w:eastAsia="Calibri" w:hAnsi="Arial" w:cs="Arial"/>
-          <w:color w:val="000000"/>
-          <w:sz w:val="20"/>
-          <w:szCs w:val="20"/>
-        </w:rPr>
-        <w:t>.</w:t>
-      </w:r>
-    </w:p>
-    <w:p>
-      <w:pPr>
-        <w:pBdr>
-          <w:top w:val="nil"/>
-          <w:left w:val="nil"/>
-          <w:bottom w:val="nil"/>
-          <w:right w:val="nil"/>
-          <w:between w:val="nil"/>
-        </w:pBdr>
-        <w:spacing w:before="120"/>
-        <w:rPr>
-          <w:rFonts w:ascii="Arial" w:eastAsia="Calibri" w:hAnsi="Arial" w:cs="Arial"/>
-          <w:b/>
-          <w:color w:val="000000"/>
-          <w:sz w:val="20"/>
-          <w:szCs w:val="20"/>
-        </w:rPr>
-      </w:pPr>
-      <w:r>
-        <w:rPr>
-          <w:rFonts w:ascii="Arial" w:eastAsia="Calibri" w:hAnsi="Arial" w:cs="Arial"/>
-          <w:b/>
-          <w:color w:val="000000"/>
-          <w:sz w:val="20"/>
-          <w:szCs w:val="20"/>
-        </w:rPr>
-        <w:t>Dung Beetle Biorobot (</w:t>
-      </w:r>
-      <w:proofErr w:type="gramStart"/>
-      <w:r>
-        <w:rPr>
-          <w:rFonts w:ascii="Arial" w:eastAsia="Calibri" w:hAnsi="Arial" w:cs="Arial"/>
-          <w:b/>
-          <w:color w:val="000000"/>
-          <w:sz w:val="20"/>
-          <w:szCs w:val="20"/>
-        </w:rPr>
-        <w:t>Master's</w:t>
-      </w:r>
-      <w:proofErr w:type="gramEnd"/>
-      <w:r>
-        <w:rPr>
-          <w:rFonts w:ascii="Arial" w:eastAsia="Calibri" w:hAnsi="Arial" w:cs="Arial"/>
-          <w:b/>
-          <w:color w:val="000000"/>
-          <w:sz w:val="20"/>
-          <w:szCs w:val="20"/>
-        </w:rPr>
-        <w:t xml:space="preserve"> Dissertation</w:t>
-      </w:r>
-      <w:r>
-        <w:rPr>
-          <w:rFonts w:ascii="Arial" w:eastAsia="Calibri" w:hAnsi="Arial" w:cs="Arial"/>
-          <w:b/>
-          <w:color w:val="000000"/>
-          <w:sz w:val="20"/>
-          <w:szCs w:val="20"/>
-        </w:rPr>
-        <w:t xml:space="preserve"> Project</w:t>
-      </w:r>
-      <w:r>
-        <w:rPr>
-          <w:rFonts w:ascii="Arial" w:eastAsia="Calibri" w:hAnsi="Arial" w:cs="Arial"/>
-          <w:b/>
-          <w:color w:val="000000"/>
-          <w:sz w:val="20"/>
-          <w:szCs w:val="20"/>
-        </w:rPr>
-        <w:t>, 82%) / University of Edinburgh</w:t>
-      </w:r>
-    </w:p>
-    <w:p>
-      <w:pPr>
-        <w:pStyle w:val="ListParagraph"/>
-        <w:numPr>
-          <w:ilvl w:val="0"/>
-          <w:numId w:val="6"/>
-        </w:numPr>
-        <w:pBdr>
-          <w:top w:val="nil"/>
-          <w:left w:val="nil"/>
-          <w:bottom w:val="nil"/>
-          <w:right w:val="nil"/>
-          <w:between w:val="nil"/>
-        </w:pBdr>
-        <w:rPr>
-          <w:rFonts w:ascii="Arial" w:eastAsia="Calibri" w:hAnsi="Arial" w:cs="Arial"/>
-          <w:bCs/>
-          <w:color w:val="000000"/>
-          <w:sz w:val="20"/>
-          <w:szCs w:val="20"/>
-        </w:rPr>
-      </w:pPr>
-      <w:r>
-        <w:rPr>
-          <w:rFonts w:ascii="Arial" w:eastAsia="Calibri" w:hAnsi="Arial" w:cs="Arial"/>
-          <w:bCs/>
-          <w:color w:val="000000"/>
-          <w:sz w:val="20"/>
-          <w:szCs w:val="20"/>
-        </w:rPr>
-        <w:t>Pioneered creation of dung beetle biorobot</w:t>
-      </w:r>
-      <w:r>
-        <w:rPr>
-          <w:rFonts w:ascii="Arial" w:eastAsia="Calibri" w:hAnsi="Arial" w:cs="Arial"/>
-          <w:bCs/>
-          <w:color w:val="000000"/>
-          <w:sz w:val="20"/>
-          <w:szCs w:val="20"/>
-        </w:rPr>
-        <w:t>; adapt</w:t>
-      </w:r>
-      <w:r>
-        <w:rPr>
-          <w:rFonts w:ascii="Arial" w:eastAsia="Calibri" w:hAnsi="Arial" w:cs="Arial"/>
-          <w:bCs/>
-          <w:color w:val="000000"/>
-          <w:sz w:val="20"/>
-          <w:szCs w:val="20"/>
-        </w:rPr>
-        <w:t>ed</w:t>
-      </w:r>
-      <w:r>
-        <w:rPr>
-          <w:rFonts w:ascii="Arial" w:eastAsia="Calibri" w:hAnsi="Arial" w:cs="Arial"/>
-          <w:bCs/>
-          <w:color w:val="000000"/>
-          <w:sz w:val="20"/>
-          <w:szCs w:val="20"/>
-        </w:rPr>
-        <w:t xml:space="preserve"> sophisticated </w:t>
-      </w:r>
-      <w:r>
-        <w:rPr>
-          <w:rFonts w:ascii="Arial" w:eastAsia="Calibri" w:hAnsi="Arial" w:cs="Arial"/>
-          <w:bCs/>
-          <w:color w:val="000000"/>
-          <w:sz w:val="20"/>
-          <w:szCs w:val="20"/>
-        </w:rPr>
-        <w:t>neural model</w:t>
-      </w:r>
-      <w:r>
-        <w:rPr>
-          <w:rFonts w:ascii="Arial" w:eastAsia="Calibri" w:hAnsi="Arial" w:cs="Arial"/>
-          <w:bCs/>
-          <w:color w:val="000000"/>
-          <w:sz w:val="20"/>
-          <w:szCs w:val="20"/>
-        </w:rPr>
-        <w:t xml:space="preserve"> into the robot's programming</w:t>
-      </w:r>
-      <w:r>
-        <w:rPr>
-          <w:rFonts w:ascii="Arial" w:eastAsia="Calibri" w:hAnsi="Arial" w:cs="Arial"/>
-          <w:bCs/>
-          <w:color w:val="000000"/>
-          <w:sz w:val="20"/>
-          <w:szCs w:val="20"/>
-        </w:rPr>
-        <w:t>.</w:t>
-      </w:r>
-    </w:p>
-    <w:p>
-      <w:pPr>
-        <w:pStyle w:val="ListParagraph"/>
-        <w:numPr>
-          <w:ilvl w:val="0"/>
-          <w:numId w:val="6"/>
-        </w:numPr>
-        <w:pBdr>
-          <w:top w:val="nil"/>
-          <w:left w:val="nil"/>
-          <w:bottom w:val="nil"/>
-          <w:right w:val="nil"/>
-          <w:between w:val="nil"/>
-        </w:pBdr>
-        <w:rPr>
-          <w:rFonts w:ascii="Arial" w:eastAsia="Calibri" w:hAnsi="Arial" w:cs="Arial"/>
-          <w:bCs/>
-          <w:color w:val="000000"/>
-          <w:sz w:val="20"/>
-          <w:szCs w:val="20"/>
-        </w:rPr>
-      </w:pPr>
-      <w:r>
-        <w:rPr>
-          <w:rFonts w:ascii="Arial" w:eastAsia="Calibri" w:hAnsi="Arial" w:cs="Arial"/>
-          <w:bCs/>
-          <w:color w:val="000000"/>
-          <w:sz w:val="20"/>
-          <w:szCs w:val="20"/>
-        </w:rPr>
-        <w:t xml:space="preserve">Secured exclusive research grant </w:t>
-      </w:r>
-      <w:r>
-        <w:rPr>
-          <w:rFonts w:ascii="Arial" w:eastAsia="Calibri" w:hAnsi="Arial" w:cs="Arial"/>
-          <w:bCs/>
-          <w:color w:val="000000"/>
-          <w:sz w:val="20"/>
-          <w:szCs w:val="20"/>
-        </w:rPr>
-        <w:t xml:space="preserve">to travel to </w:t>
-      </w:r>
-      <w:r>
-        <w:rPr>
-          <w:rFonts w:ascii="Arial" w:eastAsia="Calibri" w:hAnsi="Arial" w:cs="Arial"/>
-          <w:bCs/>
-          <w:color w:val="000000"/>
-          <w:sz w:val="20"/>
-          <w:szCs w:val="20"/>
-        </w:rPr>
-        <w:t xml:space="preserve">South Africa to </w:t>
-      </w:r>
-      <w:r>
-        <w:rPr>
-          <w:rFonts w:ascii="Arial" w:eastAsia="Calibri" w:hAnsi="Arial" w:cs="Arial"/>
-          <w:bCs/>
-          <w:color w:val="000000"/>
-          <w:sz w:val="20"/>
-          <w:szCs w:val="20"/>
-        </w:rPr>
-        <w:t>test the robot alongside real dung beetles.</w:t>
-      </w:r>
-    </w:p>
-    <w:p>
-      <w:pPr>
-        <w:pBdr>
-          <w:top w:val="nil"/>
-          <w:left w:val="nil"/>
-          <w:bottom w:val="nil"/>
-          <w:right w:val="nil"/>
-          <w:between w:val="nil"/>
-        </w:pBdr>
-        <w:spacing w:before="120"/>
-        <w:rPr>
-          <w:rFonts w:ascii="Arial" w:eastAsia="Calibri" w:hAnsi="Arial" w:cs="Arial"/>
-          <w:b/>
-          <w:color w:val="000000"/>
-          <w:sz w:val="20"/>
-          <w:szCs w:val="20"/>
-        </w:rPr>
-      </w:pPr>
-      <w:r>
-        <w:rPr>
-          <w:rFonts w:ascii="Arial" w:eastAsia="Calibri" w:hAnsi="Arial" w:cs="Arial"/>
-          <w:b/>
-          <w:color w:val="000000"/>
-          <w:sz w:val="20"/>
-          <w:szCs w:val="20"/>
-        </w:rPr>
-        <w:t>System Design Project (88%)</w:t>
-      </w:r>
-      <w:r>
-        <w:rPr>
-          <w:rFonts w:ascii="Arial" w:eastAsia="Calibri" w:hAnsi="Arial" w:cs="Arial"/>
-          <w:b/>
-          <w:color w:val="000000"/>
-          <w:sz w:val="20"/>
-          <w:szCs w:val="20"/>
-        </w:rPr>
-        <w:t xml:space="preserve"> /</w:t>
-      </w:r>
-      <w:r>
-        <w:rPr>
-          <w:rFonts w:ascii="Arial" w:eastAsia="Calibri" w:hAnsi="Arial" w:cs="Arial"/>
-          <w:b/>
-          <w:color w:val="000000"/>
-          <w:sz w:val="20"/>
-          <w:szCs w:val="20"/>
-        </w:rPr>
-        <w:t xml:space="preserve"> </w:t>
-      </w:r>
-      <w:r>
-        <w:rPr>
-          <w:rFonts w:ascii="Arial" w:eastAsia="Calibri" w:hAnsi="Arial" w:cs="Arial"/>
-          <w:b/>
-          <w:color w:val="000000"/>
-          <w:sz w:val="20"/>
-          <w:szCs w:val="20"/>
-        </w:rPr>
-        <w:t>University of Edinburgh</w:t>
-      </w:r>
-      <w:r>
-        <w:rPr>
-          <w:rFonts w:ascii="Arial" w:hAnsi="Arial" w:cs="Arial"/>
-          <w:b/>
-          <w:sz w:val="20"/>
-          <w:szCs w:val="20"/>
-        </w:rPr>
-        <w:t xml:space="preserve"> </w:t>
-      </w:r>
-    </w:p>
-    <w:p>
-      <w:pPr>
-        <w:pStyle w:val="ListParagraph"/>
-        <w:numPr>
-          <w:ilvl w:val="0"/>
-          <w:numId w:val="2"/>
-        </w:numPr>
-        <w:pBdr>
-          <w:top w:val="nil"/>
-          <w:left w:val="nil"/>
-          <w:bottom w:val="nil"/>
-          <w:right w:val="nil"/>
-          <w:between w:val="nil"/>
-        </w:pBdr>
-        <w:rPr>
-          <w:rFonts w:ascii="Arial" w:eastAsia="Calibri" w:hAnsi="Arial" w:cs="Arial"/>
-          <w:color w:val="000000"/>
-          <w:sz w:val="20"/>
-          <w:szCs w:val="20"/>
-        </w:rPr>
-      </w:pPr>
-      <w:r>
-        <w:rPr>
-          <w:rFonts w:ascii="Arial" w:eastAsia="Calibri" w:hAnsi="Arial" w:cs="Arial"/>
-          <w:color w:val="000000"/>
-          <w:sz w:val="20"/>
-          <w:szCs w:val="20"/>
-        </w:rPr>
-        <w:t xml:space="preserve">Led group of </w:t>
-      </w:r>
-      <w:r>
-        <w:rPr>
-          <w:rFonts w:ascii="Arial" w:eastAsia="Calibri" w:hAnsi="Arial" w:cs="Arial"/>
-          <w:color w:val="000000"/>
-          <w:sz w:val="20"/>
-          <w:szCs w:val="20"/>
-        </w:rPr>
-        <w:t>4</w:t>
-      </w:r>
-      <w:r>
-        <w:rPr>
-          <w:rFonts w:ascii="Arial" w:eastAsia="Calibri" w:hAnsi="Arial" w:cs="Arial"/>
-          <w:color w:val="000000"/>
-          <w:sz w:val="20"/>
-          <w:szCs w:val="20"/>
-        </w:rPr>
-        <w:t xml:space="preserve"> to</w:t>
-      </w:r>
-      <w:r>
-        <w:rPr>
-          <w:rFonts w:ascii="Arial" w:eastAsia="Calibri" w:hAnsi="Arial" w:cs="Arial"/>
-          <w:color w:val="000000"/>
-          <w:sz w:val="20"/>
-          <w:szCs w:val="20"/>
-        </w:rPr>
-        <w:t xml:space="preserve"> design</w:t>
-      </w:r>
-      <w:r>
-        <w:rPr>
-          <w:rFonts w:ascii="Arial" w:eastAsia="Calibri" w:hAnsi="Arial" w:cs="Arial"/>
-          <w:color w:val="000000"/>
-          <w:sz w:val="20"/>
-          <w:szCs w:val="20"/>
-        </w:rPr>
-        <w:t xml:space="preserve"> and </w:t>
-      </w:r>
-      <w:r>
-        <w:rPr>
-          <w:rFonts w:ascii="Arial" w:eastAsia="Calibri" w:hAnsi="Arial" w:cs="Arial"/>
-          <w:color w:val="000000"/>
-          <w:sz w:val="20"/>
-          <w:szCs w:val="20"/>
-        </w:rPr>
-        <w:t xml:space="preserve">build </w:t>
-      </w:r>
-      <w:r>
-        <w:rPr>
-          <w:rFonts w:ascii="Arial" w:eastAsia="Calibri" w:hAnsi="Arial" w:cs="Arial"/>
-          <w:color w:val="000000"/>
-          <w:sz w:val="20"/>
-          <w:szCs w:val="20"/>
-        </w:rPr>
-        <w:t xml:space="preserve">a </w:t>
-      </w:r>
-      <w:r>
-        <w:rPr>
-          <w:rFonts w:ascii="Arial" w:eastAsia="Calibri" w:hAnsi="Arial" w:cs="Arial"/>
-          <w:color w:val="000000"/>
-          <w:sz w:val="20"/>
-          <w:szCs w:val="20"/>
-        </w:rPr>
-        <w:t>football-playing robot</w:t>
-      </w:r>
-      <w:r>
-        <w:rPr>
-          <w:rFonts w:ascii="Arial" w:eastAsia="Calibri" w:hAnsi="Arial" w:cs="Arial"/>
-          <w:color w:val="000000"/>
-          <w:sz w:val="20"/>
-          <w:szCs w:val="20"/>
-        </w:rPr>
-        <w:t xml:space="preserve">, winning </w:t>
-      </w:r>
-      <w:r>
-        <w:rPr>
-          <w:rFonts w:ascii="Arial" w:eastAsia="Calibri" w:hAnsi="Arial" w:cs="Arial"/>
-          <w:color w:val="000000"/>
-          <w:sz w:val="20"/>
-          <w:szCs w:val="20"/>
-        </w:rPr>
-        <w:t>2nd</w:t>
-      </w:r>
-      <w:r>
-        <w:rPr>
-          <w:rFonts w:ascii="Arial" w:eastAsia="Calibri" w:hAnsi="Arial" w:cs="Arial"/>
-          <w:color w:val="000000"/>
-          <w:sz w:val="20"/>
-          <w:szCs w:val="20"/>
-        </w:rPr>
-        <w:t xml:space="preserve"> place in annual competition</w:t>
-      </w:r>
-      <w:r>
-        <w:rPr>
-          <w:rFonts w:ascii="Arial" w:eastAsia="Calibri" w:hAnsi="Arial" w:cs="Arial"/>
-          <w:color w:val="000000"/>
-          <w:sz w:val="20"/>
-          <w:szCs w:val="20"/>
-        </w:rPr>
-        <w:t>.</w:t>
-      </w:r>
-    </w:p>
-    <w:p>
-      <w:pPr>
-        <w:pStyle w:val="ListParagraph"/>
-        <w:numPr>
-          <w:ilvl w:val="0"/>
-          <w:numId w:val="2"/>
-        </w:numPr>
-        <w:pBdr>
-          <w:top w:val="nil"/>
-          <w:left w:val="nil"/>
-          <w:bottom w:val="nil"/>
-          <w:right w:val="nil"/>
-          <w:between w:val="nil"/>
-        </w:pBdr>
-        <w:rPr>
-          <w:rFonts w:ascii="Arial" w:eastAsia="Calibri" w:hAnsi="Arial" w:cs="Arial"/>
-          <w:color w:val="000000"/>
-          <w:sz w:val="20"/>
-          <w:szCs w:val="20"/>
-        </w:rPr>
-      </w:pPr>
-      <w:r>
-        <w:rPr>
-          <w:rFonts w:ascii="Arial" w:eastAsia="Calibri" w:hAnsi="Arial" w:cs="Arial"/>
-          <w:color w:val="000000"/>
-          <w:sz w:val="20"/>
-          <w:szCs w:val="20"/>
-        </w:rPr>
-        <w:t>Awarded annual prize for best technical presentation</w:t>
-      </w:r>
-      <w:r>
-        <w:rPr>
-          <w:rFonts w:ascii="Arial" w:eastAsia="Calibri" w:hAnsi="Arial" w:cs="Arial"/>
-          <w:color w:val="000000"/>
-          <w:sz w:val="20"/>
-          <w:szCs w:val="20"/>
-        </w:rPr>
-        <w:t>.</w:t>
-      </w:r>
-    </w:p>
-    <w:p>
-      <w:pPr>
-        <w:pBdr>
-          <w:top w:val="nil"/>
-          <w:left w:val="nil"/>
-          <w:bottom w:val="nil"/>
-          <w:right w:val="nil"/>
-          <w:between w:val="nil"/>
-        </w:pBdr>
-        <w:spacing w:before="120"/>
-        <w:rPr>
-          <w:rFonts w:ascii="Arial" w:eastAsia="Calibri" w:hAnsi="Arial" w:cs="Arial"/>
-          <w:color w:val="000000"/>
-          <w:sz w:val="20"/>
-          <w:szCs w:val="20"/>
-        </w:rPr>
-      </w:pPr>
-      <w:r>
-        <w:rPr>
-          <w:rFonts w:ascii="Arial" w:eastAsia="Calibri" w:hAnsi="Arial" w:cs="Arial"/>
-          <w:b/>
-          <w:color w:val="000000"/>
-          <w:sz w:val="20"/>
-          <w:szCs w:val="20"/>
-        </w:rPr>
-        <w:t>Compiling Techniques (100%) / University of Edinburgh</w:t>
-      </w:r>
-    </w:p>
-    <w:p>
-      <w:pPr>
-        <w:pStyle w:val="ListParagraph"/>
-        <w:numPr>
-          <w:ilvl w:val="0"/>
-          <w:numId w:val="2"/>
-        </w:numPr>
-        <w:pBdr>
-          <w:top w:val="nil"/>
-          <w:left w:val="nil"/>
-          <w:bottom w:val="nil"/>
-          <w:right w:val="nil"/>
-          <w:between w:val="nil"/>
-        </w:pBdr>
-        <w:rPr>
-          <w:rFonts w:ascii="Arial" w:eastAsia="Calibri" w:hAnsi="Arial" w:cs="Arial"/>
-          <w:color w:val="000000"/>
-          <w:sz w:val="20"/>
-          <w:szCs w:val="20"/>
-        </w:rPr>
-      </w:pPr>
-      <w:r>
-        <w:rPr>
-          <w:rFonts w:ascii="Arial" w:eastAsia="Calibri" w:hAnsi="Arial" w:cs="Arial"/>
-          <w:color w:val="000000"/>
-          <w:sz w:val="20"/>
-          <w:szCs w:val="20"/>
-        </w:rPr>
-        <w:t>Implemented</w:t>
-      </w:r>
-      <w:r>
-        <w:rPr>
-          <w:rFonts w:ascii="Arial" w:eastAsia="Calibri" w:hAnsi="Arial" w:cs="Arial"/>
-          <w:color w:val="000000"/>
-          <w:sz w:val="20"/>
-          <w:szCs w:val="20"/>
-        </w:rPr>
-        <w:t xml:space="preserve"> a C compiler in Java: </w:t>
-      </w:r>
-      <w:r>
-        <w:rPr>
-          <w:rFonts w:ascii="Arial" w:eastAsia="Calibri" w:hAnsi="Arial" w:cs="Arial"/>
-          <w:color w:val="000000"/>
-          <w:sz w:val="20"/>
-          <w:szCs w:val="20"/>
-        </w:rPr>
-        <w:t>lexing, parsing, semantic analysis and Java bytecode generation.</w:t>
-      </w:r>
-    </w:p>
-    <w:p>
-      <w:pPr>
-        <w:pBdr>
-          <w:top w:val="nil"/>
-          <w:left w:val="nil"/>
-          <w:bottom w:val="single" w:sz="4" w:space="1" w:color="000000"/>
-          <w:right w:val="nil"/>
-          <w:between w:val="nil"/>
-        </w:pBdr>
-        <w:rPr>
-          <w:rFonts w:ascii="Arial" w:eastAsia="Calibri" w:hAnsi="Arial" w:cs="Arial"/>
-          <w:b/>
-          <w:smallCaps/>
-          <w:color w:val="000000"/>
-          <w:sz w:val="20"/>
-          <w:szCs w:val="20"/>
-        </w:rPr>
-      </w:pPr>
-    </w:p>
-    <w:p>
-      <w:pPr>
-        <w:pBdr>
-          <w:top w:val="nil"/>
-          <w:left w:val="nil"/>
-          <w:bottom w:val="nil"/>
-          <w:right w:val="nil"/>
-          <w:between w:val="nil"/>
-        </w:pBdr>
-        <w:spacing w:before="120"/>
-        <w:rPr>
-          <w:rFonts w:ascii="Arial" w:eastAsia="Calibri" w:hAnsi="Arial" w:cs="Arial"/>
-          <w:b/>
-          <w:color w:val="000000"/>
-          <w:sz w:val="22"/>
-          <w:szCs w:val="22"/>
-        </w:rPr>
-      </w:pPr>
-      <w:r>
-        <w:rPr>
-          <w:rFonts w:ascii="Arial" w:eastAsia="Calibri" w:hAnsi="Arial" w:cs="Arial"/>
-          <w:b/>
-          <w:color w:val="000000"/>
-          <w:sz w:val="22"/>
-          <w:szCs w:val="22"/>
-        </w:rPr>
-        <w:t>SKILLS</w:t>
-      </w:r>
-    </w:p>
-    <w:p>
-      <w:pPr>
-        <w:pStyle w:val="ListParagraph"/>
-        <w:numPr>
-          <w:ilvl w:val="0"/>
-          <w:numId w:val="2"/>
-        </w:numPr>
-        <w:pBdr>
-          <w:top w:val="nil"/>
-          <w:left w:val="nil"/>
-          <w:bottom w:val="nil"/>
-          <w:right w:val="nil"/>
-          <w:between w:val="nil"/>
-        </w:pBdr>
-        <w:spacing w:before="120"/>
-        <w:rPr>
-          <w:rFonts w:ascii="Arial" w:eastAsia="Calibri" w:hAnsi="Arial" w:cs="Arial"/>
-          <w:b/>
-          <w:bCs/>
-          <w:color w:val="000000"/>
-          <w:sz w:val="20"/>
-          <w:szCs w:val="20"/>
-        </w:rPr>
-      </w:pPr>
-      <w:r>
-        <w:rPr>
-          <w:rFonts w:ascii="Arial" w:eastAsia="Calibri" w:hAnsi="Arial" w:cs="Arial"/>
-          <w:b/>
-          <w:bCs/>
-          <w:color w:val="000000"/>
-          <w:sz w:val="20"/>
-          <w:szCs w:val="20"/>
-        </w:rPr>
-        <w:t>L</w:t>
-      </w:r>
-      <w:r>
-        <w:rPr>
-          <w:rFonts w:ascii="Arial" w:eastAsia="Calibri" w:hAnsi="Arial" w:cs="Arial"/>
-          <w:b/>
-          <w:bCs/>
-          <w:color w:val="000000"/>
-          <w:sz w:val="20"/>
-          <w:szCs w:val="20"/>
-        </w:rPr>
-        <w:t>anguages:</w:t>
-      </w:r>
-      <w:r>
-        <w:rPr>
-          <w:rFonts w:ascii="Arial" w:eastAsia="Calibri" w:hAnsi="Arial" w:cs="Arial"/>
-          <w:b/>
-          <w:bCs/>
-          <w:color w:val="000000"/>
-          <w:sz w:val="20"/>
-          <w:szCs w:val="20"/>
-        </w:rPr>
-        <w:t xml:space="preserve"> </w:t>
-      </w:r>
-      <w:r>
-        <w:rPr>
-          <w:rFonts w:ascii="Arial" w:eastAsia="Calibri" w:hAnsi="Arial" w:cs="Arial"/>
-          <w:color w:val="000000"/>
-          <w:sz w:val="20"/>
-          <w:szCs w:val="20"/>
-        </w:rPr>
-        <w:t>Python</w:t>
-      </w:r>
-      <w:r>
-        <w:rPr>
-          <w:rFonts w:ascii="Arial" w:eastAsia="Calibri" w:hAnsi="Arial" w:cs="Arial"/>
-          <w:color w:val="000000"/>
-          <w:sz w:val="20"/>
-          <w:szCs w:val="20"/>
-        </w:rPr>
-        <w:t>,</w:t>
-      </w:r>
-      <w:r>
-        <w:rPr>
-          <w:rFonts w:ascii="Arial" w:eastAsia="Calibri" w:hAnsi="Arial" w:cs="Arial"/>
-          <w:color w:val="000000"/>
-          <w:sz w:val="20"/>
-          <w:szCs w:val="20"/>
-        </w:rPr>
-        <w:t xml:space="preserve"> PHP, Java, SQL, HTML/CSS, JavaScript</w:t>
-      </w:r>
-      <w:r>
-        <w:rPr>
-          <w:rFonts w:ascii="Arial" w:eastAsia="Calibri" w:hAnsi="Arial" w:cs="Arial"/>
-          <w:color w:val="000000"/>
-          <w:sz w:val="20"/>
-          <w:szCs w:val="20"/>
-        </w:rPr>
-        <w:t>, MATLAB, C, Haskell, Ruby</w:t>
-      </w:r>
-    </w:p>
-    <w:p>
-      <w:pPr>
-        <w:pStyle w:val="ListParagraph"/>
-        <w:numPr>
-          <w:ilvl w:val="0"/>
-          <w:numId w:val="2"/>
-        </w:numPr>
-        <w:pBdr>
-          <w:top w:val="nil"/>
-          <w:left w:val="nil"/>
-          <w:bottom w:val="nil"/>
-          <w:right w:val="nil"/>
-          <w:between w:val="nil"/>
-        </w:pBdr>
-        <w:spacing w:before="120"/>
-        <w:rPr>
-          <w:rFonts w:ascii="Arial" w:eastAsia="Calibri" w:hAnsi="Arial" w:cs="Arial"/>
-          <w:b/>
-          <w:bCs/>
-          <w:color w:val="000000"/>
-          <w:sz w:val="20"/>
-          <w:szCs w:val="20"/>
-        </w:rPr>
-      </w:pPr>
-      <w:r>
-        <w:rPr>
-          <w:rFonts w:ascii="Arial" w:eastAsia="Calibri" w:hAnsi="Arial" w:cs="Arial"/>
-          <w:b/>
-          <w:bCs/>
-          <w:color w:val="000000"/>
-          <w:sz w:val="20"/>
-          <w:szCs w:val="20"/>
-        </w:rPr>
-        <w:t>Frameworks</w:t>
-      </w:r>
-      <w:r>
-        <w:rPr>
-          <w:rFonts w:ascii="Arial" w:eastAsia="Calibri" w:hAnsi="Arial" w:cs="Arial"/>
-          <w:b/>
-          <w:bCs/>
-          <w:color w:val="000000"/>
-          <w:sz w:val="20"/>
-          <w:szCs w:val="20"/>
-        </w:rPr>
-        <w:t xml:space="preserve">: </w:t>
-      </w:r>
-      <w:r>
-        <w:rPr>
-          <w:rFonts w:ascii="Arial" w:eastAsia="Calibri" w:hAnsi="Arial" w:cs="Arial"/>
-          <w:color w:val="000000"/>
-          <w:sz w:val="20"/>
-          <w:szCs w:val="20"/>
-        </w:rPr>
-        <w:t>Django</w:t>
-      </w:r>
-      <w:r>
-        <w:rPr>
-          <w:rFonts w:ascii="Arial" w:eastAsia="Calibri" w:hAnsi="Arial" w:cs="Arial"/>
-          <w:color w:val="000000"/>
-          <w:sz w:val="20"/>
-          <w:szCs w:val="20"/>
-        </w:rPr>
-        <w:t xml:space="preserve"> (</w:t>
-      </w:r>
-      <w:r>
-        <w:rPr>
-          <w:rFonts w:ascii="Arial" w:eastAsia="Calibri" w:hAnsi="Arial" w:cs="Arial"/>
-          <w:color w:val="000000"/>
-          <w:sz w:val="20"/>
-          <w:szCs w:val="20"/>
-        </w:rPr>
-        <w:t>Python</w:t>
-      </w:r>
-      <w:r>
-        <w:rPr>
-          <w:rFonts w:ascii="Arial" w:eastAsia="Calibri" w:hAnsi="Arial" w:cs="Arial"/>
-          <w:color w:val="000000"/>
-          <w:sz w:val="20"/>
-          <w:szCs w:val="20"/>
-        </w:rPr>
-        <w:t xml:space="preserve">), </w:t>
-      </w:r>
-      <w:r>
-        <w:rPr>
-          <w:rFonts w:ascii="Arial" w:eastAsia="Calibri" w:hAnsi="Arial" w:cs="Arial"/>
-          <w:color w:val="000000"/>
-          <w:sz w:val="20"/>
-          <w:szCs w:val="20"/>
-        </w:rPr>
-        <w:t>Bootstrap (HTML/CSS)</w:t>
-      </w:r>
-      <w:r>
-        <w:rPr>
-          <w:rFonts w:ascii="Arial" w:eastAsia="Calibri" w:hAnsi="Arial" w:cs="Arial"/>
-          <w:color w:val="000000"/>
-          <w:sz w:val="20"/>
-          <w:szCs w:val="20"/>
-        </w:rPr>
-        <w:t xml:space="preserve">, </w:t>
-      </w:r>
-      <w:r>
-        <w:rPr>
-          <w:rFonts w:ascii="Arial" w:eastAsia="Calibri" w:hAnsi="Arial" w:cs="Arial"/>
-          <w:color w:val="000000"/>
-          <w:sz w:val="20"/>
-          <w:szCs w:val="20"/>
-        </w:rPr>
-        <w:t>Ruby on Rails (</w:t>
-      </w:r>
-      <w:r>
-        <w:rPr>
-          <w:rFonts w:ascii="Arial" w:eastAsia="Calibri" w:hAnsi="Arial" w:cs="Arial"/>
-          <w:color w:val="000000"/>
-          <w:sz w:val="20"/>
-          <w:szCs w:val="20"/>
-        </w:rPr>
-        <w:t>Ruby</w:t>
-      </w:r>
-      <w:r>
-        <w:rPr>
-          <w:rFonts w:ascii="Arial" w:eastAsia="Calibri" w:hAnsi="Arial" w:cs="Arial"/>
-          <w:color w:val="000000"/>
-          <w:sz w:val="20"/>
-          <w:szCs w:val="20"/>
-        </w:rPr>
-        <w:t>)</w:t>
-      </w:r>
-    </w:p>
-    <w:p>
-      <w:pPr>
-        <w:pStyle w:val="ListParagraph"/>
-        <w:numPr>
-          <w:ilvl w:val="0"/>
-          <w:numId w:val="2"/>
-        </w:numPr>
-        <w:pBdr>
-          <w:top w:val="nil"/>
-          <w:left w:val="nil"/>
-          <w:bottom w:val="nil"/>
-          <w:right w:val="nil"/>
-          <w:between w:val="nil"/>
-        </w:pBdr>
-        <w:spacing w:before="120"/>
-        <w:rPr>
-          <w:rFonts w:ascii="Arial" w:eastAsia="Calibri" w:hAnsi="Arial" w:cs="Arial"/>
-          <w:b/>
-          <w:bCs/>
-          <w:color w:val="000000"/>
-          <w:sz w:val="20"/>
-          <w:szCs w:val="20"/>
-        </w:rPr>
-      </w:pPr>
-      <w:r>
-        <w:rPr>
-          <w:rFonts w:ascii="Arial" w:eastAsia="Calibri" w:hAnsi="Arial" w:cs="Arial"/>
-          <w:b/>
-          <w:bCs/>
-          <w:color w:val="000000"/>
-          <w:sz w:val="20"/>
-          <w:szCs w:val="20"/>
-        </w:rPr>
-        <w:t>T</w:t>
-      </w:r>
-      <w:r>
-        <w:rPr>
-          <w:rFonts w:ascii="Arial" w:eastAsia="Calibri" w:hAnsi="Arial" w:cs="Arial"/>
-          <w:b/>
-          <w:bCs/>
-          <w:color w:val="000000"/>
-          <w:sz w:val="20"/>
-          <w:szCs w:val="20"/>
-        </w:rPr>
-        <w:t>ools:</w:t>
-      </w:r>
-      <w:r>
-        <w:rPr>
-          <w:rFonts w:ascii="Arial" w:eastAsia="Calibri" w:hAnsi="Arial" w:cs="Arial"/>
-          <w:b/>
-          <w:bCs/>
-          <w:color w:val="000000"/>
-          <w:sz w:val="20"/>
-          <w:szCs w:val="20"/>
-        </w:rPr>
-        <w:t xml:space="preserve"> </w:t>
-      </w:r>
-      <w:r>
-        <w:rPr>
-          <w:rFonts w:ascii="Arial" w:eastAsia="Calibri" w:hAnsi="Arial" w:cs="Arial"/>
-          <w:color w:val="000000"/>
-          <w:sz w:val="20"/>
-          <w:szCs w:val="20"/>
-        </w:rPr>
-        <w:t>Git, Bash,</w:t>
-      </w:r>
-      <w:r>
-        <w:rPr>
-          <w:rFonts w:ascii="Arial" w:eastAsia="Calibri" w:hAnsi="Arial" w:cs="Arial"/>
-          <w:color w:val="000000"/>
-          <w:sz w:val="20"/>
-          <w:szCs w:val="20"/>
-        </w:rPr>
-        <w:t xml:space="preserve"> MySQL,</w:t>
-      </w:r>
-      <w:r>
-        <w:rPr>
-          <w:rFonts w:ascii="Arial" w:eastAsia="Calibri" w:hAnsi="Arial" w:cs="Arial"/>
-          <w:color w:val="000000"/>
-          <w:sz w:val="20"/>
-          <w:szCs w:val="20"/>
-        </w:rPr>
-        <w:t xml:space="preserve"> Docker, Apache HTTP Server, A</w:t>
-      </w:r>
-      <w:r>
-        <w:rPr>
-          <w:rFonts w:ascii="Arial" w:eastAsia="Calibri" w:hAnsi="Arial" w:cs="Arial"/>
-          <w:color w:val="000000"/>
-          <w:sz w:val="20"/>
-          <w:szCs w:val="20"/>
-        </w:rPr>
-        <w:t xml:space="preserve">mazon </w:t>
-      </w:r>
-      <w:r>
-        <w:rPr>
-          <w:rFonts w:ascii="Arial" w:eastAsia="Calibri" w:hAnsi="Arial" w:cs="Arial"/>
-          <w:color w:val="000000"/>
-          <w:sz w:val="20"/>
-          <w:szCs w:val="20"/>
-        </w:rPr>
-        <w:t>W</w:t>
-      </w:r>
-      <w:r>
-        <w:rPr>
-          <w:rFonts w:ascii="Arial" w:eastAsia="Calibri" w:hAnsi="Arial" w:cs="Arial"/>
-          <w:color w:val="000000"/>
-          <w:sz w:val="20"/>
-          <w:szCs w:val="20"/>
-        </w:rPr>
-        <w:t xml:space="preserve">eb </w:t>
-      </w:r>
-      <w:r>
-        <w:rPr>
-          <w:rFonts w:ascii="Arial" w:eastAsia="Calibri" w:hAnsi="Arial" w:cs="Arial"/>
-          <w:color w:val="000000"/>
-          <w:sz w:val="20"/>
-          <w:szCs w:val="20"/>
-        </w:rPr>
-        <w:t>S</w:t>
-      </w:r>
-      <w:r>
-        <w:rPr>
-          <w:rFonts w:ascii="Arial" w:eastAsia="Calibri" w:hAnsi="Arial" w:cs="Arial"/>
-          <w:color w:val="000000"/>
-          <w:sz w:val="20"/>
-          <w:szCs w:val="20"/>
-        </w:rPr>
-        <w:t>ervices (AWS)</w:t>
-      </w:r>
-    </w:p>
-    <w:p>
-      <w:pPr>
-        <w:pBdr>
-          <w:top w:val="nil"/>
-          <w:left w:val="nil"/>
-          <w:bottom w:val="single" w:sz="4" w:space="1" w:color="000000"/>
-          <w:right w:val="nil"/>
-          <w:between w:val="nil"/>
-        </w:pBdr>
-        <w:rPr>
-          <w:rFonts w:ascii="Arial" w:eastAsia="Calibri" w:hAnsi="Arial" w:cs="Arial"/>
-          <w:b/>
-          <w:smallCaps/>
-          <w:color w:val="000000"/>
-          <w:sz w:val="20"/>
-          <w:szCs w:val="20"/>
-        </w:rPr>
-      </w:pPr>
-    </w:p>
-    <w:p>
-      <w:pPr>
-        <w:pBdr>
-          <w:top w:val="nil"/>
-          <w:left w:val="nil"/>
-          <w:bottom w:val="nil"/>
-          <w:right w:val="nil"/>
-          <w:between w:val="nil"/>
-        </w:pBdr>
-        <w:spacing w:before="120"/>
-        <w:rPr>
-          <w:rFonts w:ascii="Arial" w:eastAsia="Calibri" w:hAnsi="Arial" w:cs="Arial"/>
-          <w:b/>
-          <w:color w:val="000000"/>
-          <w:sz w:val="22"/>
-          <w:szCs w:val="22"/>
-        </w:rPr>
-      </w:pPr>
-      <w:r>
-        <w:rPr>
-          <w:rFonts w:ascii="Arial" w:eastAsia="Calibri" w:hAnsi="Arial" w:cs="Arial"/>
-          <w:b/>
-          <w:color w:val="000000"/>
-          <w:sz w:val="22"/>
-          <w:szCs w:val="22"/>
-        </w:rPr>
-        <w:t>ADDITIONAL ACHIEVEMENTS</w:t>
       </w:r>
     </w:p>
     <w:p>
@@ -3413,7 +1630,642 @@
           <w:sz w:val="20"/>
           <w:szCs w:val="20"/>
         </w:rPr>
-        <w:t xml:space="preserve"> (AFHEA)</w:t>
+        <w:t xml:space="preserve"> (AFHEA).</w:t>
+      </w:r>
+    </w:p>
+    <w:p>
+      <w:pPr>
+        <w:pBdr>
+          <w:top w:val="nil"/>
+          <w:left w:val="nil"/>
+          <w:bottom w:val="single" w:sz="4" w:space="1" w:color="000000"/>
+          <w:right w:val="nil"/>
+          <w:between w:val="nil"/>
+        </w:pBdr>
+        <w:rPr>
+          <w:rFonts w:ascii="Arial" w:eastAsia="Calibri" w:hAnsi="Arial" w:cs="Arial"/>
+          <w:b/>
+          <w:smallCaps/>
+          <w:color w:val="000000"/>
+          <w:sz w:val="20"/>
+          <w:szCs w:val="20"/>
+        </w:rPr>
+      </w:pPr>
+    </w:p>
+    <w:p>
+      <w:pPr>
+        <w:pBdr>
+          <w:top w:val="nil"/>
+          <w:left w:val="nil"/>
+          <w:bottom w:val="nil"/>
+          <w:right w:val="nil"/>
+          <w:between w:val="nil"/>
+        </w:pBdr>
+        <w:spacing w:before="120"/>
+        <w:rPr>
+          <w:rFonts w:ascii="Arial" w:eastAsia="Calibri" w:hAnsi="Arial" w:cs="Arial"/>
+          <w:b/>
+          <w:color w:val="000000"/>
+          <w:sz w:val="22"/>
+          <w:szCs w:val="22"/>
+        </w:rPr>
+      </w:pPr>
+      <w:r>
+        <w:rPr>
+          <w:rFonts w:ascii="Arial" w:eastAsia="Calibri" w:hAnsi="Arial" w:cs="Arial"/>
+          <w:b/>
+          <w:color w:val="000000"/>
+          <w:sz w:val="22"/>
+          <w:szCs w:val="22"/>
+        </w:rPr>
+        <w:t>EDUCATION</w:t>
+      </w:r>
+    </w:p>
+    <w:p>
+      <w:pPr>
+        <w:pBdr>
+          <w:top w:val="nil"/>
+          <w:left w:val="nil"/>
+          <w:bottom w:val="nil"/>
+          <w:right w:val="nil"/>
+          <w:between w:val="nil"/>
+        </w:pBdr>
+        <w:tabs>
+          <w:tab w:val="right" w:pos="11340"/>
+        </w:tabs>
+        <w:spacing w:before="120"/>
+        <w:rPr>
+          <w:rFonts w:ascii="Arial" w:eastAsia="Calibri" w:hAnsi="Arial" w:cs="Arial"/>
+          <w:b/>
+          <w:color w:val="000000"/>
+          <w:sz w:val="20"/>
+          <w:szCs w:val="20"/>
+        </w:rPr>
+      </w:pPr>
+      <w:r>
+        <w:rPr>
+          <w:rFonts w:ascii="Arial" w:eastAsia="Calibri" w:hAnsi="Arial" w:cs="Arial"/>
+          <w:b/>
+          <w:color w:val="000000"/>
+          <w:sz w:val="20"/>
+          <w:szCs w:val="20"/>
+        </w:rPr>
+        <w:t>Master of Informatics</w:t>
+      </w:r>
+      <w:r>
+        <w:rPr>
+          <w:rFonts w:ascii="Arial" w:eastAsia="Calibri" w:hAnsi="Arial" w:cs="Arial"/>
+          <w:b/>
+          <w:color w:val="000000"/>
+          <w:sz w:val="20"/>
+          <w:szCs w:val="20"/>
+        </w:rPr>
+        <w:t xml:space="preserve"> (MInf, CEng, CITP, CSci) /</w:t>
+      </w:r>
+      <w:r>
+        <w:rPr>
+          <w:rFonts w:ascii="Arial" w:eastAsia="Calibri" w:hAnsi="Arial" w:cs="Arial"/>
+          <w:b/>
+          <w:color w:val="000000"/>
+          <w:sz w:val="20"/>
+          <w:szCs w:val="20"/>
+        </w:rPr>
+        <w:t xml:space="preserve"> </w:t>
+      </w:r>
+      <w:r>
+        <w:rPr>
+          <w:rFonts w:ascii="Arial" w:eastAsia="Calibri" w:hAnsi="Arial" w:cs="Arial"/>
+          <w:b/>
+          <w:color w:val="000000"/>
+          <w:sz w:val="20"/>
+          <w:szCs w:val="20"/>
+        </w:rPr>
+        <w:t>University of Edinburg</w:t>
+      </w:r>
+      <w:r>
+        <w:rPr>
+          <w:rFonts w:ascii="Arial" w:eastAsia="Calibri" w:hAnsi="Arial" w:cs="Arial"/>
+          <w:b/>
+          <w:color w:val="000000"/>
+          <w:sz w:val="20"/>
+          <w:szCs w:val="20"/>
+        </w:rPr>
+        <w:t>h</w:t>
+      </w:r>
+      <w:r>
+        <w:rPr>
+          <w:rFonts w:ascii="Arial" w:eastAsia="Calibri" w:hAnsi="Arial" w:cs="Arial"/>
+          <w:bCs/>
+          <w:color w:val="000000"/>
+          <w:sz w:val="20"/>
+          <w:szCs w:val="20"/>
+        </w:rPr>
+        <w:tab/>
+      </w:r>
+      <w:r>
+        <w:rPr>
+          <w:rFonts w:ascii="Arial" w:eastAsia="Calibri" w:hAnsi="Arial" w:cs="Arial"/>
+          <w:bCs/>
+          <w:color w:val="000000"/>
+          <w:sz w:val="20"/>
+          <w:szCs w:val="20"/>
+        </w:rPr>
+        <w:t>20</w:t>
+      </w:r>
+      <w:r>
+        <w:rPr>
+          <w:rFonts w:ascii="Arial" w:eastAsia="Calibri" w:hAnsi="Arial" w:cs="Arial"/>
+          <w:bCs/>
+          <w:color w:val="000000"/>
+          <w:sz w:val="20"/>
+          <w:szCs w:val="20"/>
+        </w:rPr>
+        <w:t>13-2018</w:t>
+      </w:r>
+    </w:p>
+    <w:p>
+      <w:pPr>
+        <w:pStyle w:val="ListParagraph"/>
+        <w:numPr>
+          <w:ilvl w:val="0"/>
+          <w:numId w:val="6"/>
+        </w:numPr>
+        <w:pBdr>
+          <w:top w:val="nil"/>
+          <w:left w:val="nil"/>
+          <w:bottom w:val="nil"/>
+          <w:right w:val="nil"/>
+          <w:between w:val="nil"/>
+        </w:pBdr>
+        <w:rPr>
+          <w:rFonts w:ascii="Arial" w:eastAsia="Calibri" w:hAnsi="Arial" w:cs="Arial"/>
+          <w:bCs/>
+          <w:color w:val="000000"/>
+          <w:sz w:val="20"/>
+          <w:szCs w:val="20"/>
+        </w:rPr>
+      </w:pPr>
+      <w:r>
+        <w:rPr>
+          <w:rFonts w:ascii="Arial" w:eastAsia="Calibri" w:hAnsi="Arial" w:cs="Arial"/>
+          <w:bCs/>
+          <w:color w:val="000000"/>
+          <w:sz w:val="20"/>
+          <w:szCs w:val="20"/>
+        </w:rPr>
+        <w:t xml:space="preserve">Graduated with </w:t>
+      </w:r>
+      <w:r>
+        <w:rPr>
+          <w:rFonts w:ascii="Arial" w:eastAsia="Calibri" w:hAnsi="Arial" w:cs="Arial"/>
+          <w:bCs/>
+          <w:color w:val="000000"/>
+          <w:sz w:val="20"/>
+          <w:szCs w:val="20"/>
+        </w:rPr>
+        <w:t>First Class Honours</w:t>
+      </w:r>
+      <w:r>
+        <w:rPr>
+          <w:rFonts w:ascii="Arial" w:eastAsia="Calibri" w:hAnsi="Arial" w:cs="Arial"/>
+          <w:bCs/>
+          <w:color w:val="000000"/>
+          <w:sz w:val="20"/>
+          <w:szCs w:val="20"/>
+        </w:rPr>
+        <w:t xml:space="preserve">, achieving </w:t>
+      </w:r>
+      <w:r>
+        <w:rPr>
+          <w:rFonts w:ascii="Arial" w:eastAsia="Calibri" w:hAnsi="Arial" w:cs="Arial"/>
+          <w:color w:val="000000"/>
+          <w:sz w:val="20"/>
+          <w:szCs w:val="20"/>
+        </w:rPr>
+        <w:t>83%-</w:t>
+      </w:r>
+      <w:r>
+        <w:rPr>
+          <w:rFonts w:ascii="Arial" w:eastAsia="Calibri" w:hAnsi="Arial" w:cs="Arial"/>
+          <w:color w:val="000000"/>
+          <w:sz w:val="20"/>
+          <w:szCs w:val="20"/>
+        </w:rPr>
+        <w:t>100</w:t>
+      </w:r>
+      <w:r>
+        <w:rPr>
+          <w:rFonts w:ascii="Arial" w:eastAsia="Calibri" w:hAnsi="Arial" w:cs="Arial"/>
+          <w:color w:val="000000"/>
+          <w:sz w:val="20"/>
+          <w:szCs w:val="20"/>
+        </w:rPr>
+        <w:t xml:space="preserve">% in all </w:t>
+      </w:r>
+      <w:r>
+        <w:rPr>
+          <w:rFonts w:ascii="Arial" w:eastAsia="Calibri" w:hAnsi="Arial" w:cs="Arial"/>
+          <w:color w:val="000000"/>
+          <w:sz w:val="20"/>
+          <w:szCs w:val="20"/>
+        </w:rPr>
+        <w:t>10</w:t>
+      </w:r>
+      <w:r>
+        <w:rPr>
+          <w:rFonts w:ascii="Arial" w:eastAsia="Calibri" w:hAnsi="Arial" w:cs="Arial"/>
+          <w:color w:val="000000"/>
+          <w:sz w:val="20"/>
+          <w:szCs w:val="20"/>
+        </w:rPr>
+        <w:t xml:space="preserve"> </w:t>
+      </w:r>
+      <w:r>
+        <w:rPr>
+          <w:rFonts w:ascii="Arial" w:eastAsia="Calibri" w:hAnsi="Arial" w:cs="Arial"/>
+          <w:color w:val="000000"/>
+          <w:sz w:val="20"/>
+          <w:szCs w:val="20"/>
+        </w:rPr>
+        <w:t>software engineering courses.</w:t>
+      </w:r>
+    </w:p>
+    <w:p>
+      <w:pPr>
+        <w:pStyle w:val="ListParagraph"/>
+        <w:numPr>
+          <w:ilvl w:val="0"/>
+          <w:numId w:val="3"/>
+        </w:numPr>
+        <w:pBdr>
+          <w:top w:val="nil"/>
+          <w:left w:val="nil"/>
+          <w:bottom w:val="nil"/>
+          <w:right w:val="nil"/>
+          <w:between w:val="nil"/>
+        </w:pBdr>
+        <w:rPr>
+          <w:rFonts w:ascii="Arial" w:eastAsia="Calibri" w:hAnsi="Arial" w:cs="Arial"/>
+          <w:bCs/>
+          <w:color w:val="000000"/>
+          <w:sz w:val="20"/>
+          <w:szCs w:val="20"/>
+        </w:rPr>
+      </w:pPr>
+      <w:r>
+        <w:rPr>
+          <w:rFonts w:ascii="Arial" w:eastAsia="Calibri" w:hAnsi="Arial" w:cs="Arial"/>
+          <w:color w:val="000000"/>
+          <w:sz w:val="20"/>
+          <w:szCs w:val="20"/>
+        </w:rPr>
+        <w:t xml:space="preserve">Awarded </w:t>
+      </w:r>
+      <w:r>
+        <w:rPr>
+          <w:rFonts w:ascii="Arial" w:eastAsia="Calibri" w:hAnsi="Arial" w:cs="Arial"/>
+          <w:color w:val="000000"/>
+          <w:sz w:val="20"/>
+          <w:szCs w:val="20"/>
+        </w:rPr>
+        <w:t>British Computer Society</w:t>
+      </w:r>
+      <w:r>
+        <w:rPr>
+          <w:rFonts w:ascii="Arial" w:eastAsia="Calibri" w:hAnsi="Arial" w:cs="Arial"/>
+          <w:color w:val="000000"/>
+          <w:sz w:val="20"/>
+          <w:szCs w:val="20"/>
+        </w:rPr>
+        <w:t xml:space="preserve"> (BCS)</w:t>
+      </w:r>
+      <w:r>
+        <w:rPr>
+          <w:rFonts w:ascii="Arial" w:eastAsia="Calibri" w:hAnsi="Arial" w:cs="Arial"/>
+          <w:color w:val="000000"/>
+          <w:sz w:val="20"/>
+          <w:szCs w:val="20"/>
+        </w:rPr>
+        <w:t xml:space="preserve"> Prize for </w:t>
+      </w:r>
+      <w:r>
+        <w:rPr>
+          <w:rFonts w:ascii="Arial" w:eastAsia="Calibri" w:hAnsi="Arial" w:cs="Arial"/>
+          <w:color w:val="000000"/>
+          <w:sz w:val="20"/>
+          <w:szCs w:val="20"/>
+        </w:rPr>
+        <w:t xml:space="preserve">Top Performance in </w:t>
+      </w:r>
+      <w:r>
+        <w:rPr>
+          <w:rFonts w:ascii="Arial" w:eastAsia="Calibri" w:hAnsi="Arial" w:cs="Arial"/>
+          <w:color w:val="000000"/>
+          <w:sz w:val="20"/>
+          <w:szCs w:val="20"/>
+        </w:rPr>
+        <w:t>Professional Issues</w:t>
+      </w:r>
+      <w:r>
+        <w:rPr>
+          <w:rFonts w:ascii="Arial" w:eastAsia="Calibri" w:hAnsi="Arial" w:cs="Arial"/>
+          <w:color w:val="000000"/>
+          <w:sz w:val="20"/>
+          <w:szCs w:val="20"/>
+        </w:rPr>
+        <w:t xml:space="preserve"> (99%).</w:t>
+      </w:r>
+    </w:p>
+    <w:p>
+      <w:pPr>
+        <w:pBdr>
+          <w:top w:val="nil"/>
+          <w:left w:val="nil"/>
+          <w:bottom w:val="single" w:sz="4" w:space="1" w:color="000000"/>
+          <w:right w:val="nil"/>
+          <w:between w:val="nil"/>
+        </w:pBdr>
+        <w:rPr>
+          <w:rFonts w:ascii="Arial" w:eastAsia="Calibri" w:hAnsi="Arial" w:cs="Arial"/>
+          <w:b/>
+          <w:smallCaps/>
+          <w:color w:val="000000"/>
+          <w:sz w:val="20"/>
+          <w:szCs w:val="20"/>
+        </w:rPr>
+      </w:pPr>
+    </w:p>
+    <w:p>
+      <w:pPr>
+        <w:pBdr>
+          <w:top w:val="nil"/>
+          <w:left w:val="nil"/>
+          <w:bottom w:val="nil"/>
+          <w:right w:val="nil"/>
+          <w:between w:val="nil"/>
+        </w:pBdr>
+        <w:spacing w:before="120"/>
+        <w:rPr>
+          <w:rFonts w:ascii="Arial" w:eastAsia="Calibri" w:hAnsi="Arial" w:cs="Arial"/>
+          <w:b/>
+          <w:color w:val="000000"/>
+          <w:sz w:val="22"/>
+          <w:szCs w:val="22"/>
+        </w:rPr>
+      </w:pPr>
+      <w:r>
+        <w:rPr>
+          <w:rFonts w:ascii="Arial" w:eastAsia="Calibri" w:hAnsi="Arial" w:cs="Arial"/>
+          <w:b/>
+          <w:color w:val="000000"/>
+          <w:sz w:val="22"/>
+          <w:szCs w:val="22"/>
+        </w:rPr>
+        <w:t>PROJECTS</w:t>
+      </w:r>
+    </w:p>
+    <w:p>
+      <w:pPr>
+        <w:pBdr>
+          <w:top w:val="nil"/>
+          <w:left w:val="nil"/>
+          <w:bottom w:val="nil"/>
+          <w:right w:val="nil"/>
+          <w:between w:val="nil"/>
+        </w:pBdr>
+        <w:spacing w:before="120"/>
+        <w:rPr>
+          <w:rFonts w:ascii="Arial" w:eastAsia="Calibri" w:hAnsi="Arial" w:cs="Arial"/>
+          <w:b/>
+          <w:color w:val="000000"/>
+          <w:sz w:val="20"/>
+          <w:szCs w:val="20"/>
+        </w:rPr>
+      </w:pPr>
+      <w:r>
+        <w:rPr>
+          <w:rFonts w:ascii="Arial" w:eastAsia="Calibri" w:hAnsi="Arial" w:cs="Arial"/>
+          <w:b/>
+          <w:color w:val="000000"/>
+          <w:sz w:val="20"/>
+          <w:szCs w:val="20"/>
+        </w:rPr>
+        <w:t xml:space="preserve">My Mona Lisa: A </w:t>
+      </w:r>
+      <w:r>
+        <w:rPr>
+          <w:rFonts w:ascii="Arial" w:eastAsia="Calibri" w:hAnsi="Arial" w:cs="Arial"/>
+          <w:b/>
+          <w:color w:val="000000"/>
+          <w:sz w:val="20"/>
+          <w:szCs w:val="20"/>
+        </w:rPr>
+        <w:t>P</w:t>
+      </w:r>
+      <w:r>
+        <w:rPr>
+          <w:rFonts w:ascii="Arial" w:eastAsia="Calibri" w:hAnsi="Arial" w:cs="Arial"/>
+          <w:b/>
+          <w:color w:val="000000"/>
+          <w:sz w:val="20"/>
+          <w:szCs w:val="20"/>
+        </w:rPr>
+        <w:t xml:space="preserve">ersonal </w:t>
+      </w:r>
+      <w:r>
+        <w:rPr>
+          <w:rFonts w:ascii="Arial" w:eastAsia="Calibri" w:hAnsi="Arial" w:cs="Arial"/>
+          <w:b/>
+          <w:color w:val="000000"/>
+          <w:sz w:val="20"/>
+          <w:szCs w:val="20"/>
+        </w:rPr>
+        <w:t>W</w:t>
+      </w:r>
+      <w:r>
+        <w:rPr>
+          <w:rFonts w:ascii="Arial" w:eastAsia="Calibri" w:hAnsi="Arial" w:cs="Arial"/>
+          <w:b/>
+          <w:color w:val="000000"/>
+          <w:sz w:val="20"/>
+          <w:szCs w:val="20"/>
+        </w:rPr>
+        <w:t>ebsite</w:t>
+      </w:r>
+      <w:r>
+        <w:rPr>
+          <w:rFonts w:ascii="Arial" w:eastAsia="Calibri" w:hAnsi="Arial" w:cs="Arial"/>
+          <w:b/>
+          <w:color w:val="000000"/>
+          <w:sz w:val="20"/>
+          <w:szCs w:val="20"/>
+        </w:rPr>
+        <w:t xml:space="preserve"> / </w:t>
+      </w:r>
+      <w:hyperlink r:id="rId12" w:history="1">
+        <w:r>
+          <w:rPr>
+            <w:rStyle w:val="Hyperlink"/>
+            <w:rFonts w:ascii="Arial" w:eastAsia="Calibri" w:hAnsi="Arial" w:cs="Arial"/>
+            <w:b/>
+            <w:sz w:val="20"/>
+            <w:szCs w:val="20"/>
+          </w:rPr>
+          <w:t>https://rmsy.me/projects/website/</w:t>
+        </w:r>
+      </w:hyperlink>
+      <w:r>
+        <w:rPr>
+          <w:rFonts w:ascii="Arial" w:eastAsia="Calibri" w:hAnsi="Arial" w:cs="Arial"/>
+          <w:b/>
+          <w:color w:val="000000"/>
+          <w:sz w:val="20"/>
+          <w:szCs w:val="20"/>
+        </w:rPr>
+        <w:t xml:space="preserve"> </w:t>
+      </w:r>
+    </w:p>
+    <w:p>
+      <w:pPr>
+        <w:pStyle w:val="ListParagraph"/>
+        <w:numPr>
+          <w:ilvl w:val="0"/>
+          <w:numId w:val="2"/>
+        </w:numPr>
+        <w:pBdr>
+          <w:top w:val="nil"/>
+          <w:left w:val="nil"/>
+          <w:bottom w:val="nil"/>
+          <w:right w:val="nil"/>
+          <w:between w:val="nil"/>
+        </w:pBdr>
+        <w:rPr>
+          <w:rFonts w:ascii="Arial" w:eastAsia="Calibri" w:hAnsi="Arial" w:cs="Arial"/>
+          <w:color w:val="000000"/>
+          <w:sz w:val="20"/>
+          <w:szCs w:val="20"/>
+        </w:rPr>
+      </w:pPr>
+      <w:r>
+        <w:rPr>
+          <w:rFonts w:ascii="Arial" w:eastAsia="Calibri" w:hAnsi="Arial" w:cs="Arial"/>
+          <w:color w:val="000000"/>
+          <w:sz w:val="20"/>
+          <w:szCs w:val="20"/>
+        </w:rPr>
+        <w:t>D</w:t>
+      </w:r>
+      <w:r>
+        <w:rPr>
+          <w:rFonts w:ascii="Arial" w:eastAsia="Calibri" w:hAnsi="Arial" w:cs="Arial"/>
+          <w:color w:val="000000"/>
+          <w:sz w:val="20"/>
+          <w:szCs w:val="20"/>
+        </w:rPr>
+        <w:t xml:space="preserve">esigned </w:t>
+      </w:r>
+      <w:r>
+        <w:rPr>
+          <w:rFonts w:ascii="Arial" w:eastAsia="Calibri" w:hAnsi="Arial" w:cs="Arial"/>
+          <w:color w:val="000000"/>
+          <w:sz w:val="20"/>
+          <w:szCs w:val="20"/>
+        </w:rPr>
+        <w:t xml:space="preserve">responsive </w:t>
+      </w:r>
+      <w:r>
+        <w:rPr>
+          <w:rFonts w:ascii="Arial" w:eastAsia="Calibri" w:hAnsi="Arial" w:cs="Arial"/>
+          <w:color w:val="000000"/>
+          <w:sz w:val="20"/>
+          <w:szCs w:val="20"/>
+        </w:rPr>
+        <w:t xml:space="preserve">front-end </w:t>
+      </w:r>
+      <w:r>
+        <w:rPr>
+          <w:rFonts w:ascii="Arial" w:eastAsia="Calibri" w:hAnsi="Arial" w:cs="Arial"/>
+          <w:color w:val="000000"/>
+          <w:sz w:val="20"/>
+          <w:szCs w:val="20"/>
+        </w:rPr>
+        <w:t>HTML/CSS templates</w:t>
+      </w:r>
+      <w:r>
+        <w:rPr>
+          <w:rFonts w:ascii="Arial" w:eastAsia="Calibri" w:hAnsi="Arial" w:cs="Arial"/>
+          <w:color w:val="000000"/>
+          <w:sz w:val="20"/>
+          <w:szCs w:val="20"/>
+        </w:rPr>
+        <w:t xml:space="preserve"> with Bootstrap.</w:t>
+      </w:r>
+    </w:p>
+    <w:p>
+      <w:pPr>
+        <w:pStyle w:val="ListParagraph"/>
+        <w:numPr>
+          <w:ilvl w:val="0"/>
+          <w:numId w:val="2"/>
+        </w:numPr>
+        <w:pBdr>
+          <w:top w:val="nil"/>
+          <w:left w:val="nil"/>
+          <w:bottom w:val="nil"/>
+          <w:right w:val="nil"/>
+          <w:between w:val="nil"/>
+        </w:pBdr>
+        <w:rPr>
+          <w:rFonts w:ascii="Arial" w:eastAsia="Calibri" w:hAnsi="Arial" w:cs="Arial"/>
+          <w:color w:val="000000"/>
+          <w:sz w:val="20"/>
+          <w:szCs w:val="20"/>
+        </w:rPr>
+      </w:pPr>
+      <w:r>
+        <w:rPr>
+          <w:rFonts w:ascii="Arial" w:eastAsia="Calibri" w:hAnsi="Arial" w:cs="Arial"/>
+          <w:color w:val="000000"/>
+          <w:sz w:val="20"/>
+          <w:szCs w:val="20"/>
+        </w:rPr>
+        <w:t>B</w:t>
+      </w:r>
+      <w:r>
+        <w:rPr>
+          <w:rFonts w:ascii="Arial" w:eastAsia="Calibri" w:hAnsi="Arial" w:cs="Arial"/>
+          <w:color w:val="000000"/>
+          <w:sz w:val="20"/>
+          <w:szCs w:val="20"/>
+        </w:rPr>
+        <w:t xml:space="preserve">uilt reusable </w:t>
+      </w:r>
+      <w:r>
+        <w:rPr>
+          <w:rFonts w:ascii="Arial" w:eastAsia="Calibri" w:hAnsi="Arial" w:cs="Arial"/>
+          <w:color w:val="000000"/>
+          <w:sz w:val="20"/>
+          <w:szCs w:val="20"/>
+        </w:rPr>
+        <w:t xml:space="preserve">back-end </w:t>
+      </w:r>
+      <w:r>
+        <w:rPr>
+          <w:rFonts w:ascii="Arial" w:eastAsia="Calibri" w:hAnsi="Arial" w:cs="Arial"/>
+          <w:color w:val="000000"/>
+          <w:sz w:val="20"/>
+          <w:szCs w:val="20"/>
+        </w:rPr>
+        <w:t>PHP framework</w:t>
+      </w:r>
+      <w:r>
+        <w:rPr>
+          <w:rFonts w:ascii="Arial" w:eastAsia="Calibri" w:hAnsi="Arial" w:cs="Arial"/>
+          <w:color w:val="000000"/>
+          <w:sz w:val="20"/>
+          <w:szCs w:val="20"/>
+        </w:rPr>
+        <w:t xml:space="preserve"> from scratch</w:t>
       </w:r>
       <w:r>
         <w:rPr>
@@ -3423,6 +2275,862 @@
           <w:szCs w:val="20"/>
         </w:rPr>
         <w:t>.</w:t>
+      </w:r>
+    </w:p>
+    <w:p>
+      <w:pPr>
+        <w:pStyle w:val="ListParagraph"/>
+        <w:numPr>
+          <w:ilvl w:val="0"/>
+          <w:numId w:val="2"/>
+        </w:numPr>
+        <w:pBdr>
+          <w:top w:val="nil"/>
+          <w:left w:val="nil"/>
+          <w:bottom w:val="nil"/>
+          <w:right w:val="nil"/>
+          <w:between w:val="nil"/>
+        </w:pBdr>
+        <w:rPr>
+          <w:rFonts w:ascii="Arial" w:eastAsia="Calibri" w:hAnsi="Arial" w:cs="Arial"/>
+          <w:color w:val="000000"/>
+          <w:sz w:val="20"/>
+          <w:szCs w:val="20"/>
+        </w:rPr>
+      </w:pPr>
+      <w:r>
+        <w:rPr>
+          <w:rFonts w:ascii="Arial" w:eastAsia="Calibri" w:hAnsi="Arial" w:cs="Arial"/>
+          <w:color w:val="000000"/>
+          <w:sz w:val="20"/>
+          <w:szCs w:val="20"/>
+        </w:rPr>
+        <w:t>C</w:t>
+      </w:r>
+      <w:r>
+        <w:rPr>
+          <w:rFonts w:ascii="Arial" w:eastAsia="Calibri" w:hAnsi="Arial" w:cs="Arial"/>
+          <w:color w:val="000000"/>
+          <w:sz w:val="20"/>
+          <w:szCs w:val="20"/>
+        </w:rPr>
+        <w:t>ontaineri</w:t>
+      </w:r>
+      <w:r>
+        <w:rPr>
+          <w:rFonts w:ascii="Arial" w:eastAsia="Calibri" w:hAnsi="Arial" w:cs="Arial"/>
+          <w:color w:val="000000"/>
+          <w:sz w:val="20"/>
+          <w:szCs w:val="20"/>
+        </w:rPr>
+        <w:t>s</w:t>
+      </w:r>
+      <w:r>
+        <w:rPr>
+          <w:rFonts w:ascii="Arial" w:eastAsia="Calibri" w:hAnsi="Arial" w:cs="Arial"/>
+          <w:color w:val="000000"/>
+          <w:sz w:val="20"/>
+          <w:szCs w:val="20"/>
+        </w:rPr>
+        <w:t>ed</w:t>
+      </w:r>
+      <w:r>
+        <w:rPr>
+          <w:rFonts w:ascii="Arial" w:eastAsia="Calibri" w:hAnsi="Arial" w:cs="Arial"/>
+          <w:color w:val="000000"/>
+          <w:sz w:val="20"/>
+          <w:szCs w:val="20"/>
+        </w:rPr>
+        <w:t xml:space="preserve"> application </w:t>
+      </w:r>
+      <w:r>
+        <w:rPr>
+          <w:rFonts w:ascii="Arial" w:eastAsia="Calibri" w:hAnsi="Arial" w:cs="Arial"/>
+          <w:color w:val="000000"/>
+          <w:sz w:val="20"/>
+          <w:szCs w:val="20"/>
+        </w:rPr>
+        <w:t xml:space="preserve">using Docker, built </w:t>
+      </w:r>
+      <w:r>
+        <w:rPr>
+          <w:rFonts w:ascii="Arial" w:eastAsia="Calibri" w:hAnsi="Arial" w:cs="Arial"/>
+          <w:color w:val="000000"/>
+          <w:sz w:val="20"/>
+          <w:szCs w:val="20"/>
+        </w:rPr>
+        <w:t>a</w:t>
+      </w:r>
+      <w:r>
+        <w:rPr>
+          <w:rFonts w:ascii="Arial" w:eastAsia="Calibri" w:hAnsi="Arial" w:cs="Arial"/>
+          <w:color w:val="000000"/>
+          <w:sz w:val="20"/>
+          <w:szCs w:val="20"/>
+        </w:rPr>
+        <w:t xml:space="preserve">utomated </w:t>
+      </w:r>
+      <w:r>
+        <w:rPr>
+          <w:rFonts w:ascii="Arial" w:eastAsia="Calibri" w:hAnsi="Arial" w:cs="Arial"/>
+          <w:color w:val="000000"/>
+          <w:sz w:val="20"/>
+          <w:szCs w:val="20"/>
+        </w:rPr>
+        <w:t xml:space="preserve">DevOps </w:t>
+      </w:r>
+      <w:r>
+        <w:rPr>
+          <w:rFonts w:ascii="Arial" w:eastAsia="Calibri" w:hAnsi="Arial" w:cs="Arial"/>
+          <w:color w:val="000000"/>
+          <w:sz w:val="20"/>
+          <w:szCs w:val="20"/>
+        </w:rPr>
+        <w:t xml:space="preserve">pipeline </w:t>
+      </w:r>
+      <w:r>
+        <w:rPr>
+          <w:rFonts w:ascii="Arial" w:eastAsia="Calibri" w:hAnsi="Arial" w:cs="Arial"/>
+          <w:color w:val="000000"/>
+          <w:sz w:val="20"/>
+          <w:szCs w:val="20"/>
+        </w:rPr>
+        <w:t>using</w:t>
+      </w:r>
+      <w:r>
+        <w:rPr>
+          <w:rFonts w:ascii="Arial" w:eastAsia="Calibri" w:hAnsi="Arial" w:cs="Arial"/>
+          <w:color w:val="000000"/>
+          <w:sz w:val="20"/>
+          <w:szCs w:val="20"/>
+        </w:rPr>
+        <w:t xml:space="preserve"> Bash scripts</w:t>
+      </w:r>
+      <w:r>
+        <w:rPr>
+          <w:rFonts w:ascii="Arial" w:eastAsia="Calibri" w:hAnsi="Arial" w:cs="Arial"/>
+          <w:color w:val="000000"/>
+          <w:sz w:val="20"/>
+          <w:szCs w:val="20"/>
+        </w:rPr>
+        <w:t xml:space="preserve"> and Git hooks;</w:t>
+      </w:r>
+      <w:r>
+        <w:rPr>
+          <w:rFonts w:ascii="Arial" w:eastAsia="Calibri" w:hAnsi="Arial" w:cs="Arial"/>
+          <w:color w:val="000000"/>
+          <w:sz w:val="20"/>
+          <w:szCs w:val="20"/>
+        </w:rPr>
+        <w:t xml:space="preserve"> </w:t>
+      </w:r>
+      <w:r>
+        <w:rPr>
+          <w:rFonts w:ascii="Arial" w:eastAsia="Calibri" w:hAnsi="Arial" w:cs="Arial"/>
+          <w:color w:val="000000"/>
+          <w:sz w:val="20"/>
+          <w:szCs w:val="20"/>
+        </w:rPr>
+        <w:t>c</w:t>
+      </w:r>
+      <w:r>
+        <w:rPr>
+          <w:rFonts w:ascii="Arial" w:eastAsia="Calibri" w:hAnsi="Arial" w:cs="Arial"/>
+          <w:color w:val="000000"/>
+          <w:sz w:val="20"/>
+          <w:szCs w:val="20"/>
+        </w:rPr>
+        <w:t xml:space="preserve">onfigured AWS EC2 instance and Apache </w:t>
+      </w:r>
+      <w:r>
+        <w:rPr>
+          <w:rFonts w:ascii="Arial" w:eastAsia="Calibri" w:hAnsi="Arial" w:cs="Arial"/>
+          <w:color w:val="000000"/>
+          <w:sz w:val="20"/>
+          <w:szCs w:val="20"/>
+        </w:rPr>
+        <w:t xml:space="preserve">HTTP </w:t>
+      </w:r>
+      <w:r>
+        <w:rPr>
+          <w:rFonts w:ascii="Arial" w:eastAsia="Calibri" w:hAnsi="Arial" w:cs="Arial"/>
+          <w:color w:val="000000"/>
+          <w:sz w:val="20"/>
+          <w:szCs w:val="20"/>
+        </w:rPr>
+        <w:t>Server manually</w:t>
+      </w:r>
+      <w:r>
+        <w:rPr>
+          <w:rFonts w:ascii="Arial" w:eastAsia="Calibri" w:hAnsi="Arial" w:cs="Arial"/>
+          <w:color w:val="000000"/>
+          <w:sz w:val="20"/>
+          <w:szCs w:val="20"/>
+        </w:rPr>
+        <w:t>.</w:t>
+      </w:r>
+    </w:p>
+    <w:p>
+      <w:pPr>
+        <w:pBdr>
+          <w:top w:val="nil"/>
+          <w:left w:val="nil"/>
+          <w:bottom w:val="nil"/>
+          <w:right w:val="nil"/>
+          <w:between w:val="nil"/>
+        </w:pBdr>
+        <w:spacing w:before="120"/>
+        <w:rPr>
+          <w:rFonts w:ascii="Arial" w:eastAsia="Calibri" w:hAnsi="Arial" w:cs="Arial"/>
+          <w:b/>
+          <w:color w:val="000000"/>
+          <w:sz w:val="20"/>
+          <w:szCs w:val="20"/>
+        </w:rPr>
+      </w:pPr>
+      <w:r>
+        <w:rPr>
+          <w:rFonts w:ascii="Arial" w:eastAsia="Calibri" w:hAnsi="Arial" w:cs="Arial"/>
+          <w:b/>
+          <w:color w:val="000000"/>
+          <w:sz w:val="20"/>
+          <w:szCs w:val="20"/>
+        </w:rPr>
+        <w:t xml:space="preserve">Pooptimus Prime: The World's First </w:t>
+      </w:r>
+      <w:r>
+        <w:rPr>
+          <w:rFonts w:ascii="Arial" w:eastAsia="Calibri" w:hAnsi="Arial" w:cs="Arial"/>
+          <w:b/>
+          <w:color w:val="000000"/>
+          <w:sz w:val="20"/>
+          <w:szCs w:val="20"/>
+        </w:rPr>
+        <w:t>Dung Beetle Biorobot</w:t>
+      </w:r>
+      <w:r>
+        <w:rPr>
+          <w:rFonts w:ascii="Arial" w:eastAsia="Calibri" w:hAnsi="Arial" w:cs="Arial"/>
+          <w:b/>
+          <w:color w:val="000000"/>
+          <w:sz w:val="20"/>
+          <w:szCs w:val="20"/>
+        </w:rPr>
+        <w:t xml:space="preserve"> / </w:t>
+      </w:r>
+      <w:hyperlink r:id="rId13" w:history="1">
+        <w:r>
+          <w:rPr>
+            <w:rStyle w:val="Hyperlink"/>
+            <w:rFonts w:ascii="Arial" w:eastAsia="Calibri" w:hAnsi="Arial" w:cs="Arial"/>
+            <w:b/>
+            <w:sz w:val="20"/>
+            <w:szCs w:val="20"/>
+          </w:rPr>
+          <w:t>https://rmsy.me/</w:t>
+        </w:r>
+        <w:r>
+          <w:rPr>
+            <w:rStyle w:val="Hyperlink"/>
+            <w:rFonts w:ascii="Arial" w:eastAsia="Calibri" w:hAnsi="Arial" w:cs="Arial"/>
+            <w:b/>
+            <w:sz w:val="20"/>
+            <w:szCs w:val="20"/>
+          </w:rPr>
+          <w:t>projects/</w:t>
+        </w:r>
+        <w:r>
+          <w:rPr>
+            <w:rStyle w:val="Hyperlink"/>
+            <w:rFonts w:ascii="Arial" w:eastAsia="Calibri" w:hAnsi="Arial" w:cs="Arial"/>
+            <w:b/>
+            <w:sz w:val="20"/>
+            <w:szCs w:val="20"/>
+          </w:rPr>
+          <w:t>beetle/</w:t>
+        </w:r>
+      </w:hyperlink>
+    </w:p>
+    <w:p>
+      <w:pPr>
+        <w:pStyle w:val="ListParagraph"/>
+        <w:numPr>
+          <w:ilvl w:val="0"/>
+          <w:numId w:val="6"/>
+        </w:numPr>
+        <w:pBdr>
+          <w:top w:val="nil"/>
+          <w:left w:val="nil"/>
+          <w:bottom w:val="nil"/>
+          <w:right w:val="nil"/>
+          <w:between w:val="nil"/>
+        </w:pBdr>
+        <w:rPr>
+          <w:rFonts w:ascii="Arial" w:eastAsia="Calibri" w:hAnsi="Arial" w:cs="Arial"/>
+          <w:bCs/>
+          <w:color w:val="000000"/>
+          <w:sz w:val="20"/>
+          <w:szCs w:val="20"/>
+        </w:rPr>
+      </w:pPr>
+      <w:r>
+        <w:rPr>
+          <w:rFonts w:ascii="Arial" w:eastAsia="Calibri" w:hAnsi="Arial" w:cs="Arial"/>
+          <w:bCs/>
+          <w:color w:val="000000"/>
+          <w:sz w:val="20"/>
+          <w:szCs w:val="20"/>
+        </w:rPr>
+        <w:t>Pioneered creation of dung beetle biorobot</w:t>
+      </w:r>
+      <w:r>
+        <w:rPr>
+          <w:rFonts w:ascii="Arial" w:eastAsia="Calibri" w:hAnsi="Arial" w:cs="Arial"/>
+          <w:bCs/>
+          <w:color w:val="000000"/>
+          <w:sz w:val="20"/>
+          <w:szCs w:val="20"/>
+        </w:rPr>
+        <w:t>; adapt</w:t>
+      </w:r>
+      <w:r>
+        <w:rPr>
+          <w:rFonts w:ascii="Arial" w:eastAsia="Calibri" w:hAnsi="Arial" w:cs="Arial"/>
+          <w:bCs/>
+          <w:color w:val="000000"/>
+          <w:sz w:val="20"/>
+          <w:szCs w:val="20"/>
+        </w:rPr>
+        <w:t>ed</w:t>
+      </w:r>
+      <w:r>
+        <w:rPr>
+          <w:rFonts w:ascii="Arial" w:eastAsia="Calibri" w:hAnsi="Arial" w:cs="Arial"/>
+          <w:bCs/>
+          <w:color w:val="000000"/>
+          <w:sz w:val="20"/>
+          <w:szCs w:val="20"/>
+        </w:rPr>
+        <w:t xml:space="preserve"> sophisticated </w:t>
+      </w:r>
+      <w:r>
+        <w:rPr>
+          <w:rFonts w:ascii="Arial" w:eastAsia="Calibri" w:hAnsi="Arial" w:cs="Arial"/>
+          <w:bCs/>
+          <w:color w:val="000000"/>
+          <w:sz w:val="20"/>
+          <w:szCs w:val="20"/>
+        </w:rPr>
+        <w:t>neural model</w:t>
+      </w:r>
+      <w:r>
+        <w:rPr>
+          <w:rFonts w:ascii="Arial" w:eastAsia="Calibri" w:hAnsi="Arial" w:cs="Arial"/>
+          <w:bCs/>
+          <w:color w:val="000000"/>
+          <w:sz w:val="20"/>
+          <w:szCs w:val="20"/>
+        </w:rPr>
+        <w:t xml:space="preserve"> into the robot's programming</w:t>
+      </w:r>
+      <w:r>
+        <w:rPr>
+          <w:rFonts w:ascii="Arial" w:eastAsia="Calibri" w:hAnsi="Arial" w:cs="Arial"/>
+          <w:bCs/>
+          <w:color w:val="000000"/>
+          <w:sz w:val="20"/>
+          <w:szCs w:val="20"/>
+        </w:rPr>
+        <w:t>.</w:t>
+      </w:r>
+    </w:p>
+    <w:p>
+      <w:pPr>
+        <w:pStyle w:val="ListParagraph"/>
+        <w:numPr>
+          <w:ilvl w:val="0"/>
+          <w:numId w:val="6"/>
+        </w:numPr>
+        <w:pBdr>
+          <w:top w:val="nil"/>
+          <w:left w:val="nil"/>
+          <w:bottom w:val="nil"/>
+          <w:right w:val="nil"/>
+          <w:between w:val="nil"/>
+        </w:pBdr>
+        <w:rPr>
+          <w:rFonts w:ascii="Arial" w:eastAsia="Calibri" w:hAnsi="Arial" w:cs="Arial"/>
+          <w:bCs/>
+          <w:color w:val="000000"/>
+          <w:sz w:val="20"/>
+          <w:szCs w:val="20"/>
+        </w:rPr>
+      </w:pPr>
+      <w:r>
+        <w:rPr>
+          <w:rFonts w:ascii="Arial" w:eastAsia="Calibri" w:hAnsi="Arial" w:cs="Arial"/>
+          <w:bCs/>
+          <w:color w:val="000000"/>
+          <w:sz w:val="20"/>
+          <w:szCs w:val="20"/>
+        </w:rPr>
+        <w:t xml:space="preserve">Secured exclusive research grant </w:t>
+      </w:r>
+      <w:r>
+        <w:rPr>
+          <w:rFonts w:ascii="Arial" w:eastAsia="Calibri" w:hAnsi="Arial" w:cs="Arial"/>
+          <w:bCs/>
+          <w:color w:val="000000"/>
+          <w:sz w:val="20"/>
+          <w:szCs w:val="20"/>
+        </w:rPr>
+        <w:t xml:space="preserve">to travel to </w:t>
+      </w:r>
+      <w:r>
+        <w:rPr>
+          <w:rFonts w:ascii="Arial" w:eastAsia="Calibri" w:hAnsi="Arial" w:cs="Arial"/>
+          <w:bCs/>
+          <w:color w:val="000000"/>
+          <w:sz w:val="20"/>
+          <w:szCs w:val="20"/>
+        </w:rPr>
+        <w:t xml:space="preserve">South Africa to </w:t>
+      </w:r>
+      <w:r>
+        <w:rPr>
+          <w:rFonts w:ascii="Arial" w:eastAsia="Calibri" w:hAnsi="Arial" w:cs="Arial"/>
+          <w:bCs/>
+          <w:color w:val="000000"/>
+          <w:sz w:val="20"/>
+          <w:szCs w:val="20"/>
+        </w:rPr>
+        <w:t>test the robot alongside real dung beetles.</w:t>
+      </w:r>
+    </w:p>
+    <w:p>
+      <w:pPr>
+        <w:pStyle w:val="ListParagraph"/>
+        <w:numPr>
+          <w:ilvl w:val="0"/>
+          <w:numId w:val="6"/>
+        </w:numPr>
+        <w:pBdr>
+          <w:top w:val="nil"/>
+          <w:left w:val="nil"/>
+          <w:bottom w:val="nil"/>
+          <w:right w:val="nil"/>
+          <w:between w:val="nil"/>
+        </w:pBdr>
+        <w:rPr>
+          <w:rFonts w:ascii="Arial" w:eastAsia="Calibri" w:hAnsi="Arial" w:cs="Arial"/>
+          <w:bCs/>
+          <w:color w:val="000000"/>
+          <w:sz w:val="20"/>
+          <w:szCs w:val="20"/>
+        </w:rPr>
+      </w:pPr>
+      <w:r>
+        <w:rPr>
+          <w:rFonts w:ascii="Arial" w:eastAsia="Calibri" w:hAnsi="Arial" w:cs="Arial"/>
+          <w:bCs/>
+          <w:color w:val="000000"/>
+          <w:sz w:val="20"/>
+          <w:szCs w:val="20"/>
+        </w:rPr>
+        <w:t xml:space="preserve">Achieved </w:t>
+      </w:r>
+      <w:r>
+        <w:rPr>
+          <w:rFonts w:ascii="Arial" w:eastAsia="Calibri" w:hAnsi="Arial" w:cs="Arial"/>
+          <w:bCs/>
+          <w:color w:val="000000"/>
+          <w:sz w:val="20"/>
+          <w:szCs w:val="20"/>
+        </w:rPr>
+        <w:t xml:space="preserve">average </w:t>
+      </w:r>
+      <w:r>
+        <w:rPr>
+          <w:rFonts w:ascii="Arial" w:eastAsia="Calibri" w:hAnsi="Arial" w:cs="Arial"/>
+          <w:bCs/>
+          <w:color w:val="000000"/>
+          <w:sz w:val="20"/>
+          <w:szCs w:val="20"/>
+        </w:rPr>
+        <w:t>grade of 82% and acknowledged as one of the ~20 "outstanding" projects in the year.</w:t>
+      </w:r>
+    </w:p>
+    <w:p>
+      <w:pPr>
+        <w:pBdr>
+          <w:top w:val="nil"/>
+          <w:left w:val="nil"/>
+          <w:bottom w:val="nil"/>
+          <w:right w:val="nil"/>
+          <w:between w:val="nil"/>
+        </w:pBdr>
+        <w:spacing w:before="120"/>
+        <w:rPr>
+          <w:rFonts w:ascii="Arial" w:eastAsia="Calibri" w:hAnsi="Arial" w:cs="Arial"/>
+          <w:b/>
+          <w:color w:val="000000"/>
+          <w:sz w:val="20"/>
+          <w:szCs w:val="20"/>
+        </w:rPr>
+      </w:pPr>
+      <w:r>
+        <w:rPr>
+          <w:rFonts w:ascii="Arial" w:eastAsia="Calibri" w:hAnsi="Arial" w:cs="Arial"/>
+          <w:b/>
+          <w:color w:val="000000"/>
+          <w:sz w:val="20"/>
+          <w:szCs w:val="20"/>
+        </w:rPr>
+        <w:t xml:space="preserve">Robo-Messi: When Silicon Met Soccer </w:t>
+      </w:r>
+      <w:r>
+        <w:rPr>
+          <w:rFonts w:ascii="Arial" w:eastAsia="Calibri" w:hAnsi="Arial" w:cs="Arial"/>
+          <w:b/>
+          <w:color w:val="000000"/>
+          <w:sz w:val="20"/>
+          <w:szCs w:val="20"/>
+        </w:rPr>
+        <w:t>/</w:t>
+      </w:r>
+      <w:r>
+        <w:rPr>
+          <w:rFonts w:ascii="Arial" w:eastAsia="Calibri" w:hAnsi="Arial" w:cs="Arial"/>
+          <w:b/>
+          <w:color w:val="000000"/>
+          <w:sz w:val="20"/>
+          <w:szCs w:val="20"/>
+        </w:rPr>
+        <w:t xml:space="preserve"> </w:t>
+      </w:r>
+      <w:hyperlink r:id="rId14" w:history="1">
+        <w:r>
+          <w:rPr>
+            <w:rStyle w:val="Hyperlink"/>
+            <w:rFonts w:ascii="Arial" w:eastAsia="Calibri" w:hAnsi="Arial" w:cs="Arial"/>
+            <w:b/>
+            <w:sz w:val="20"/>
+            <w:szCs w:val="20"/>
+          </w:rPr>
+          <w:t>https://rmsy.me/projects/sdp/</w:t>
+        </w:r>
+      </w:hyperlink>
+      <w:r>
+        <w:rPr>
+          <w:rFonts w:ascii="Arial" w:hAnsi="Arial" w:cs="Arial"/>
+          <w:b/>
+          <w:sz w:val="20"/>
+          <w:szCs w:val="20"/>
+        </w:rPr>
+        <w:t xml:space="preserve"> </w:t>
+      </w:r>
+    </w:p>
+    <w:p>
+      <w:pPr>
+        <w:pStyle w:val="ListParagraph"/>
+        <w:numPr>
+          <w:ilvl w:val="0"/>
+          <w:numId w:val="2"/>
+        </w:numPr>
+        <w:pBdr>
+          <w:top w:val="nil"/>
+          <w:left w:val="nil"/>
+          <w:bottom w:val="nil"/>
+          <w:right w:val="nil"/>
+          <w:between w:val="nil"/>
+        </w:pBdr>
+        <w:rPr>
+          <w:rFonts w:ascii="Arial" w:eastAsia="Calibri" w:hAnsi="Arial" w:cs="Arial"/>
+          <w:color w:val="000000"/>
+          <w:sz w:val="20"/>
+          <w:szCs w:val="20"/>
+        </w:rPr>
+      </w:pPr>
+      <w:r>
+        <w:rPr>
+          <w:rFonts w:ascii="Arial" w:eastAsia="Calibri" w:hAnsi="Arial" w:cs="Arial"/>
+          <w:color w:val="000000"/>
+          <w:sz w:val="20"/>
+          <w:szCs w:val="20"/>
+        </w:rPr>
+        <w:t xml:space="preserve">Led group of </w:t>
+      </w:r>
+      <w:r>
+        <w:rPr>
+          <w:rFonts w:ascii="Arial" w:eastAsia="Calibri" w:hAnsi="Arial" w:cs="Arial"/>
+          <w:color w:val="000000"/>
+          <w:sz w:val="20"/>
+          <w:szCs w:val="20"/>
+        </w:rPr>
+        <w:t>4</w:t>
+      </w:r>
+      <w:r>
+        <w:rPr>
+          <w:rFonts w:ascii="Arial" w:eastAsia="Calibri" w:hAnsi="Arial" w:cs="Arial"/>
+          <w:color w:val="000000"/>
+          <w:sz w:val="20"/>
+          <w:szCs w:val="20"/>
+        </w:rPr>
+        <w:t xml:space="preserve"> to</w:t>
+      </w:r>
+      <w:r>
+        <w:rPr>
+          <w:rFonts w:ascii="Arial" w:eastAsia="Calibri" w:hAnsi="Arial" w:cs="Arial"/>
+          <w:color w:val="000000"/>
+          <w:sz w:val="20"/>
+          <w:szCs w:val="20"/>
+        </w:rPr>
+        <w:t xml:space="preserve"> design</w:t>
+      </w:r>
+      <w:r>
+        <w:rPr>
+          <w:rFonts w:ascii="Arial" w:eastAsia="Calibri" w:hAnsi="Arial" w:cs="Arial"/>
+          <w:color w:val="000000"/>
+          <w:sz w:val="20"/>
+          <w:szCs w:val="20"/>
+        </w:rPr>
+        <w:t xml:space="preserve"> and </w:t>
+      </w:r>
+      <w:r>
+        <w:rPr>
+          <w:rFonts w:ascii="Arial" w:eastAsia="Calibri" w:hAnsi="Arial" w:cs="Arial"/>
+          <w:color w:val="000000"/>
+          <w:sz w:val="20"/>
+          <w:szCs w:val="20"/>
+        </w:rPr>
+        <w:t xml:space="preserve">build </w:t>
+      </w:r>
+      <w:r>
+        <w:rPr>
+          <w:rFonts w:ascii="Arial" w:eastAsia="Calibri" w:hAnsi="Arial" w:cs="Arial"/>
+          <w:color w:val="000000"/>
+          <w:sz w:val="20"/>
+          <w:szCs w:val="20"/>
+        </w:rPr>
+        <w:t xml:space="preserve">a </w:t>
+      </w:r>
+      <w:r>
+        <w:rPr>
+          <w:rFonts w:ascii="Arial" w:eastAsia="Calibri" w:hAnsi="Arial" w:cs="Arial"/>
+          <w:color w:val="000000"/>
+          <w:sz w:val="20"/>
+          <w:szCs w:val="20"/>
+        </w:rPr>
+        <w:t>football-playing robot</w:t>
+      </w:r>
+      <w:r>
+        <w:rPr>
+          <w:rFonts w:ascii="Arial" w:eastAsia="Calibri" w:hAnsi="Arial" w:cs="Arial"/>
+          <w:color w:val="000000"/>
+          <w:sz w:val="20"/>
+          <w:szCs w:val="20"/>
+        </w:rPr>
+        <w:t xml:space="preserve">, winning </w:t>
+      </w:r>
+      <w:r>
+        <w:rPr>
+          <w:rFonts w:ascii="Arial" w:eastAsia="Calibri" w:hAnsi="Arial" w:cs="Arial"/>
+          <w:color w:val="000000"/>
+          <w:sz w:val="20"/>
+          <w:szCs w:val="20"/>
+        </w:rPr>
+        <w:t>2nd</w:t>
+      </w:r>
+      <w:r>
+        <w:rPr>
+          <w:rFonts w:ascii="Arial" w:eastAsia="Calibri" w:hAnsi="Arial" w:cs="Arial"/>
+          <w:color w:val="000000"/>
+          <w:sz w:val="20"/>
+          <w:szCs w:val="20"/>
+        </w:rPr>
+        <w:t xml:space="preserve"> place in annual competition</w:t>
+      </w:r>
+      <w:r>
+        <w:rPr>
+          <w:rFonts w:ascii="Arial" w:eastAsia="Calibri" w:hAnsi="Arial" w:cs="Arial"/>
+          <w:color w:val="000000"/>
+          <w:sz w:val="20"/>
+          <w:szCs w:val="20"/>
+        </w:rPr>
+        <w:t>.</w:t>
+      </w:r>
+    </w:p>
+    <w:p>
+      <w:pPr>
+        <w:pStyle w:val="ListParagraph"/>
+        <w:numPr>
+          <w:ilvl w:val="0"/>
+          <w:numId w:val="2"/>
+        </w:numPr>
+        <w:pBdr>
+          <w:top w:val="nil"/>
+          <w:left w:val="nil"/>
+          <w:bottom w:val="nil"/>
+          <w:right w:val="nil"/>
+          <w:between w:val="nil"/>
+        </w:pBdr>
+        <w:rPr>
+          <w:rFonts w:ascii="Arial" w:eastAsia="Calibri" w:hAnsi="Arial" w:cs="Arial"/>
+          <w:color w:val="000000"/>
+          <w:sz w:val="20"/>
+          <w:szCs w:val="20"/>
+        </w:rPr>
+      </w:pPr>
+      <w:r>
+        <w:rPr>
+          <w:rFonts w:ascii="Arial" w:eastAsia="Calibri" w:hAnsi="Arial" w:cs="Arial"/>
+          <w:color w:val="000000"/>
+          <w:sz w:val="20"/>
+          <w:szCs w:val="20"/>
+        </w:rPr>
+        <w:t>Earned annual prize for best presentation</w:t>
+      </w:r>
+      <w:r>
+        <w:rPr>
+          <w:rFonts w:ascii="Arial" w:eastAsia="Calibri" w:hAnsi="Arial" w:cs="Arial"/>
+          <w:color w:val="000000"/>
+          <w:sz w:val="20"/>
+          <w:szCs w:val="20"/>
+        </w:rPr>
+        <w:t xml:space="preserve"> in the year</w:t>
+      </w:r>
+      <w:r>
+        <w:rPr>
+          <w:rFonts w:ascii="Arial" w:eastAsia="Calibri" w:hAnsi="Arial" w:cs="Arial"/>
+          <w:color w:val="000000"/>
+          <w:sz w:val="20"/>
+          <w:szCs w:val="20"/>
+        </w:rPr>
+        <w:t>, largely due to my delivery</w:t>
+      </w:r>
+      <w:r>
+        <w:rPr>
+          <w:rFonts w:ascii="Arial" w:eastAsia="Calibri" w:hAnsi="Arial" w:cs="Arial"/>
+          <w:color w:val="000000"/>
+          <w:sz w:val="20"/>
+          <w:szCs w:val="20"/>
+        </w:rPr>
+        <w:t xml:space="preserve"> of the technical presentation</w:t>
+      </w:r>
+      <w:r>
+        <w:rPr>
+          <w:rFonts w:ascii="Arial" w:eastAsia="Calibri" w:hAnsi="Arial" w:cs="Arial"/>
+          <w:color w:val="000000"/>
+          <w:sz w:val="20"/>
+          <w:szCs w:val="20"/>
+        </w:rPr>
+        <w:t>.</w:t>
+      </w:r>
+    </w:p>
+    <w:p>
+      <w:pPr>
+        <w:pStyle w:val="ListParagraph"/>
+        <w:numPr>
+          <w:ilvl w:val="0"/>
+          <w:numId w:val="2"/>
+        </w:numPr>
+        <w:pBdr>
+          <w:top w:val="nil"/>
+          <w:left w:val="nil"/>
+          <w:bottom w:val="nil"/>
+          <w:right w:val="nil"/>
+          <w:between w:val="nil"/>
+        </w:pBdr>
+        <w:rPr>
+          <w:rFonts w:ascii="Arial" w:eastAsia="Calibri" w:hAnsi="Arial" w:cs="Arial"/>
+          <w:color w:val="000000"/>
+          <w:sz w:val="20"/>
+          <w:szCs w:val="20"/>
+        </w:rPr>
+      </w:pPr>
+      <w:r>
+        <w:rPr>
+          <w:rFonts w:ascii="Arial" w:eastAsia="Calibri" w:hAnsi="Arial" w:cs="Arial"/>
+          <w:color w:val="000000"/>
+          <w:sz w:val="20"/>
+          <w:szCs w:val="20"/>
+        </w:rPr>
+        <w:t>Achieved</w:t>
+      </w:r>
+      <w:r>
+        <w:rPr>
+          <w:rFonts w:ascii="Arial" w:eastAsia="Calibri" w:hAnsi="Arial" w:cs="Arial"/>
+          <w:color w:val="000000"/>
+          <w:sz w:val="20"/>
+          <w:szCs w:val="20"/>
+        </w:rPr>
+        <w:t xml:space="preserve"> grade of 88% weighted based on my significant contributions and leadership</w:t>
+      </w:r>
+      <w:r>
+        <w:rPr>
+          <w:rFonts w:ascii="Arial" w:eastAsia="Calibri" w:hAnsi="Arial" w:cs="Arial"/>
+          <w:color w:val="000000"/>
+          <w:sz w:val="20"/>
+          <w:szCs w:val="20"/>
+        </w:rPr>
+        <w:t xml:space="preserve"> in the group project</w:t>
+      </w:r>
+      <w:r>
+        <w:rPr>
+          <w:rFonts w:ascii="Arial" w:eastAsia="Calibri" w:hAnsi="Arial" w:cs="Arial"/>
+          <w:color w:val="000000"/>
+          <w:sz w:val="20"/>
+          <w:szCs w:val="20"/>
+        </w:rPr>
+        <w:t>.</w:t>
+      </w:r>
+    </w:p>
+    <w:p>
+      <w:pPr>
+        <w:pBdr>
+          <w:top w:val="nil"/>
+          <w:left w:val="nil"/>
+          <w:bottom w:val="single" w:sz="4" w:space="1" w:color="000000"/>
+          <w:right w:val="nil"/>
+          <w:between w:val="nil"/>
+        </w:pBdr>
+        <w:rPr>
+          <w:rFonts w:ascii="Arial" w:eastAsia="Calibri" w:hAnsi="Arial" w:cs="Arial"/>
+          <w:b/>
+          <w:smallCaps/>
+          <w:color w:val="000000"/>
+          <w:sz w:val="20"/>
+          <w:szCs w:val="20"/>
+        </w:rPr>
+      </w:pPr>
+    </w:p>
+    <w:p>
+      <w:pPr>
+        <w:pBdr>
+          <w:top w:val="nil"/>
+          <w:left w:val="nil"/>
+          <w:bottom w:val="nil"/>
+          <w:right w:val="nil"/>
+          <w:between w:val="nil"/>
+        </w:pBdr>
+        <w:spacing w:before="120"/>
+        <w:rPr>
+          <w:rFonts w:ascii="Arial" w:eastAsia="Calibri" w:hAnsi="Arial" w:cs="Arial"/>
+          <w:b/>
+          <w:color w:val="000000"/>
+          <w:sz w:val="22"/>
+          <w:szCs w:val="22"/>
+        </w:rPr>
+      </w:pPr>
+      <w:r>
+        <w:rPr>
+          <w:rFonts w:ascii="Arial" w:eastAsia="Calibri" w:hAnsi="Arial" w:cs="Arial"/>
+          <w:b/>
+          <w:color w:val="000000"/>
+          <w:sz w:val="22"/>
+          <w:szCs w:val="22"/>
+        </w:rPr>
+        <w:t>SKILLS</w:t>
       </w:r>
     </w:p>
     <w:p>
@@ -3440,55 +3148,42 @@
           <w:between w:val="nil"/>
         </w:pBdr>
         <w:spacing w:before="120"/>
-        <w:ind w:left="723"/>
-        <w:rPr>
-          <w:rFonts w:ascii="Arial" w:eastAsia="Calibri" w:hAnsi="Arial" w:cs="Arial"/>
-          <w:color w:val="000000"/>
-          <w:sz w:val="20"/>
-          <w:szCs w:val="20"/>
-        </w:rPr>
-      </w:pPr>
-      <w:r>
-        <w:rPr>
-          <w:rFonts w:ascii="Arial" w:eastAsia="Calibri" w:hAnsi="Arial" w:cs="Arial"/>
-          <w:color w:val="000000"/>
-          <w:sz w:val="20"/>
-          <w:szCs w:val="20"/>
-        </w:rPr>
-        <w:t xml:space="preserve">High school: </w:t>
-      </w:r>
-      <w:r>
-        <w:rPr>
-          <w:rFonts w:ascii="Arial" w:eastAsia="Calibri" w:hAnsi="Arial" w:cs="Arial"/>
-          <w:color w:val="000000"/>
-          <w:sz w:val="20"/>
-          <w:szCs w:val="20"/>
-        </w:rPr>
-        <w:t xml:space="preserve">outperformed typical academic path with </w:t>
-      </w:r>
-      <w:r>
-        <w:rPr>
-          <w:rFonts w:ascii="Arial" w:eastAsia="Calibri" w:hAnsi="Arial" w:cs="Arial"/>
-          <w:color w:val="000000"/>
-          <w:sz w:val="20"/>
-          <w:szCs w:val="20"/>
-        </w:rPr>
-        <w:t xml:space="preserve">straight </w:t>
-      </w:r>
-      <w:proofErr w:type="gramStart"/>
-      <w:r>
-        <w:rPr>
-          <w:rFonts w:ascii="Arial" w:eastAsia="Calibri" w:hAnsi="Arial" w:cs="Arial"/>
-          <w:color w:val="000000"/>
-          <w:sz w:val="20"/>
-          <w:szCs w:val="20"/>
-        </w:rPr>
-        <w:t>As</w:t>
-      </w:r>
-      <w:proofErr w:type="gramEnd"/>
-      <w:r>
-        <w:rPr>
-          <w:rFonts w:ascii="Arial" w:eastAsia="Calibri" w:hAnsi="Arial" w:cs="Arial"/>
+        <w:rPr>
+          <w:rFonts w:ascii="Arial" w:eastAsia="Calibri" w:hAnsi="Arial" w:cs="Arial"/>
+          <w:b/>
+          <w:bCs/>
+          <w:color w:val="000000"/>
+          <w:sz w:val="20"/>
+          <w:szCs w:val="20"/>
+        </w:rPr>
+      </w:pPr>
+      <w:r>
+        <w:rPr>
+          <w:rFonts w:ascii="Arial" w:eastAsia="Calibri" w:hAnsi="Arial" w:cs="Arial"/>
+          <w:b/>
+          <w:bCs/>
+          <w:color w:val="000000"/>
+          <w:sz w:val="20"/>
+          <w:szCs w:val="20"/>
+        </w:rPr>
+        <w:t>L</w:t>
+      </w:r>
+      <w:r>
+        <w:rPr>
+          <w:rFonts w:ascii="Arial" w:eastAsia="Calibri" w:hAnsi="Arial" w:cs="Arial"/>
+          <w:b/>
+          <w:bCs/>
+          <w:color w:val="000000"/>
+          <w:sz w:val="20"/>
+          <w:szCs w:val="20"/>
+        </w:rPr>
+        <w:t>anguages:</w:t>
+      </w:r>
+      <w:r>
+        <w:rPr>
+          <w:rFonts w:ascii="Arial" w:eastAsia="Calibri" w:hAnsi="Arial" w:cs="Arial"/>
+          <w:b/>
+          <w:bCs/>
           <w:color w:val="000000"/>
           <w:sz w:val="20"/>
           <w:szCs w:val="20"/>
@@ -3502,61 +3197,34 @@
           <w:sz w:val="20"/>
           <w:szCs w:val="20"/>
         </w:rPr>
-        <w:t>in</w:t>
-      </w:r>
-      <w:r>
-        <w:rPr>
-          <w:rFonts w:ascii="Arial" w:eastAsia="Calibri" w:hAnsi="Arial" w:cs="Arial"/>
-          <w:color w:val="000000"/>
-          <w:sz w:val="20"/>
-          <w:szCs w:val="20"/>
-        </w:rPr>
-        <w:t xml:space="preserve"> 4 A</w:t>
-      </w:r>
-      <w:r>
-        <w:rPr>
-          <w:rFonts w:ascii="Arial" w:eastAsia="Calibri" w:hAnsi="Arial" w:cs="Arial"/>
-          <w:color w:val="000000"/>
-          <w:sz w:val="20"/>
-          <w:szCs w:val="20"/>
-        </w:rPr>
-        <w:t>dvanced Highers (t</w:t>
-      </w:r>
-      <w:r>
-        <w:rPr>
-          <w:rFonts w:ascii="Arial" w:eastAsia="Calibri" w:hAnsi="Arial" w:cs="Arial"/>
-          <w:color w:val="000000"/>
-          <w:sz w:val="20"/>
-          <w:szCs w:val="20"/>
-        </w:rPr>
-        <w:t>ypical</w:t>
-      </w:r>
-      <w:r>
-        <w:rPr>
-          <w:rFonts w:ascii="Arial" w:eastAsia="Calibri" w:hAnsi="Arial" w:cs="Arial"/>
-          <w:color w:val="000000"/>
-          <w:sz w:val="20"/>
-          <w:szCs w:val="20"/>
-        </w:rPr>
-        <w:t xml:space="preserve"> path</w:t>
-      </w:r>
-      <w:r>
-        <w:rPr>
-          <w:rFonts w:ascii="Arial" w:eastAsia="Calibri" w:hAnsi="Arial" w:cs="Arial"/>
-          <w:color w:val="000000"/>
-          <w:sz w:val="20"/>
-          <w:szCs w:val="20"/>
-        </w:rPr>
-        <w:t xml:space="preserve"> is 3</w:t>
-      </w:r>
-      <w:r>
-        <w:rPr>
-          <w:rFonts w:ascii="Arial" w:eastAsia="Calibri" w:hAnsi="Arial" w:cs="Arial"/>
-          <w:color w:val="000000"/>
-          <w:sz w:val="20"/>
-          <w:szCs w:val="20"/>
-        </w:rPr>
-        <w:t>).</w:t>
+        <w:t>Python</w:t>
+      </w:r>
+      <w:r>
+        <w:rPr>
+          <w:rFonts w:ascii="Arial" w:eastAsia="Calibri" w:hAnsi="Arial" w:cs="Arial"/>
+          <w:color w:val="000000"/>
+          <w:sz w:val="20"/>
+          <w:szCs w:val="20"/>
+        </w:rPr>
+        <w:t>,</w:t>
+      </w:r>
+      <w:r>
+        <w:rPr>
+          <w:rFonts w:ascii="Arial" w:eastAsia="Calibri" w:hAnsi="Arial" w:cs="Arial"/>
+          <w:color w:val="000000"/>
+          <w:sz w:val="20"/>
+          <w:szCs w:val="20"/>
+        </w:rPr>
+        <w:t xml:space="preserve"> PHP, Java, SQL, HTML/CSS, JavaScript</w:t>
+      </w:r>
+      <w:r>
+        <w:rPr>
+          <w:rFonts w:ascii="Arial" w:eastAsia="Calibri" w:hAnsi="Arial" w:cs="Arial"/>
+          <w:color w:val="000000"/>
+          <w:sz w:val="20"/>
+          <w:szCs w:val="20"/>
+        </w:rPr>
+        <w:t>, MATLAB, C, Haskell, Ruby</w:t>
       </w:r>
     </w:p>
     <w:p>
@@ -3576,19 +3244,334 @@
         <w:spacing w:before="120"/>
         <w:rPr>
           <w:rFonts w:ascii="Arial" w:eastAsia="Calibri" w:hAnsi="Arial" w:cs="Arial"/>
-          <w:color w:val="000000"/>
-          <w:sz w:val="20"/>
-          <w:szCs w:val="20"/>
-        </w:rPr>
-      </w:pPr>
-      <w:r>
-        <w:rPr>
-          <w:rFonts w:ascii="Arial" w:eastAsia="Calibri" w:hAnsi="Arial" w:cs="Arial"/>
-          <w:color w:val="000000"/>
-          <w:sz w:val="20"/>
-          <w:szCs w:val="20"/>
-        </w:rPr>
-        <w:t>Led group</w:t>
+          <w:b/>
+          <w:bCs/>
+          <w:color w:val="000000"/>
+          <w:sz w:val="20"/>
+          <w:szCs w:val="20"/>
+        </w:rPr>
+      </w:pPr>
+      <w:r>
+        <w:rPr>
+          <w:rFonts w:ascii="Arial" w:eastAsia="Calibri" w:hAnsi="Arial" w:cs="Arial"/>
+          <w:b/>
+          <w:bCs/>
+          <w:color w:val="000000"/>
+          <w:sz w:val="20"/>
+          <w:szCs w:val="20"/>
+        </w:rPr>
+        <w:t>Frameworks</w:t>
+      </w:r>
+      <w:r>
+        <w:rPr>
+          <w:rFonts w:ascii="Arial" w:eastAsia="Calibri" w:hAnsi="Arial" w:cs="Arial"/>
+          <w:b/>
+          <w:bCs/>
+          <w:color w:val="000000"/>
+          <w:sz w:val="20"/>
+          <w:szCs w:val="20"/>
+        </w:rPr>
+        <w:t xml:space="preserve">: </w:t>
+      </w:r>
+      <w:r>
+        <w:rPr>
+          <w:rFonts w:ascii="Arial" w:eastAsia="Calibri" w:hAnsi="Arial" w:cs="Arial"/>
+          <w:color w:val="000000"/>
+          <w:sz w:val="20"/>
+          <w:szCs w:val="20"/>
+        </w:rPr>
+        <w:t>Django</w:t>
+      </w:r>
+      <w:r>
+        <w:rPr>
+          <w:rFonts w:ascii="Arial" w:eastAsia="Calibri" w:hAnsi="Arial" w:cs="Arial"/>
+          <w:color w:val="000000"/>
+          <w:sz w:val="20"/>
+          <w:szCs w:val="20"/>
+        </w:rPr>
+        <w:t xml:space="preserve"> (</w:t>
+      </w:r>
+      <w:r>
+        <w:rPr>
+          <w:rFonts w:ascii="Arial" w:eastAsia="Calibri" w:hAnsi="Arial" w:cs="Arial"/>
+          <w:color w:val="000000"/>
+          <w:sz w:val="20"/>
+          <w:szCs w:val="20"/>
+        </w:rPr>
+        <w:t>Python</w:t>
+      </w:r>
+      <w:r>
+        <w:rPr>
+          <w:rFonts w:ascii="Arial" w:eastAsia="Calibri" w:hAnsi="Arial" w:cs="Arial"/>
+          <w:color w:val="000000"/>
+          <w:sz w:val="20"/>
+          <w:szCs w:val="20"/>
+        </w:rPr>
+        <w:t xml:space="preserve">), </w:t>
+      </w:r>
+      <w:r>
+        <w:rPr>
+          <w:rFonts w:ascii="Arial" w:eastAsia="Calibri" w:hAnsi="Arial" w:cs="Arial"/>
+          <w:color w:val="000000"/>
+          <w:sz w:val="20"/>
+          <w:szCs w:val="20"/>
+        </w:rPr>
+        <w:t>Bootstrap (HTML/CSS)</w:t>
+      </w:r>
+      <w:r>
+        <w:rPr>
+          <w:rFonts w:ascii="Arial" w:eastAsia="Calibri" w:hAnsi="Arial" w:cs="Arial"/>
+          <w:color w:val="000000"/>
+          <w:sz w:val="20"/>
+          <w:szCs w:val="20"/>
+        </w:rPr>
+        <w:t xml:space="preserve">, </w:t>
+      </w:r>
+      <w:r>
+        <w:rPr>
+          <w:rFonts w:ascii="Arial" w:eastAsia="Calibri" w:hAnsi="Arial" w:cs="Arial"/>
+          <w:color w:val="000000"/>
+          <w:sz w:val="20"/>
+          <w:szCs w:val="20"/>
+        </w:rPr>
+        <w:t>Ruby on Rails (</w:t>
+      </w:r>
+      <w:r>
+        <w:rPr>
+          <w:rFonts w:ascii="Arial" w:eastAsia="Calibri" w:hAnsi="Arial" w:cs="Arial"/>
+          <w:color w:val="000000"/>
+          <w:sz w:val="20"/>
+          <w:szCs w:val="20"/>
+        </w:rPr>
+        <w:t>Ruby</w:t>
+      </w:r>
+      <w:r>
+        <w:rPr>
+          <w:rFonts w:ascii="Arial" w:eastAsia="Calibri" w:hAnsi="Arial" w:cs="Arial"/>
+          <w:color w:val="000000"/>
+          <w:sz w:val="20"/>
+          <w:szCs w:val="20"/>
+        </w:rPr>
+        <w:t>)</w:t>
+      </w:r>
+    </w:p>
+    <w:p>
+      <w:pPr>
+        <w:pStyle w:val="ListParagraph"/>
+        <w:numPr>
+          <w:ilvl w:val="0"/>
+          <w:numId w:val="2"/>
+        </w:numPr>
+        <w:pBdr>
+          <w:top w:val="nil"/>
+          <w:left w:val="nil"/>
+          <w:bottom w:val="nil"/>
+          <w:right w:val="nil"/>
+          <w:between w:val="nil"/>
+        </w:pBdr>
+        <w:spacing w:before="120"/>
+        <w:rPr>
+          <w:rFonts w:ascii="Arial" w:eastAsia="Calibri" w:hAnsi="Arial" w:cs="Arial"/>
+          <w:b/>
+          <w:bCs/>
+          <w:color w:val="000000"/>
+          <w:sz w:val="20"/>
+          <w:szCs w:val="20"/>
+        </w:rPr>
+      </w:pPr>
+      <w:r>
+        <w:rPr>
+          <w:rFonts w:ascii="Arial" w:eastAsia="Calibri" w:hAnsi="Arial" w:cs="Arial"/>
+          <w:b/>
+          <w:bCs/>
+          <w:color w:val="000000"/>
+          <w:sz w:val="20"/>
+          <w:szCs w:val="20"/>
+        </w:rPr>
+        <w:t>T</w:t>
+      </w:r>
+      <w:r>
+        <w:rPr>
+          <w:rFonts w:ascii="Arial" w:eastAsia="Calibri" w:hAnsi="Arial" w:cs="Arial"/>
+          <w:b/>
+          <w:bCs/>
+          <w:color w:val="000000"/>
+          <w:sz w:val="20"/>
+          <w:szCs w:val="20"/>
+        </w:rPr>
+        <w:t>ools:</w:t>
+      </w:r>
+      <w:r>
+        <w:rPr>
+          <w:rFonts w:ascii="Arial" w:eastAsia="Calibri" w:hAnsi="Arial" w:cs="Arial"/>
+          <w:b/>
+          <w:bCs/>
+          <w:color w:val="000000"/>
+          <w:sz w:val="20"/>
+          <w:szCs w:val="20"/>
+        </w:rPr>
+        <w:t xml:space="preserve"> </w:t>
+      </w:r>
+      <w:r>
+        <w:rPr>
+          <w:rFonts w:ascii="Arial" w:eastAsia="Calibri" w:hAnsi="Arial" w:cs="Arial"/>
+          <w:color w:val="000000"/>
+          <w:sz w:val="20"/>
+          <w:szCs w:val="20"/>
+        </w:rPr>
+        <w:t>Git, Bash,</w:t>
+      </w:r>
+      <w:r>
+        <w:rPr>
+          <w:rFonts w:ascii="Arial" w:eastAsia="Calibri" w:hAnsi="Arial" w:cs="Arial"/>
+          <w:color w:val="000000"/>
+          <w:sz w:val="20"/>
+          <w:szCs w:val="20"/>
+        </w:rPr>
+        <w:t xml:space="preserve"> MySQL,</w:t>
+      </w:r>
+      <w:r>
+        <w:rPr>
+          <w:rFonts w:ascii="Arial" w:eastAsia="Calibri" w:hAnsi="Arial" w:cs="Arial"/>
+          <w:color w:val="000000"/>
+          <w:sz w:val="20"/>
+          <w:szCs w:val="20"/>
+        </w:rPr>
+        <w:t xml:space="preserve"> Docker, Apache HTTP Server, A</w:t>
+      </w:r>
+      <w:r>
+        <w:rPr>
+          <w:rFonts w:ascii="Arial" w:eastAsia="Calibri" w:hAnsi="Arial" w:cs="Arial"/>
+          <w:color w:val="000000"/>
+          <w:sz w:val="20"/>
+          <w:szCs w:val="20"/>
+        </w:rPr>
+        <w:t xml:space="preserve">mazon </w:t>
+      </w:r>
+      <w:r>
+        <w:rPr>
+          <w:rFonts w:ascii="Arial" w:eastAsia="Calibri" w:hAnsi="Arial" w:cs="Arial"/>
+          <w:color w:val="000000"/>
+          <w:sz w:val="20"/>
+          <w:szCs w:val="20"/>
+        </w:rPr>
+        <w:t>W</w:t>
+      </w:r>
+      <w:r>
+        <w:rPr>
+          <w:rFonts w:ascii="Arial" w:eastAsia="Calibri" w:hAnsi="Arial" w:cs="Arial"/>
+          <w:color w:val="000000"/>
+          <w:sz w:val="20"/>
+          <w:szCs w:val="20"/>
+        </w:rPr>
+        <w:t xml:space="preserve">eb </w:t>
+      </w:r>
+      <w:r>
+        <w:rPr>
+          <w:rFonts w:ascii="Arial" w:eastAsia="Calibri" w:hAnsi="Arial" w:cs="Arial"/>
+          <w:color w:val="000000"/>
+          <w:sz w:val="20"/>
+          <w:szCs w:val="20"/>
+        </w:rPr>
+        <w:t>S</w:t>
+      </w:r>
+      <w:r>
+        <w:rPr>
+          <w:rFonts w:ascii="Arial" w:eastAsia="Calibri" w:hAnsi="Arial" w:cs="Arial"/>
+          <w:color w:val="000000"/>
+          <w:sz w:val="20"/>
+          <w:szCs w:val="20"/>
+        </w:rPr>
+        <w:t>ervices (AWS)</w:t>
+      </w:r>
+    </w:p>
+    <w:p>
+      <w:pPr>
+        <w:pBdr>
+          <w:top w:val="nil"/>
+          <w:left w:val="nil"/>
+          <w:bottom w:val="single" w:sz="4" w:space="1" w:color="000000"/>
+          <w:right w:val="nil"/>
+          <w:between w:val="nil"/>
+        </w:pBdr>
+        <w:rPr>
+          <w:rFonts w:ascii="Arial" w:eastAsia="Calibri" w:hAnsi="Arial" w:cs="Arial"/>
+          <w:b/>
+          <w:smallCaps/>
+          <w:color w:val="000000"/>
+          <w:sz w:val="20"/>
+          <w:szCs w:val="20"/>
+        </w:rPr>
+      </w:pPr>
+    </w:p>
+    <w:p>
+      <w:pPr>
+        <w:pBdr>
+          <w:top w:val="nil"/>
+          <w:left w:val="nil"/>
+          <w:bottom w:val="nil"/>
+          <w:right w:val="nil"/>
+          <w:between w:val="nil"/>
+        </w:pBdr>
+        <w:spacing w:before="120"/>
+        <w:rPr>
+          <w:rFonts w:ascii="Arial" w:eastAsia="Calibri" w:hAnsi="Arial" w:cs="Arial"/>
+          <w:b/>
+          <w:color w:val="000000"/>
+          <w:sz w:val="22"/>
+          <w:szCs w:val="22"/>
+        </w:rPr>
+      </w:pPr>
+      <w:r>
+        <w:rPr>
+          <w:rFonts w:ascii="Arial" w:eastAsia="Calibri" w:hAnsi="Arial" w:cs="Arial"/>
+          <w:b/>
+          <w:color w:val="000000"/>
+          <w:sz w:val="22"/>
+          <w:szCs w:val="22"/>
+        </w:rPr>
+        <w:t>ADDITIONAL ACHIEVEMENTS</w:t>
+      </w:r>
+    </w:p>
+    <w:p>
+      <w:pPr>
+        <w:pStyle w:val="ListParagraph"/>
+        <w:numPr>
+          <w:ilvl w:val="0"/>
+          <w:numId w:val="2"/>
+        </w:numPr>
+        <w:pBdr>
+          <w:top w:val="nil"/>
+          <w:left w:val="nil"/>
+          <w:bottom w:val="nil"/>
+          <w:right w:val="nil"/>
+          <w:between w:val="nil"/>
+        </w:pBdr>
+        <w:spacing w:before="120"/>
+        <w:rPr>
+          <w:rFonts w:ascii="Arial" w:eastAsia="Calibri" w:hAnsi="Arial" w:cs="Arial"/>
+          <w:color w:val="000000"/>
+          <w:sz w:val="20"/>
+          <w:szCs w:val="20"/>
+        </w:rPr>
+      </w:pPr>
+      <w:r>
+        <w:rPr>
+          <w:rFonts w:ascii="Arial" w:eastAsia="Calibri" w:hAnsi="Arial" w:cs="Arial"/>
+          <w:color w:val="000000"/>
+          <w:sz w:val="20"/>
+          <w:szCs w:val="20"/>
+        </w:rPr>
+        <w:t>Singing: l</w:t>
+      </w:r>
+      <w:r>
+        <w:rPr>
+          <w:rFonts w:ascii="Arial" w:eastAsia="Calibri" w:hAnsi="Arial" w:cs="Arial"/>
+          <w:color w:val="000000"/>
+          <w:sz w:val="20"/>
+          <w:szCs w:val="20"/>
+        </w:rPr>
+        <w:t>ed group</w:t>
       </w:r>
       <w:r>
         <w:rPr>
@@ -3654,8 +3637,92 @@
         <w:t xml:space="preserve"> competition Voice Festival UK.</w:t>
       </w:r>
     </w:p>
+    <w:p>
+      <w:pPr>
+        <w:pStyle w:val="ListParagraph"/>
+        <w:numPr>
+          <w:ilvl w:val="0"/>
+          <w:numId w:val="2"/>
+        </w:numPr>
+        <w:pBdr>
+          <w:top w:val="nil"/>
+          <w:left w:val="nil"/>
+          <w:bottom w:val="nil"/>
+          <w:right w:val="nil"/>
+          <w:between w:val="nil"/>
+        </w:pBdr>
+        <w:spacing w:before="120"/>
+        <w:rPr>
+          <w:rFonts w:ascii="Arial" w:eastAsia="Calibri" w:hAnsi="Arial" w:cs="Arial"/>
+          <w:color w:val="000000"/>
+          <w:sz w:val="20"/>
+          <w:szCs w:val="20"/>
+        </w:rPr>
+      </w:pPr>
+      <w:r>
+        <w:rPr>
+          <w:rFonts w:ascii="Arial" w:eastAsia="Calibri" w:hAnsi="Arial" w:cs="Arial"/>
+          <w:color w:val="000000"/>
+          <w:sz w:val="20"/>
+          <w:szCs w:val="20"/>
+        </w:rPr>
+        <w:t>Adventure: hitchhiked from London to Vienna in 4 days; spent 3 months in Thailand training Muay Thai.</w:t>
+      </w:r>
+    </w:p>
+    <w:p>
+      <w:pPr>
+        <w:pStyle w:val="ListParagraph"/>
+        <w:numPr>
+          <w:ilvl w:val="0"/>
+          <w:numId w:val="2"/>
+        </w:numPr>
+        <w:pBdr>
+          <w:top w:val="nil"/>
+          <w:left w:val="nil"/>
+          <w:bottom w:val="nil"/>
+          <w:right w:val="nil"/>
+          <w:between w:val="nil"/>
+        </w:pBdr>
+        <w:spacing w:before="120"/>
+        <w:rPr>
+          <w:rFonts w:ascii="Arial" w:eastAsia="Calibri" w:hAnsi="Arial" w:cs="Arial"/>
+          <w:color w:val="000000"/>
+          <w:sz w:val="20"/>
+          <w:szCs w:val="20"/>
+        </w:rPr>
+      </w:pPr>
+      <w:r>
+        <w:rPr>
+          <w:rFonts w:ascii="Arial" w:eastAsia="Calibri" w:hAnsi="Arial" w:cs="Arial"/>
+          <w:color w:val="000000"/>
+          <w:sz w:val="20"/>
+          <w:szCs w:val="20"/>
+        </w:rPr>
+        <w:t xml:space="preserve">High school: outperformed typical academic path with straight </w:t>
+      </w:r>
+      <w:proofErr w:type="gramStart"/>
+      <w:r>
+        <w:rPr>
+          <w:rFonts w:ascii="Arial" w:eastAsia="Calibri" w:hAnsi="Arial" w:cs="Arial"/>
+          <w:color w:val="000000"/>
+          <w:sz w:val="20"/>
+          <w:szCs w:val="20"/>
+        </w:rPr>
+        <w:t>As</w:t>
+      </w:r>
+      <w:proofErr w:type="gramEnd"/>
+      <w:r>
+        <w:rPr>
+          <w:rFonts w:ascii="Arial" w:eastAsia="Calibri" w:hAnsi="Arial" w:cs="Arial"/>
+          <w:color w:val="000000"/>
+          <w:sz w:val="20"/>
+          <w:szCs w:val="20"/>
+        </w:rPr>
+        <w:t xml:space="preserve"> in 4 Advanced Highers (typical path is 3).</w:t>
+      </w:r>
+    </w:p>
     <w:sectPr>
-      <w:headerReference w:type="default" r:id="rId14"/>
+      <w:headerReference w:type="default" r:id="rId15"/>
       <w:pgSz w:w="11900" w:h="16840"/>
       <w:pgMar w:top="720" w:right="720" w:bottom="720" w:left="720" w:header="618" w:footer="561" w:gutter="0"/>
       <w:pgNumType w:start="1"/>

</xml_diff>

<commit_message>
change order of website project
</commit_message>
<xml_diff>
--- a/apache2/www/public/engineer/engineer-resume.docx
+++ b/apache2/www/public/engineer/engineer-resume.docx
@@ -2410,25 +2410,88 @@
           <w:sz w:val="20"/>
           <w:szCs w:val="20"/>
         </w:rPr>
-        <w:t xml:space="preserve">Crafted intricate front-end HTML/CSS template using Bootstrap, including fully </w:t>
-      </w:r>
-      <w:r>
-        <w:rPr>
-          <w:rFonts w:ascii="Arial" w:eastAsia="Calibri" w:hAnsi="Arial" w:cs="Arial"/>
-          <w:color w:val="000000"/>
-          <w:sz w:val="20"/>
-          <w:szCs w:val="20"/>
-        </w:rPr>
-        <w:t xml:space="preserve">responsive </w:t>
-      </w:r>
-      <w:r>
-        <w:rPr>
-          <w:rFonts w:ascii="Arial" w:eastAsia="Calibri" w:hAnsi="Arial" w:cs="Arial"/>
-          <w:color w:val="000000"/>
-          <w:sz w:val="20"/>
-          <w:szCs w:val="20"/>
-        </w:rPr>
-        <w:t xml:space="preserve">menu and sidebar. </w:t>
+        <w:t xml:space="preserve">Built </w:t>
+      </w:r>
+      <w:r>
+        <w:rPr>
+          <w:rFonts w:ascii="Arial" w:eastAsia="Calibri" w:hAnsi="Arial" w:cs="Arial"/>
+          <w:color w:val="000000"/>
+          <w:sz w:val="20"/>
+          <w:szCs w:val="20"/>
+        </w:rPr>
+        <w:t xml:space="preserve">reusable </w:t>
+      </w:r>
+      <w:r>
+        <w:rPr>
+          <w:rFonts w:ascii="Arial" w:eastAsia="Calibri" w:hAnsi="Arial" w:cs="Arial"/>
+          <w:color w:val="000000"/>
+          <w:sz w:val="20"/>
+          <w:szCs w:val="20"/>
+        </w:rPr>
+        <w:t xml:space="preserve">PHP </w:t>
+      </w:r>
+      <w:r>
+        <w:rPr>
+          <w:rFonts w:ascii="Arial" w:eastAsia="Calibri" w:hAnsi="Arial" w:cs="Arial"/>
+          <w:color w:val="000000"/>
+          <w:sz w:val="20"/>
+          <w:szCs w:val="20"/>
+        </w:rPr>
+        <w:t xml:space="preserve">back-end </w:t>
+      </w:r>
+      <w:r>
+        <w:rPr>
+          <w:rFonts w:ascii="Arial" w:eastAsia="Calibri" w:hAnsi="Arial" w:cs="Arial"/>
+          <w:color w:val="000000"/>
+          <w:sz w:val="20"/>
+          <w:szCs w:val="20"/>
+        </w:rPr>
+        <w:t xml:space="preserve">from scratch </w:t>
+      </w:r>
+      <w:r>
+        <w:rPr>
+          <w:rFonts w:ascii="Arial" w:eastAsia="Calibri" w:hAnsi="Arial" w:cs="Arial"/>
+          <w:color w:val="000000"/>
+          <w:sz w:val="20"/>
+          <w:szCs w:val="20"/>
+        </w:rPr>
+        <w:t>including</w:t>
+      </w:r>
+      <w:r>
+        <w:rPr>
+          <w:rFonts w:ascii="Arial" w:eastAsia="Calibri" w:hAnsi="Arial" w:cs="Arial"/>
+          <w:color w:val="000000"/>
+          <w:sz w:val="20"/>
+          <w:szCs w:val="20"/>
+        </w:rPr>
+        <w:t xml:space="preserve"> routing</w:t>
+      </w:r>
+      <w:r>
+        <w:rPr>
+          <w:rFonts w:ascii="Arial" w:eastAsia="Calibri" w:hAnsi="Arial" w:cs="Arial"/>
+          <w:color w:val="000000"/>
+          <w:sz w:val="20"/>
+          <w:szCs w:val="20"/>
+        </w:rPr>
+        <w:t>, templating and a</w:t>
+      </w:r>
+      <w:r>
+        <w:rPr>
+          <w:rFonts w:ascii="Arial" w:eastAsia="Calibri" w:hAnsi="Arial" w:cs="Arial"/>
+          <w:color w:val="000000"/>
+          <w:sz w:val="20"/>
+          <w:szCs w:val="20"/>
+        </w:rPr>
+        <w:t xml:space="preserve"> 100%</w:t>
+      </w:r>
+      <w:r>
+        <w:rPr>
+          <w:rFonts w:ascii="Arial" w:eastAsia="Calibri" w:hAnsi="Arial" w:cs="Arial"/>
+          <w:color w:val="000000"/>
+          <w:sz w:val="20"/>
+          <w:szCs w:val="20"/>
+        </w:rPr>
+        <w:t xml:space="preserve"> spam-free contact form.</w:t>
       </w:r>
     </w:p>
     <w:p>
@@ -2459,88 +2522,7 @@
           <w:sz w:val="20"/>
           <w:szCs w:val="20"/>
         </w:rPr>
-        <w:t xml:space="preserve">Built </w:t>
-      </w:r>
-      <w:r>
-        <w:rPr>
-          <w:rFonts w:ascii="Arial" w:eastAsia="Calibri" w:hAnsi="Arial" w:cs="Arial"/>
-          <w:color w:val="000000"/>
-          <w:sz w:val="20"/>
-          <w:szCs w:val="20"/>
-        </w:rPr>
-        <w:t xml:space="preserve">reusable </w:t>
-      </w:r>
-      <w:r>
-        <w:rPr>
-          <w:rFonts w:ascii="Arial" w:eastAsia="Calibri" w:hAnsi="Arial" w:cs="Arial"/>
-          <w:color w:val="000000"/>
-          <w:sz w:val="20"/>
-          <w:szCs w:val="20"/>
-        </w:rPr>
-        <w:t xml:space="preserve">PHP </w:t>
-      </w:r>
-      <w:r>
-        <w:rPr>
-          <w:rFonts w:ascii="Arial" w:eastAsia="Calibri" w:hAnsi="Arial" w:cs="Arial"/>
-          <w:color w:val="000000"/>
-          <w:sz w:val="20"/>
-          <w:szCs w:val="20"/>
-        </w:rPr>
-        <w:t xml:space="preserve">back-end </w:t>
-      </w:r>
-      <w:r>
-        <w:rPr>
-          <w:rFonts w:ascii="Arial" w:eastAsia="Calibri" w:hAnsi="Arial" w:cs="Arial"/>
-          <w:color w:val="000000"/>
-          <w:sz w:val="20"/>
-          <w:szCs w:val="20"/>
-        </w:rPr>
-        <w:t xml:space="preserve">from scratch </w:t>
-      </w:r>
-      <w:r>
-        <w:rPr>
-          <w:rFonts w:ascii="Arial" w:eastAsia="Calibri" w:hAnsi="Arial" w:cs="Arial"/>
-          <w:color w:val="000000"/>
-          <w:sz w:val="20"/>
-          <w:szCs w:val="20"/>
-        </w:rPr>
-        <w:t>including</w:t>
-      </w:r>
-      <w:r>
-        <w:rPr>
-          <w:rFonts w:ascii="Arial" w:eastAsia="Calibri" w:hAnsi="Arial" w:cs="Arial"/>
-          <w:color w:val="000000"/>
-          <w:sz w:val="20"/>
-          <w:szCs w:val="20"/>
-        </w:rPr>
-        <w:t xml:space="preserve"> routing</w:t>
-      </w:r>
-      <w:r>
-        <w:rPr>
-          <w:rFonts w:ascii="Arial" w:eastAsia="Calibri" w:hAnsi="Arial" w:cs="Arial"/>
-          <w:color w:val="000000"/>
-          <w:sz w:val="20"/>
-          <w:szCs w:val="20"/>
-        </w:rPr>
-        <w:t>, templating and a</w:t>
-      </w:r>
-      <w:r>
-        <w:rPr>
-          <w:rFonts w:ascii="Arial" w:eastAsia="Calibri" w:hAnsi="Arial" w:cs="Arial"/>
-          <w:color w:val="000000"/>
-          <w:sz w:val="20"/>
-          <w:szCs w:val="20"/>
-        </w:rPr>
-        <w:t xml:space="preserve"> 100%</w:t>
-      </w:r>
-      <w:r>
-        <w:rPr>
-          <w:rFonts w:ascii="Arial" w:eastAsia="Calibri" w:hAnsi="Arial" w:cs="Arial"/>
-          <w:color w:val="000000"/>
-          <w:sz w:val="20"/>
-          <w:szCs w:val="20"/>
-        </w:rPr>
-        <w:t xml:space="preserve"> spam-free contact form.</w:t>
+        <w:t>Crafted intricate front-end HTML/CSS template using Bootstrap, including fully responsive menu and sidebar.</w:t>
       </w:r>
     </w:p>
     <w:p>

</xml_diff>

<commit_message>
update resume and make autojobgpt public
</commit_message>
<xml_diff>
--- a/apache2/www/public/engineer/engineer-resume.docx
+++ b/apache2/www/public/engineer/engineer-resume.docx
@@ -550,7 +550,43 @@
           <w:sz w:val="20"/>
           <w:szCs w:val="20"/>
         </w:rPr>
-        <w:t>Programming and scripting languages | Frameworks and libraries | Databases and tools</w:t>
+        <w:t>Programming</w:t>
+      </w:r>
+      <w:r>
+        <w:rPr>
+          <w:rFonts w:ascii="Arial" w:eastAsia="Calibri" w:hAnsi="Arial" w:cs="Arial"/>
+          <w:color w:val="000000"/>
+          <w:sz w:val="20"/>
+          <w:szCs w:val="20"/>
+        </w:rPr>
+        <w:t xml:space="preserve">, </w:t>
+      </w:r>
+      <w:r>
+        <w:rPr>
+          <w:rFonts w:ascii="Arial" w:eastAsia="Calibri" w:hAnsi="Arial" w:cs="Arial"/>
+          <w:color w:val="000000"/>
+          <w:sz w:val="20"/>
+          <w:szCs w:val="20"/>
+        </w:rPr>
+        <w:t>scripting</w:t>
+      </w:r>
+      <w:r>
+        <w:rPr>
+          <w:rFonts w:ascii="Arial" w:eastAsia="Calibri" w:hAnsi="Arial" w:cs="Arial"/>
+          <w:color w:val="000000"/>
+          <w:sz w:val="20"/>
+          <w:szCs w:val="20"/>
+        </w:rPr>
+        <w:t>, and markup</w:t>
+      </w:r>
+      <w:r>
+        <w:rPr>
+          <w:rFonts w:ascii="Arial" w:eastAsia="Calibri" w:hAnsi="Arial" w:cs="Arial"/>
+          <w:color w:val="000000"/>
+          <w:sz w:val="20"/>
+          <w:szCs w:val="20"/>
+        </w:rPr>
+        <w:t xml:space="preserve"> languages | Frameworks and libraries | Databases and tools</w:t>
       </w:r>
     </w:p>
     <w:p>
@@ -583,7 +619,29 @@
           <w:sz w:val="20"/>
           <w:szCs w:val="20"/>
         </w:rPr>
-        <w:t>Primary (8+years)</w:t>
+        <w:t>Primary (</w:t>
+      </w:r>
+      <w:r>
+        <w:rPr>
+          <w:rFonts w:ascii="Arial" w:eastAsia="Calibri" w:hAnsi="Arial" w:cs="Arial"/>
+          <w:b/>
+          <w:bCs/>
+          <w:color w:val="000000"/>
+          <w:sz w:val="20"/>
+          <w:szCs w:val="20"/>
+        </w:rPr>
+        <w:t>6</w:t>
+      </w:r>
+      <w:r>
+        <w:rPr>
+          <w:rFonts w:ascii="Arial" w:eastAsia="Calibri" w:hAnsi="Arial" w:cs="Arial"/>
+          <w:b/>
+          <w:bCs/>
+          <w:color w:val="000000"/>
+          <w:sz w:val="20"/>
+          <w:szCs w:val="20"/>
+        </w:rPr>
+        <w:t>+years)</w:t>
       </w:r>
       <w:r>
         <w:rPr>
@@ -601,25 +659,25 @@
           <w:sz w:val="20"/>
           <w:szCs w:val="20"/>
         </w:rPr>
-        <w:t>Python, HTML, Java, MATLAB | Django</w:t>
-      </w:r>
-      <w:r>
-        <w:rPr>
-          <w:rFonts w:ascii="Arial" w:eastAsia="Calibri" w:hAnsi="Arial" w:cs="Arial"/>
-          <w:color w:val="000000"/>
-          <w:sz w:val="20"/>
-          <w:szCs w:val="20"/>
-        </w:rPr>
-        <w:t xml:space="preserve"> </w:t>
-      </w:r>
-      <w:r>
-        <w:rPr>
-          <w:rFonts w:ascii="Arial" w:eastAsia="Calibri" w:hAnsi="Arial" w:cs="Arial"/>
-          <w:color w:val="000000"/>
-          <w:sz w:val="20"/>
-          <w:szCs w:val="20"/>
-        </w:rPr>
-        <w:t>| SQL, Unix, Git</w:t>
+        <w:t xml:space="preserve">Python, HTML, MATLAB | </w:t>
+      </w:r>
+      <w:r>
+        <w:rPr>
+          <w:rFonts w:ascii="Arial" w:eastAsia="Calibri" w:hAnsi="Arial" w:cs="Arial"/>
+          <w:color w:val="000000"/>
+          <w:sz w:val="20"/>
+          <w:szCs w:val="20"/>
+        </w:rPr>
+        <w:t>|</w:t>
+      </w:r>
+      <w:r>
+        <w:rPr>
+          <w:rFonts w:ascii="Arial" w:eastAsia="Calibri" w:hAnsi="Arial" w:cs="Arial"/>
+          <w:color w:val="000000"/>
+          <w:sz w:val="20"/>
+          <w:szCs w:val="20"/>
+        </w:rPr>
+        <w:t xml:space="preserve"> SQL, Unix, Git</w:t>
       </w:r>
     </w:p>
     <w:p>
@@ -652,16 +710,110 @@
           <w:sz w:val="20"/>
           <w:szCs w:val="20"/>
         </w:rPr>
-        <w:t>Intermediate (3-7years)</w:t>
-      </w:r>
-      <w:r>
-        <w:rPr>
-          <w:rFonts w:ascii="Arial" w:eastAsia="Calibri" w:hAnsi="Arial" w:cs="Arial"/>
-          <w:color w:val="000000"/>
-          <w:sz w:val="20"/>
-          <w:szCs w:val="20"/>
-        </w:rPr>
-        <w:t>: PHP, JavaScript, CSS, Haskell, C | D</w:t>
+        <w:t>Intermediate (3-</w:t>
+      </w:r>
+      <w:r>
+        <w:rPr>
+          <w:rFonts w:ascii="Arial" w:eastAsia="Calibri" w:hAnsi="Arial" w:cs="Arial"/>
+          <w:b/>
+          <w:bCs/>
+          <w:color w:val="000000"/>
+          <w:sz w:val="20"/>
+          <w:szCs w:val="20"/>
+        </w:rPr>
+        <w:t>5</w:t>
+      </w:r>
+      <w:r>
+        <w:rPr>
+          <w:rFonts w:ascii="Arial" w:eastAsia="Calibri" w:hAnsi="Arial" w:cs="Arial"/>
+          <w:b/>
+          <w:bCs/>
+          <w:color w:val="000000"/>
+          <w:sz w:val="20"/>
+          <w:szCs w:val="20"/>
+        </w:rPr>
+        <w:t>years)</w:t>
+      </w:r>
+      <w:r>
+        <w:rPr>
+          <w:rFonts w:ascii="Arial" w:eastAsia="Calibri" w:hAnsi="Arial" w:cs="Arial"/>
+          <w:color w:val="000000"/>
+          <w:sz w:val="20"/>
+          <w:szCs w:val="20"/>
+        </w:rPr>
+        <w:t xml:space="preserve">: </w:t>
+      </w:r>
+      <w:r>
+        <w:rPr>
+          <w:rFonts w:ascii="Arial" w:eastAsia="Calibri" w:hAnsi="Arial" w:cs="Arial"/>
+          <w:color w:val="000000"/>
+          <w:sz w:val="20"/>
+          <w:szCs w:val="20"/>
+        </w:rPr>
+        <w:t>Java</w:t>
+      </w:r>
+      <w:r>
+        <w:rPr>
+          <w:rFonts w:ascii="Arial" w:eastAsia="Calibri" w:hAnsi="Arial" w:cs="Arial"/>
+          <w:color w:val="000000"/>
+          <w:sz w:val="20"/>
+          <w:szCs w:val="20"/>
+        </w:rPr>
+        <w:t xml:space="preserve">, </w:t>
+      </w:r>
+      <w:r>
+        <w:rPr>
+          <w:rFonts w:ascii="Arial" w:eastAsia="Calibri" w:hAnsi="Arial" w:cs="Arial"/>
+          <w:color w:val="000000"/>
+          <w:sz w:val="20"/>
+          <w:szCs w:val="20"/>
+        </w:rPr>
+        <w:t>PHP, JavaScript, CSS, Haskell</w:t>
+      </w:r>
+      <w:r>
+        <w:rPr>
+          <w:rFonts w:ascii="Arial" w:eastAsia="Calibri" w:hAnsi="Arial" w:cs="Arial"/>
+          <w:color w:val="000000"/>
+          <w:sz w:val="20"/>
+          <w:szCs w:val="20"/>
+        </w:rPr>
+        <w:t xml:space="preserve"> </w:t>
+      </w:r>
+      <w:r>
+        <w:rPr>
+          <w:rFonts w:ascii="Arial" w:eastAsia="Calibri" w:hAnsi="Arial" w:cs="Arial"/>
+          <w:color w:val="000000"/>
+          <w:sz w:val="20"/>
+          <w:szCs w:val="20"/>
+        </w:rPr>
+        <w:t xml:space="preserve">| </w:t>
+      </w:r>
+      <w:r>
+        <w:rPr>
+          <w:rFonts w:ascii="Arial" w:eastAsia="Calibri" w:hAnsi="Arial" w:cs="Arial"/>
+          <w:color w:val="000000"/>
+          <w:sz w:val="20"/>
+          <w:szCs w:val="20"/>
+        </w:rPr>
+        <w:t>Django</w:t>
+      </w:r>
+      <w:r>
+        <w:rPr>
+          <w:rFonts w:ascii="Arial" w:eastAsia="Calibri" w:hAnsi="Arial" w:cs="Arial"/>
+          <w:color w:val="000000"/>
+          <w:sz w:val="20"/>
+          <w:szCs w:val="20"/>
+        </w:rPr>
+        <w:t xml:space="preserve">, </w:t>
+      </w:r>
+      <w:r>
+        <w:rPr>
+          <w:rFonts w:ascii="Arial" w:eastAsia="Calibri" w:hAnsi="Arial" w:cs="Arial"/>
+          <w:color w:val="000000"/>
+          <w:sz w:val="20"/>
+          <w:szCs w:val="20"/>
+        </w:rPr>
+        <w:t>D</w:t>
       </w:r>
       <w:r>
         <w:rPr>
@@ -775,7 +927,43 @@
           <w:sz w:val="20"/>
           <w:szCs w:val="20"/>
         </w:rPr>
-        <w:t xml:space="preserve">Ruby, Bash, C#, MIPS, Scala | </w:t>
+        <w:t>Bash</w:t>
+      </w:r>
+      <w:r>
+        <w:rPr>
+          <w:rFonts w:ascii="Arial" w:eastAsia="Calibri" w:hAnsi="Arial" w:cs="Arial"/>
+          <w:color w:val="000000"/>
+          <w:sz w:val="20"/>
+          <w:szCs w:val="20"/>
+        </w:rPr>
+        <w:t>, Ruby,</w:t>
+      </w:r>
+      <w:r>
+        <w:rPr>
+          <w:rFonts w:ascii="Arial" w:eastAsia="Calibri" w:hAnsi="Arial" w:cs="Arial"/>
+          <w:color w:val="000000"/>
+          <w:sz w:val="20"/>
+          <w:szCs w:val="20"/>
+        </w:rPr>
+        <w:t xml:space="preserve"> C#, </w:t>
+      </w:r>
+      <w:r>
+        <w:rPr>
+          <w:rFonts w:ascii="Arial" w:eastAsia="Calibri" w:hAnsi="Arial" w:cs="Arial"/>
+          <w:color w:val="000000"/>
+          <w:sz w:val="20"/>
+          <w:szCs w:val="20"/>
+        </w:rPr>
+        <w:t xml:space="preserve">C, </w:t>
+      </w:r>
+      <w:r>
+        <w:rPr>
+          <w:rFonts w:ascii="Arial" w:eastAsia="Calibri" w:hAnsi="Arial" w:cs="Arial"/>
+          <w:color w:val="000000"/>
+          <w:sz w:val="20"/>
+          <w:szCs w:val="20"/>
+        </w:rPr>
+        <w:t xml:space="preserve">MIPS, Scala | </w:t>
       </w:r>
       <w:r>
         <w:rPr>
@@ -2025,47 +2213,7 @@
           <w:sz w:val="20"/>
           <w:szCs w:val="20"/>
         </w:rPr>
-        <w:t xml:space="preserve">My Mona Lisa: A </w:t>
-      </w:r>
-      <w:r>
-        <w:rPr>
-          <w:rFonts w:ascii="Arial" w:eastAsia="Calibri" w:hAnsi="Arial" w:cs="Arial"/>
-          <w:b/>
-          <w:color w:val="000000"/>
-          <w:sz w:val="20"/>
-          <w:szCs w:val="20"/>
-        </w:rPr>
-        <w:t xml:space="preserve">Personal </w:t>
-      </w:r>
-      <w:r>
-        <w:rPr>
-          <w:rFonts w:ascii="Arial" w:eastAsia="Calibri" w:hAnsi="Arial" w:cs="Arial"/>
-          <w:b/>
-          <w:color w:val="000000"/>
-          <w:sz w:val="20"/>
-          <w:szCs w:val="20"/>
-        </w:rPr>
-        <w:t>W</w:t>
-      </w:r>
-      <w:r>
-        <w:rPr>
-          <w:rFonts w:ascii="Arial" w:eastAsia="Calibri" w:hAnsi="Arial" w:cs="Arial"/>
-          <w:b/>
-          <w:color w:val="000000"/>
-          <w:sz w:val="20"/>
-          <w:szCs w:val="20"/>
-        </w:rPr>
-        <w:t>ebsite</w:t>
-      </w:r>
-      <w:r>
-        <w:rPr>
-          <w:rFonts w:ascii="Arial" w:eastAsia="Calibri" w:hAnsi="Arial" w:cs="Arial"/>
-          <w:b/>
-          <w:color w:val="000000"/>
-          <w:sz w:val="20"/>
-          <w:szCs w:val="20"/>
-        </w:rPr>
-        <w:t xml:space="preserve"> / </w:t>
+        <w:t xml:space="preserve">AutoJobGPT: Applications Made Easy / </w:t>
       </w:r>
       <w:hyperlink r:id="rId10" w:history="1">
         <w:r>
@@ -2076,7 +2224,487 @@
             <w:sz w:val="20"/>
             <w:szCs w:val="20"/>
           </w:rPr>
-          <w:t>https://rmsy.me/projects/website/</w:t>
+          <w:t>https://rmsy.me/projects/autojobgpt</w:t>
+        </w:r>
+      </w:hyperlink>
+    </w:p>
+    <w:p>
+      <w:pPr>
+        <w:pStyle w:val="ListParagraph"/>
+        <w:numPr>
+          <w:ilvl w:val="0"/>
+          <w:numId w:val="7"/>
+        </w:numPr>
+        <w:pBdr>
+          <w:top w:val="nil"/>
+          <w:left w:val="nil"/>
+          <w:bottom w:val="nil"/>
+          <w:right w:val="nil"/>
+          <w:between w:val="nil"/>
+        </w:pBdr>
+        <w:rPr>
+          <w:rFonts w:ascii="Arial" w:eastAsia="Calibri" w:hAnsi="Arial" w:cs="Arial"/>
+          <w:bCs/>
+          <w:color w:val="000000"/>
+          <w:sz w:val="20"/>
+          <w:szCs w:val="20"/>
+        </w:rPr>
+      </w:pPr>
+      <w:r>
+        <w:rPr>
+          <w:rFonts w:ascii="Arial" w:eastAsia="Calibri" w:hAnsi="Arial" w:cs="Arial"/>
+          <w:bCs/>
+          <w:color w:val="000000"/>
+          <w:sz w:val="20"/>
+          <w:szCs w:val="20"/>
+        </w:rPr>
+        <w:t>Developed job</w:t>
+      </w:r>
+      <w:r>
+        <w:rPr>
+          <w:rFonts w:ascii="Arial" w:eastAsia="Calibri" w:hAnsi="Arial" w:cs="Arial"/>
+          <w:bCs/>
+          <w:color w:val="000000"/>
+          <w:sz w:val="20"/>
+          <w:szCs w:val="20"/>
+        </w:rPr>
+        <w:t xml:space="preserve"> application</w:t>
+      </w:r>
+      <w:r>
+        <w:rPr>
+          <w:rFonts w:ascii="Arial" w:eastAsia="Calibri" w:hAnsi="Arial" w:cs="Arial"/>
+          <w:bCs/>
+          <w:color w:val="000000"/>
+          <w:sz w:val="20"/>
+          <w:szCs w:val="20"/>
+        </w:rPr>
+        <w:t xml:space="preserve"> kanban board </w:t>
+      </w:r>
+      <w:r>
+        <w:rPr>
+          <w:rFonts w:ascii="Arial" w:eastAsia="Calibri" w:hAnsi="Arial" w:cs="Arial"/>
+          <w:bCs/>
+          <w:color w:val="000000"/>
+          <w:sz w:val="20"/>
+          <w:szCs w:val="20"/>
+        </w:rPr>
+        <w:t xml:space="preserve">with </w:t>
+      </w:r>
+      <w:r>
+        <w:rPr>
+          <w:rFonts w:ascii="Arial" w:eastAsia="Calibri" w:hAnsi="Arial" w:cs="Arial"/>
+          <w:bCs/>
+          <w:color w:val="000000"/>
+          <w:sz w:val="20"/>
+          <w:szCs w:val="20"/>
+        </w:rPr>
+        <w:t>React TypeScript, Bootstrap</w:t>
+      </w:r>
+      <w:r>
+        <w:rPr>
+          <w:rFonts w:ascii="Arial" w:eastAsia="Calibri" w:hAnsi="Arial" w:cs="Arial"/>
+          <w:bCs/>
+          <w:color w:val="000000"/>
+          <w:sz w:val="20"/>
+          <w:szCs w:val="20"/>
+        </w:rPr>
+        <w:t xml:space="preserve">, </w:t>
+      </w:r>
+      <w:r>
+        <w:rPr>
+          <w:rFonts w:ascii="Arial" w:eastAsia="Calibri" w:hAnsi="Arial" w:cs="Arial"/>
+          <w:bCs/>
+          <w:color w:val="000000"/>
+          <w:sz w:val="20"/>
+          <w:szCs w:val="20"/>
+        </w:rPr>
+        <w:t xml:space="preserve">and </w:t>
+      </w:r>
+      <w:r>
+        <w:rPr>
+          <w:rFonts w:ascii="Arial" w:eastAsia="Calibri" w:hAnsi="Arial" w:cs="Arial"/>
+          <w:bCs/>
+          <w:color w:val="000000"/>
+          <w:sz w:val="20"/>
+          <w:szCs w:val="20"/>
+        </w:rPr>
+        <w:t>Django</w:t>
+      </w:r>
+      <w:r>
+        <w:rPr>
+          <w:rFonts w:ascii="Arial" w:eastAsia="Calibri" w:hAnsi="Arial" w:cs="Arial"/>
+          <w:bCs/>
+          <w:color w:val="000000"/>
+          <w:sz w:val="20"/>
+          <w:szCs w:val="20"/>
+        </w:rPr>
+        <w:t xml:space="preserve"> REST Framework.</w:t>
+      </w:r>
+      <w:r>
+        <w:rPr>
+          <w:rFonts w:ascii="Arial" w:eastAsia="Calibri" w:hAnsi="Arial" w:cs="Arial"/>
+          <w:bCs/>
+          <w:color w:val="000000"/>
+          <w:sz w:val="20"/>
+          <w:szCs w:val="20"/>
+        </w:rPr>
+        <w:t xml:space="preserve"> </w:t>
+      </w:r>
+    </w:p>
+    <w:p>
+      <w:pPr>
+        <w:pStyle w:val="ListParagraph"/>
+        <w:numPr>
+          <w:ilvl w:val="0"/>
+          <w:numId w:val="7"/>
+        </w:numPr>
+        <w:pBdr>
+          <w:top w:val="nil"/>
+          <w:left w:val="nil"/>
+          <w:bottom w:val="nil"/>
+          <w:right w:val="nil"/>
+          <w:between w:val="nil"/>
+        </w:pBdr>
+        <w:rPr>
+          <w:rFonts w:ascii="Arial" w:eastAsia="Calibri" w:hAnsi="Arial" w:cs="Arial"/>
+          <w:bCs/>
+          <w:color w:val="000000"/>
+          <w:sz w:val="20"/>
+          <w:szCs w:val="20"/>
+        </w:rPr>
+      </w:pPr>
+      <w:r>
+        <w:rPr>
+          <w:rFonts w:ascii="Arial" w:eastAsia="Calibri" w:hAnsi="Arial" w:cs="Arial"/>
+          <w:bCs/>
+          <w:color w:val="000000"/>
+          <w:sz w:val="20"/>
+          <w:szCs w:val="20"/>
+        </w:rPr>
+        <w:t xml:space="preserve">Implemented .docx file handling </w:t>
+      </w:r>
+      <w:r>
+        <w:rPr>
+          <w:rFonts w:ascii="Arial" w:eastAsia="Calibri" w:hAnsi="Arial" w:cs="Arial"/>
+          <w:bCs/>
+          <w:color w:val="000000"/>
+          <w:sz w:val="20"/>
+          <w:szCs w:val="20"/>
+        </w:rPr>
+        <w:t xml:space="preserve">for </w:t>
+      </w:r>
+      <w:r>
+        <w:rPr>
+          <w:rFonts w:ascii="Arial" w:eastAsia="Calibri" w:hAnsi="Arial" w:cs="Arial"/>
+          <w:bCs/>
+          <w:color w:val="000000"/>
+          <w:sz w:val="20"/>
+          <w:szCs w:val="20"/>
+        </w:rPr>
+        <w:t>template uploads</w:t>
+      </w:r>
+      <w:r>
+        <w:rPr>
+          <w:rFonts w:ascii="Arial" w:eastAsia="Calibri" w:hAnsi="Arial" w:cs="Arial"/>
+          <w:bCs/>
+          <w:color w:val="000000"/>
+          <w:sz w:val="20"/>
+          <w:szCs w:val="20"/>
+        </w:rPr>
+        <w:t xml:space="preserve"> and </w:t>
+      </w:r>
+      <w:r>
+        <w:rPr>
+          <w:rFonts w:ascii="Arial" w:eastAsia="Calibri" w:hAnsi="Arial" w:cs="Arial"/>
+          <w:bCs/>
+          <w:color w:val="000000"/>
+          <w:sz w:val="20"/>
+          <w:szCs w:val="20"/>
+        </w:rPr>
+        <w:t>allow</w:t>
+      </w:r>
+      <w:r>
+        <w:rPr>
+          <w:rFonts w:ascii="Arial" w:eastAsia="Calibri" w:hAnsi="Arial" w:cs="Arial"/>
+          <w:bCs/>
+          <w:color w:val="000000"/>
+          <w:sz w:val="20"/>
+          <w:szCs w:val="20"/>
+        </w:rPr>
+        <w:t>ed user</w:t>
+      </w:r>
+      <w:r>
+        <w:rPr>
+          <w:rFonts w:ascii="Arial" w:eastAsia="Calibri" w:hAnsi="Arial" w:cs="Arial"/>
+          <w:bCs/>
+          <w:color w:val="000000"/>
+          <w:sz w:val="20"/>
+          <w:szCs w:val="20"/>
+        </w:rPr>
+        <w:t xml:space="preserve"> customi</w:t>
+      </w:r>
+      <w:r>
+        <w:rPr>
+          <w:rFonts w:ascii="Arial" w:eastAsia="Calibri" w:hAnsi="Arial" w:cs="Arial"/>
+          <w:bCs/>
+          <w:color w:val="000000"/>
+          <w:sz w:val="20"/>
+          <w:szCs w:val="20"/>
+        </w:rPr>
+        <w:t>s</w:t>
+      </w:r>
+      <w:r>
+        <w:rPr>
+          <w:rFonts w:ascii="Arial" w:eastAsia="Calibri" w:hAnsi="Arial" w:cs="Arial"/>
+          <w:bCs/>
+          <w:color w:val="000000"/>
+          <w:sz w:val="20"/>
+          <w:szCs w:val="20"/>
+        </w:rPr>
+        <w:t xml:space="preserve">ation </w:t>
+      </w:r>
+      <w:r>
+        <w:rPr>
+          <w:rFonts w:ascii="Arial" w:eastAsia="Calibri" w:hAnsi="Arial" w:cs="Arial"/>
+          <w:bCs/>
+          <w:color w:val="000000"/>
+          <w:sz w:val="20"/>
+          <w:szCs w:val="20"/>
+        </w:rPr>
+        <w:t>of uploaded templates</w:t>
+      </w:r>
+      <w:r>
+        <w:rPr>
+          <w:rFonts w:ascii="Arial" w:eastAsia="Calibri" w:hAnsi="Arial" w:cs="Arial"/>
+          <w:bCs/>
+          <w:color w:val="000000"/>
+          <w:sz w:val="20"/>
+          <w:szCs w:val="20"/>
+        </w:rPr>
+        <w:t>.</w:t>
+      </w:r>
+    </w:p>
+    <w:p>
+      <w:pPr>
+        <w:pStyle w:val="ListParagraph"/>
+        <w:numPr>
+          <w:ilvl w:val="0"/>
+          <w:numId w:val="7"/>
+        </w:numPr>
+        <w:pBdr>
+          <w:top w:val="nil"/>
+          <w:left w:val="nil"/>
+          <w:bottom w:val="nil"/>
+          <w:right w:val="nil"/>
+          <w:between w:val="nil"/>
+        </w:pBdr>
+        <w:rPr>
+          <w:rFonts w:ascii="Arial" w:eastAsia="Calibri" w:hAnsi="Arial" w:cs="Arial"/>
+          <w:b/>
+          <w:color w:val="000000"/>
+          <w:sz w:val="20"/>
+          <w:szCs w:val="20"/>
+        </w:rPr>
+      </w:pPr>
+      <w:r>
+        <w:rPr>
+          <w:rFonts w:ascii="Arial" w:eastAsia="Calibri" w:hAnsi="Arial" w:cs="Arial"/>
+          <w:bCs/>
+          <w:color w:val="000000"/>
+          <w:sz w:val="20"/>
+          <w:szCs w:val="20"/>
+        </w:rPr>
+        <w:t>Leveraged OpenAI API to p</w:t>
+      </w:r>
+      <w:r>
+        <w:rPr>
+          <w:rFonts w:ascii="Arial" w:eastAsia="Calibri" w:hAnsi="Arial" w:cs="Arial"/>
+          <w:bCs/>
+          <w:color w:val="000000"/>
+          <w:sz w:val="20"/>
+          <w:szCs w:val="20"/>
+        </w:rPr>
+        <w:t>ionee</w:t>
+      </w:r>
+      <w:r>
+        <w:rPr>
+          <w:rFonts w:ascii="Arial" w:eastAsia="Calibri" w:hAnsi="Arial" w:cs="Arial"/>
+          <w:bCs/>
+          <w:color w:val="000000"/>
+          <w:sz w:val="20"/>
+          <w:szCs w:val="20"/>
+        </w:rPr>
+        <w:t>r</w:t>
+      </w:r>
+      <w:r>
+        <w:rPr>
+          <w:rFonts w:ascii="Arial" w:eastAsia="Calibri" w:hAnsi="Arial" w:cs="Arial"/>
+          <w:bCs/>
+          <w:color w:val="000000"/>
+          <w:sz w:val="20"/>
+          <w:szCs w:val="20"/>
+        </w:rPr>
+        <w:t xml:space="preserve"> AI-driven</w:t>
+      </w:r>
+      <w:r>
+        <w:rPr>
+          <w:rFonts w:ascii="Arial" w:eastAsia="Calibri" w:hAnsi="Arial" w:cs="Arial"/>
+          <w:bCs/>
+          <w:color w:val="000000"/>
+          <w:sz w:val="20"/>
+          <w:szCs w:val="20"/>
+        </w:rPr>
+        <w:t xml:space="preserve"> automatic</w:t>
+      </w:r>
+      <w:r>
+        <w:rPr>
+          <w:rFonts w:ascii="Arial" w:eastAsia="Calibri" w:hAnsi="Arial" w:cs="Arial"/>
+          <w:bCs/>
+          <w:color w:val="000000"/>
+          <w:sz w:val="20"/>
+          <w:szCs w:val="20"/>
+        </w:rPr>
+        <w:t xml:space="preserve"> </w:t>
+      </w:r>
+      <w:r>
+        <w:rPr>
+          <w:rFonts w:ascii="Arial" w:eastAsia="Calibri" w:hAnsi="Arial" w:cs="Arial"/>
+          <w:bCs/>
+          <w:color w:val="000000"/>
+          <w:sz w:val="20"/>
+          <w:szCs w:val="20"/>
+        </w:rPr>
+        <w:t>tailoring of resume</w:t>
+      </w:r>
+      <w:r>
+        <w:rPr>
+          <w:rFonts w:ascii="Arial" w:eastAsia="Calibri" w:hAnsi="Arial" w:cs="Arial"/>
+          <w:bCs/>
+          <w:color w:val="000000"/>
+          <w:sz w:val="20"/>
+          <w:szCs w:val="20"/>
+        </w:rPr>
+        <w:t xml:space="preserve">s and </w:t>
+      </w:r>
+      <w:r>
+        <w:rPr>
+          <w:rFonts w:ascii="Arial" w:eastAsia="Calibri" w:hAnsi="Arial" w:cs="Arial"/>
+          <w:bCs/>
+          <w:color w:val="000000"/>
+          <w:sz w:val="20"/>
+          <w:szCs w:val="20"/>
+        </w:rPr>
+        <w:t>cover letters</w:t>
+      </w:r>
+      <w:r>
+        <w:rPr>
+          <w:rFonts w:ascii="Arial" w:eastAsia="Calibri" w:hAnsi="Arial" w:cs="Arial"/>
+          <w:bCs/>
+          <w:color w:val="000000"/>
+          <w:sz w:val="20"/>
+          <w:szCs w:val="20"/>
+        </w:rPr>
+        <w:t xml:space="preserve"> to each job.</w:t>
+      </w:r>
+    </w:p>
+    <w:p>
+      <w:pPr>
+        <w:pBdr>
+          <w:top w:val="nil"/>
+          <w:left w:val="nil"/>
+          <w:bottom w:val="nil"/>
+          <w:right w:val="nil"/>
+          <w:between w:val="nil"/>
+        </w:pBdr>
+        <w:spacing w:before="120"/>
+        <w:rPr>
+          <w:rFonts w:ascii="Arial" w:eastAsia="Calibri" w:hAnsi="Arial" w:cs="Arial"/>
+          <w:b/>
+          <w:color w:val="000000"/>
+          <w:sz w:val="20"/>
+          <w:szCs w:val="20"/>
+        </w:rPr>
+      </w:pPr>
+      <w:r>
+        <w:rPr>
+          <w:rFonts w:ascii="Arial" w:eastAsia="Calibri" w:hAnsi="Arial" w:cs="Arial"/>
+          <w:b/>
+          <w:color w:val="000000"/>
+          <w:sz w:val="20"/>
+          <w:szCs w:val="20"/>
+        </w:rPr>
+        <w:t xml:space="preserve">My Mona Lisa: A </w:t>
+      </w:r>
+      <w:r>
+        <w:rPr>
+          <w:rFonts w:ascii="Arial" w:eastAsia="Calibri" w:hAnsi="Arial" w:cs="Arial"/>
+          <w:b/>
+          <w:color w:val="000000"/>
+          <w:sz w:val="20"/>
+          <w:szCs w:val="20"/>
+        </w:rPr>
+        <w:t xml:space="preserve">Personal </w:t>
+      </w:r>
+      <w:r>
+        <w:rPr>
+          <w:rFonts w:ascii="Arial" w:eastAsia="Calibri" w:hAnsi="Arial" w:cs="Arial"/>
+          <w:b/>
+          <w:color w:val="000000"/>
+          <w:sz w:val="20"/>
+          <w:szCs w:val="20"/>
+        </w:rPr>
+        <w:t>W</w:t>
+      </w:r>
+      <w:r>
+        <w:rPr>
+          <w:rFonts w:ascii="Arial" w:eastAsia="Calibri" w:hAnsi="Arial" w:cs="Arial"/>
+          <w:b/>
+          <w:color w:val="000000"/>
+          <w:sz w:val="20"/>
+          <w:szCs w:val="20"/>
+        </w:rPr>
+        <w:t>ebsite</w:t>
+      </w:r>
+      <w:r>
+        <w:rPr>
+          <w:rFonts w:ascii="Arial" w:eastAsia="Calibri" w:hAnsi="Arial" w:cs="Arial"/>
+          <w:b/>
+          <w:color w:val="000000"/>
+          <w:sz w:val="20"/>
+          <w:szCs w:val="20"/>
+        </w:rPr>
+        <w:t xml:space="preserve"> / </w:t>
+      </w:r>
+      <w:hyperlink r:id="rId11" w:history="1">
+        <w:r>
+          <w:rPr>
+            <w:rStyle w:val="Hyperlink"/>
+            <w:rFonts w:ascii="Arial" w:eastAsia="Calibri" w:hAnsi="Arial" w:cs="Arial"/>
+            <w:b/>
+            <w:sz w:val="20"/>
+            <w:szCs w:val="20"/>
+          </w:rPr>
+          <w:t>https://rmsy.</w:t>
+        </w:r>
+        <w:r>
+          <w:rPr>
+            <w:rStyle w:val="Hyperlink"/>
+            <w:rFonts w:ascii="Arial" w:eastAsia="Calibri" w:hAnsi="Arial" w:cs="Arial"/>
+            <w:b/>
+            <w:sz w:val="20"/>
+            <w:szCs w:val="20"/>
+          </w:rPr>
+          <w:t>m</w:t>
+        </w:r>
+        <w:r>
+          <w:rPr>
+            <w:rStyle w:val="Hyperlink"/>
+            <w:rFonts w:ascii="Arial" w:eastAsia="Calibri" w:hAnsi="Arial" w:cs="Arial"/>
+            <w:b/>
+            <w:sz w:val="20"/>
+            <w:szCs w:val="20"/>
+          </w:rPr>
+          <w:t>e/projects/website/</w:t>
         </w:r>
       </w:hyperlink>
     </w:p>
@@ -2299,6 +2927,9 @@
           <w:right w:val="nil"/>
           <w:between w:val="nil"/>
         </w:pBdr>
+        <w:tabs>
+          <w:tab w:val="right" w:pos="11340"/>
+        </w:tabs>
         <w:spacing w:before="120"/>
         <w:rPr>
           <w:rFonts w:ascii="Arial" w:eastAsia="Calibri" w:hAnsi="Arial" w:cs="Arial"/>
@@ -2318,7 +2949,7 @@
         </w:rPr>
         <w:t xml:space="preserve">Pooptimus Prime: The World's First Dung Beetle Biorobot / </w:t>
       </w:r>
-      <w:hyperlink r:id="rId11" w:history="1">
+      <w:hyperlink r:id="rId12" w:history="1">
         <w:r>
           <w:rPr>
             <w:rStyle w:val="Hyperlink"/>
@@ -2495,6 +3126,25 @@
         <w:pBdr>
           <w:top w:val="nil"/>
           <w:left w:val="nil"/>
+          <w:bottom w:val="single" w:sz="4" w:space="1" w:color="000000"/>
+          <w:right w:val="nil"/>
+          <w:between w:val="nil"/>
+        </w:pBdr>
+        <w:rPr>
+          <w:rFonts w:ascii="Arial" w:eastAsia="Calibri" w:hAnsi="Arial" w:cs="Arial"/>
+          <w:b/>
+          <w:smallCaps/>
+          <w:color w:val="000000"/>
+          <w:sz w:val="20"/>
+          <w:szCs w:val="20"/>
+        </w:rPr>
+      </w:pPr>
+    </w:p>
+    <w:p>
+      <w:pPr>
+        <w:pBdr>
+          <w:top w:val="nil"/>
+          <w:left w:val="nil"/>
           <w:bottom w:val="nil"/>
           <w:right w:val="nil"/>
           <w:between w:val="nil"/>
@@ -2504,40 +3154,321 @@
           <w:rFonts w:ascii="Arial" w:eastAsia="Calibri" w:hAnsi="Arial" w:cs="Arial"/>
           <w:b/>
           <w:color w:val="000000"/>
-          <w:sz w:val="20"/>
-          <w:szCs w:val="20"/>
-        </w:rPr>
-      </w:pPr>
-      <w:r>
-        <w:rPr>
-          <w:rFonts w:ascii="Arial" w:eastAsia="Calibri" w:hAnsi="Arial" w:cs="Arial"/>
-          <w:b/>
-          <w:color w:val="000000"/>
-          <w:sz w:val="20"/>
-          <w:szCs w:val="20"/>
-        </w:rPr>
-        <w:t xml:space="preserve">Robo-Messi: When Silicon Met Soccer / </w:t>
-      </w:r>
-      <w:hyperlink r:id="rId12" w:history="1">
-        <w:r>
-          <w:rPr>
-            <w:rStyle w:val="Hyperlink"/>
-            <w:rFonts w:ascii="Arial" w:eastAsia="Calibri" w:hAnsi="Arial" w:cs="Arial"/>
-            <w:b/>
-            <w:sz w:val="20"/>
-            <w:szCs w:val="20"/>
-          </w:rPr>
-          <w:t>https://rmsy.me/projects/sdp/</w:t>
-        </w:r>
-      </w:hyperlink>
-      <w:r>
-        <w:rPr>
-          <w:rFonts w:ascii="Arial" w:hAnsi="Arial" w:cs="Arial"/>
-          <w:b/>
+          <w:sz w:val="22"/>
+          <w:szCs w:val="22"/>
+        </w:rPr>
+      </w:pPr>
+      <w:r>
+        <w:rPr>
+          <w:rFonts w:ascii="Arial" w:eastAsia="Calibri" w:hAnsi="Arial" w:cs="Arial"/>
+          <w:b/>
+          <w:color w:val="000000"/>
+          <w:sz w:val="22"/>
+          <w:szCs w:val="22"/>
+        </w:rPr>
+        <w:t>EDUCATION</w:t>
+      </w:r>
+    </w:p>
+    <w:p>
+      <w:pPr>
+        <w:pBdr>
+          <w:top w:val="nil"/>
+          <w:left w:val="nil"/>
+          <w:bottom w:val="nil"/>
+          <w:right w:val="nil"/>
+          <w:between w:val="nil"/>
+        </w:pBdr>
+        <w:tabs>
+          <w:tab w:val="right" w:pos="11340"/>
+        </w:tabs>
+        <w:spacing w:before="120"/>
+        <w:rPr>
+          <w:rFonts w:ascii="Arial" w:eastAsia="Calibri" w:hAnsi="Arial" w:cs="Arial"/>
+          <w:b/>
+          <w:color w:val="000000"/>
+          <w:sz w:val="20"/>
+          <w:szCs w:val="20"/>
+        </w:rPr>
+      </w:pPr>
+      <w:r>
+        <w:rPr>
+          <w:rFonts w:ascii="Arial" w:eastAsia="Calibri" w:hAnsi="Arial" w:cs="Arial"/>
+          <w:b/>
+          <w:color w:val="000000"/>
+          <w:sz w:val="20"/>
+          <w:szCs w:val="20"/>
+        </w:rPr>
+        <w:t>Master of Informatics</w:t>
+      </w:r>
+      <w:r>
+        <w:rPr>
+          <w:rFonts w:ascii="Arial" w:eastAsia="Calibri" w:hAnsi="Arial" w:cs="Arial"/>
+          <w:b/>
+          <w:color w:val="000000"/>
+          <w:sz w:val="20"/>
+          <w:szCs w:val="20"/>
+        </w:rPr>
+        <w:t xml:space="preserve"> (</w:t>
+      </w:r>
+      <w:r>
+        <w:rPr>
+          <w:rFonts w:ascii="Arial" w:eastAsia="Calibri" w:hAnsi="Arial" w:cs="Arial"/>
+          <w:b/>
+          <w:color w:val="000000"/>
+          <w:sz w:val="20"/>
+          <w:szCs w:val="20"/>
+        </w:rPr>
+        <w:t>Computer Science &amp; Intelligent Robotics)</w:t>
+      </w:r>
+      <w:r>
+        <w:rPr>
+          <w:rFonts w:ascii="Arial" w:eastAsia="Calibri" w:hAnsi="Arial" w:cs="Arial"/>
+          <w:b/>
+          <w:color w:val="000000"/>
+          <w:sz w:val="20"/>
+          <w:szCs w:val="20"/>
+        </w:rPr>
+        <w:t xml:space="preserve"> /</w:t>
+      </w:r>
+      <w:r>
+        <w:rPr>
+          <w:rFonts w:ascii="Arial" w:eastAsia="Calibri" w:hAnsi="Arial" w:cs="Arial"/>
+          <w:b/>
+          <w:color w:val="000000"/>
           <w:sz w:val="20"/>
           <w:szCs w:val="20"/>
         </w:rPr>
         <w:t xml:space="preserve"> </w:t>
+      </w:r>
+      <w:r>
+        <w:rPr>
+          <w:rFonts w:ascii="Arial" w:eastAsia="Calibri" w:hAnsi="Arial" w:cs="Arial"/>
+          <w:b/>
+          <w:color w:val="000000"/>
+          <w:sz w:val="20"/>
+          <w:szCs w:val="20"/>
+        </w:rPr>
+        <w:t>University of Edinburg</w:t>
+      </w:r>
+      <w:r>
+        <w:rPr>
+          <w:rFonts w:ascii="Arial" w:eastAsia="Calibri" w:hAnsi="Arial" w:cs="Arial"/>
+          <w:b/>
+          <w:color w:val="000000"/>
+          <w:sz w:val="20"/>
+          <w:szCs w:val="20"/>
+        </w:rPr>
+        <w:t>h</w:t>
+      </w:r>
+      <w:r>
+        <w:rPr>
+          <w:rFonts w:ascii="Arial" w:eastAsia="Calibri" w:hAnsi="Arial" w:cs="Arial"/>
+          <w:bCs/>
+          <w:color w:val="000000"/>
+          <w:sz w:val="20"/>
+          <w:szCs w:val="20"/>
+        </w:rPr>
+        <w:tab/>
+      </w:r>
+      <w:r>
+        <w:rPr>
+          <w:rFonts w:ascii="Arial" w:eastAsia="Calibri" w:hAnsi="Arial" w:cs="Arial"/>
+          <w:bCs/>
+          <w:color w:val="000000"/>
+          <w:sz w:val="20"/>
+          <w:szCs w:val="20"/>
+        </w:rPr>
+        <w:t>20</w:t>
+      </w:r>
+      <w:r>
+        <w:rPr>
+          <w:rFonts w:ascii="Arial" w:eastAsia="Calibri" w:hAnsi="Arial" w:cs="Arial"/>
+          <w:bCs/>
+          <w:color w:val="000000"/>
+          <w:sz w:val="20"/>
+          <w:szCs w:val="20"/>
+        </w:rPr>
+        <w:t>13</w:t>
+      </w:r>
+      <w:r>
+        <w:rPr>
+          <w:rFonts w:ascii="Arial" w:eastAsia="Calibri" w:hAnsi="Arial" w:cs="Arial"/>
+          <w:bCs/>
+          <w:color w:val="000000"/>
+          <w:sz w:val="20"/>
+          <w:szCs w:val="20"/>
+        </w:rPr>
+        <w:t xml:space="preserve"> </w:t>
+      </w:r>
+      <w:r>
+        <w:rPr>
+          <w:rFonts w:ascii="Arial" w:eastAsia="Calibri" w:hAnsi="Arial" w:cs="Arial"/>
+          <w:bCs/>
+          <w:color w:val="000000"/>
+          <w:sz w:val="20"/>
+          <w:szCs w:val="20"/>
+        </w:rPr>
+        <w:t>-</w:t>
+      </w:r>
+      <w:r>
+        <w:rPr>
+          <w:rFonts w:ascii="Arial" w:eastAsia="Calibri" w:hAnsi="Arial" w:cs="Arial"/>
+          <w:bCs/>
+          <w:color w:val="000000"/>
+          <w:sz w:val="20"/>
+          <w:szCs w:val="20"/>
+        </w:rPr>
+        <w:t xml:space="preserve"> </w:t>
+      </w:r>
+      <w:r>
+        <w:rPr>
+          <w:rFonts w:ascii="Arial" w:eastAsia="Calibri" w:hAnsi="Arial" w:cs="Arial"/>
+          <w:bCs/>
+          <w:color w:val="000000"/>
+          <w:sz w:val="20"/>
+          <w:szCs w:val="20"/>
+        </w:rPr>
+        <w:t>2018</w:t>
+      </w:r>
+    </w:p>
+    <w:p>
+      <w:pPr>
+        <w:pStyle w:val="ListParagraph"/>
+        <w:numPr>
+          <w:ilvl w:val="0"/>
+          <w:numId w:val="6"/>
+        </w:numPr>
+        <w:pBdr>
+          <w:top w:val="nil"/>
+          <w:left w:val="nil"/>
+          <w:bottom w:val="nil"/>
+          <w:right w:val="nil"/>
+          <w:between w:val="nil"/>
+        </w:pBdr>
+        <w:rPr>
+          <w:rFonts w:ascii="Arial" w:eastAsia="Calibri" w:hAnsi="Arial" w:cs="Arial"/>
+          <w:bCs/>
+          <w:color w:val="000000"/>
+          <w:sz w:val="20"/>
+          <w:szCs w:val="20"/>
+        </w:rPr>
+      </w:pPr>
+      <w:r>
+        <w:rPr>
+          <w:rFonts w:ascii="Arial" w:eastAsia="Calibri" w:hAnsi="Arial" w:cs="Arial"/>
+          <w:bCs/>
+          <w:color w:val="000000"/>
+          <w:sz w:val="20"/>
+          <w:szCs w:val="20"/>
+        </w:rPr>
+        <w:t xml:space="preserve">Graduated with </w:t>
+      </w:r>
+      <w:r>
+        <w:rPr>
+          <w:rFonts w:ascii="Arial" w:eastAsia="Calibri" w:hAnsi="Arial" w:cs="Arial"/>
+          <w:bCs/>
+          <w:color w:val="000000"/>
+          <w:sz w:val="20"/>
+          <w:szCs w:val="20"/>
+        </w:rPr>
+        <w:t>First Class Honours</w:t>
+      </w:r>
+      <w:r>
+        <w:rPr>
+          <w:rFonts w:ascii="Arial" w:eastAsia="Calibri" w:hAnsi="Arial" w:cs="Arial"/>
+          <w:bCs/>
+          <w:color w:val="000000"/>
+          <w:sz w:val="20"/>
+          <w:szCs w:val="20"/>
+        </w:rPr>
+        <w:t xml:space="preserve">, achieving </w:t>
+      </w:r>
+      <w:r>
+        <w:rPr>
+          <w:rFonts w:ascii="Arial" w:eastAsia="Calibri" w:hAnsi="Arial" w:cs="Arial"/>
+          <w:color w:val="000000"/>
+          <w:sz w:val="20"/>
+          <w:szCs w:val="20"/>
+        </w:rPr>
+        <w:t>83%-</w:t>
+      </w:r>
+      <w:r>
+        <w:rPr>
+          <w:rFonts w:ascii="Arial" w:eastAsia="Calibri" w:hAnsi="Arial" w:cs="Arial"/>
+          <w:color w:val="000000"/>
+          <w:sz w:val="20"/>
+          <w:szCs w:val="20"/>
+        </w:rPr>
+        <w:t>100</w:t>
+      </w:r>
+      <w:r>
+        <w:rPr>
+          <w:rFonts w:ascii="Arial" w:eastAsia="Calibri" w:hAnsi="Arial" w:cs="Arial"/>
+          <w:color w:val="000000"/>
+          <w:sz w:val="20"/>
+          <w:szCs w:val="20"/>
+        </w:rPr>
+        <w:t xml:space="preserve">% in all </w:t>
+      </w:r>
+      <w:r>
+        <w:rPr>
+          <w:rFonts w:ascii="Arial" w:eastAsia="Calibri" w:hAnsi="Arial" w:cs="Arial"/>
+          <w:color w:val="000000"/>
+          <w:sz w:val="20"/>
+          <w:szCs w:val="20"/>
+        </w:rPr>
+        <w:t>10</w:t>
+      </w:r>
+      <w:r>
+        <w:rPr>
+          <w:rFonts w:ascii="Arial" w:eastAsia="Calibri" w:hAnsi="Arial" w:cs="Arial"/>
+          <w:color w:val="000000"/>
+          <w:sz w:val="20"/>
+          <w:szCs w:val="20"/>
+        </w:rPr>
+        <w:t xml:space="preserve"> </w:t>
+      </w:r>
+      <w:r>
+        <w:rPr>
+          <w:rFonts w:ascii="Arial" w:eastAsia="Calibri" w:hAnsi="Arial" w:cs="Arial"/>
+          <w:color w:val="000000"/>
+          <w:sz w:val="20"/>
+          <w:szCs w:val="20"/>
+        </w:rPr>
+        <w:t>software engineering courses.</w:t>
+      </w:r>
+    </w:p>
+    <w:p>
+      <w:pPr>
+        <w:pStyle w:val="ListParagraph"/>
+        <w:numPr>
+          <w:ilvl w:val="0"/>
+          <w:numId w:val="6"/>
+        </w:numPr>
+        <w:pBdr>
+          <w:top w:val="nil"/>
+          <w:left w:val="nil"/>
+          <w:bottom w:val="nil"/>
+          <w:right w:val="nil"/>
+          <w:between w:val="nil"/>
+        </w:pBdr>
+        <w:rPr>
+          <w:rFonts w:ascii="Arial" w:eastAsia="Calibri" w:hAnsi="Arial" w:cs="Arial"/>
+          <w:bCs/>
+          <w:color w:val="000000"/>
+          <w:sz w:val="20"/>
+          <w:szCs w:val="20"/>
+        </w:rPr>
+      </w:pPr>
+      <w:r>
+        <w:rPr>
+          <w:rFonts w:ascii="Arial" w:eastAsia="Calibri" w:hAnsi="Arial" w:cs="Arial"/>
+          <w:bCs/>
+          <w:color w:val="000000"/>
+          <w:sz w:val="20"/>
+          <w:szCs w:val="20"/>
+        </w:rPr>
+        <w:t>Awarded British Computer Society (BCS) Prize for Top Performance in Professional Issues (99%).</w:t>
       </w:r>
     </w:p>
     <w:p>
@@ -2587,454 +3518,6 @@
           <w:szCs w:val="20"/>
         </w:rPr>
         <w:t>.</w:t>
-      </w:r>
-    </w:p>
-    <w:p>
-      <w:pPr>
-        <w:pStyle w:val="ListParagraph"/>
-        <w:numPr>
-          <w:ilvl w:val="0"/>
-          <w:numId w:val="2"/>
-        </w:numPr>
-        <w:pBdr>
-          <w:top w:val="nil"/>
-          <w:left w:val="nil"/>
-          <w:bottom w:val="nil"/>
-          <w:right w:val="nil"/>
-          <w:between w:val="nil"/>
-        </w:pBdr>
-        <w:rPr>
-          <w:rFonts w:ascii="Arial" w:eastAsia="Calibri" w:hAnsi="Arial" w:cs="Arial"/>
-          <w:color w:val="000000"/>
-          <w:sz w:val="20"/>
-          <w:szCs w:val="20"/>
-        </w:rPr>
-      </w:pPr>
-      <w:r>
-        <w:rPr>
-          <w:rFonts w:ascii="Arial" w:eastAsia="Calibri" w:hAnsi="Arial" w:cs="Arial"/>
-          <w:color w:val="000000"/>
-          <w:sz w:val="20"/>
-          <w:szCs w:val="20"/>
-        </w:rPr>
-        <w:t>Earned annual prize for best presentation</w:t>
-      </w:r>
-      <w:r>
-        <w:rPr>
-          <w:rFonts w:ascii="Arial" w:eastAsia="Calibri" w:hAnsi="Arial" w:cs="Arial"/>
-          <w:color w:val="000000"/>
-          <w:sz w:val="20"/>
-          <w:szCs w:val="20"/>
-        </w:rPr>
-        <w:t xml:space="preserve"> in the year</w:t>
-      </w:r>
-      <w:r>
-        <w:rPr>
-          <w:rFonts w:ascii="Arial" w:eastAsia="Calibri" w:hAnsi="Arial" w:cs="Arial"/>
-          <w:color w:val="000000"/>
-          <w:sz w:val="20"/>
-          <w:szCs w:val="20"/>
-        </w:rPr>
-        <w:t>, largely due to my delivery</w:t>
-      </w:r>
-      <w:r>
-        <w:rPr>
-          <w:rFonts w:ascii="Arial" w:eastAsia="Calibri" w:hAnsi="Arial" w:cs="Arial"/>
-          <w:color w:val="000000"/>
-          <w:sz w:val="20"/>
-          <w:szCs w:val="20"/>
-        </w:rPr>
-        <w:t xml:space="preserve"> of the technical presentation</w:t>
-      </w:r>
-      <w:r>
-        <w:rPr>
-          <w:rFonts w:ascii="Arial" w:eastAsia="Calibri" w:hAnsi="Arial" w:cs="Arial"/>
-          <w:color w:val="000000"/>
-          <w:sz w:val="20"/>
-          <w:szCs w:val="20"/>
-        </w:rPr>
-        <w:t>.</w:t>
-      </w:r>
-    </w:p>
-    <w:p>
-      <w:pPr>
-        <w:pStyle w:val="ListParagraph"/>
-        <w:numPr>
-          <w:ilvl w:val="0"/>
-          <w:numId w:val="2"/>
-        </w:numPr>
-        <w:pBdr>
-          <w:top w:val="nil"/>
-          <w:left w:val="nil"/>
-          <w:bottom w:val="nil"/>
-          <w:right w:val="nil"/>
-          <w:between w:val="nil"/>
-        </w:pBdr>
-        <w:rPr>
-          <w:rFonts w:ascii="Arial" w:eastAsia="Calibri" w:hAnsi="Arial" w:cs="Arial"/>
-          <w:color w:val="000000"/>
-          <w:sz w:val="20"/>
-          <w:szCs w:val="20"/>
-        </w:rPr>
-      </w:pPr>
-      <w:r>
-        <w:rPr>
-          <w:rFonts w:ascii="Arial" w:eastAsia="Calibri" w:hAnsi="Arial" w:cs="Arial"/>
-          <w:color w:val="000000"/>
-          <w:sz w:val="20"/>
-          <w:szCs w:val="20"/>
-        </w:rPr>
-        <w:t>Achieved grade of 88% weighted based on my significant contributions and inspiring leadership.</w:t>
-      </w:r>
-    </w:p>
-    <w:p>
-      <w:pPr>
-        <w:pBdr>
-          <w:top w:val="nil"/>
-          <w:left w:val="nil"/>
-          <w:bottom w:val="single" w:sz="4" w:space="1" w:color="000000"/>
-          <w:right w:val="nil"/>
-          <w:between w:val="nil"/>
-        </w:pBdr>
-        <w:rPr>
-          <w:rFonts w:ascii="Arial" w:eastAsia="Calibri" w:hAnsi="Arial" w:cs="Arial"/>
-          <w:b/>
-          <w:smallCaps/>
-          <w:color w:val="000000"/>
-          <w:sz w:val="20"/>
-          <w:szCs w:val="20"/>
-        </w:rPr>
-      </w:pPr>
-    </w:p>
-    <w:p>
-      <w:pPr>
-        <w:pBdr>
-          <w:top w:val="nil"/>
-          <w:left w:val="nil"/>
-          <w:bottom w:val="nil"/>
-          <w:right w:val="nil"/>
-          <w:between w:val="nil"/>
-        </w:pBdr>
-        <w:spacing w:before="120"/>
-        <w:rPr>
-          <w:rFonts w:ascii="Arial" w:eastAsia="Calibri" w:hAnsi="Arial" w:cs="Arial"/>
-          <w:b/>
-          <w:color w:val="000000"/>
-          <w:sz w:val="22"/>
-          <w:szCs w:val="22"/>
-        </w:rPr>
-      </w:pPr>
-      <w:r>
-        <w:rPr>
-          <w:rFonts w:ascii="Arial" w:eastAsia="Calibri" w:hAnsi="Arial" w:cs="Arial"/>
-          <w:b/>
-          <w:color w:val="000000"/>
-          <w:sz w:val="22"/>
-          <w:szCs w:val="22"/>
-        </w:rPr>
-        <w:t>EDUCATION</w:t>
-      </w:r>
-    </w:p>
-    <w:p>
-      <w:pPr>
-        <w:pBdr>
-          <w:top w:val="nil"/>
-          <w:left w:val="nil"/>
-          <w:bottom w:val="nil"/>
-          <w:right w:val="nil"/>
-          <w:between w:val="nil"/>
-        </w:pBdr>
-        <w:tabs>
-          <w:tab w:val="right" w:pos="11340"/>
-        </w:tabs>
-        <w:spacing w:before="120"/>
-        <w:rPr>
-          <w:rFonts w:ascii="Arial" w:eastAsia="Calibri" w:hAnsi="Arial" w:cs="Arial"/>
-          <w:b/>
-          <w:color w:val="000000"/>
-          <w:sz w:val="20"/>
-          <w:szCs w:val="20"/>
-        </w:rPr>
-      </w:pPr>
-      <w:r>
-        <w:rPr>
-          <w:rFonts w:ascii="Arial" w:eastAsia="Calibri" w:hAnsi="Arial" w:cs="Arial"/>
-          <w:b/>
-          <w:color w:val="000000"/>
-          <w:sz w:val="20"/>
-          <w:szCs w:val="20"/>
-        </w:rPr>
-        <w:t>Master of Informatics</w:t>
-      </w:r>
-      <w:r>
-        <w:rPr>
-          <w:rFonts w:ascii="Arial" w:eastAsia="Calibri" w:hAnsi="Arial" w:cs="Arial"/>
-          <w:b/>
-          <w:color w:val="000000"/>
-          <w:sz w:val="20"/>
-          <w:szCs w:val="20"/>
-        </w:rPr>
-        <w:t xml:space="preserve"> (</w:t>
-      </w:r>
-      <w:r>
-        <w:rPr>
-          <w:rFonts w:ascii="Arial" w:eastAsia="Calibri" w:hAnsi="Arial" w:cs="Arial"/>
-          <w:b/>
-          <w:color w:val="000000"/>
-          <w:sz w:val="20"/>
-          <w:szCs w:val="20"/>
-        </w:rPr>
-        <w:t>Computer Science &amp; Intelligent Robotics)</w:t>
-      </w:r>
-      <w:r>
-        <w:rPr>
-          <w:rFonts w:ascii="Arial" w:eastAsia="Calibri" w:hAnsi="Arial" w:cs="Arial"/>
-          <w:b/>
-          <w:color w:val="000000"/>
-          <w:sz w:val="20"/>
-          <w:szCs w:val="20"/>
-        </w:rPr>
-        <w:t xml:space="preserve"> /</w:t>
-      </w:r>
-      <w:r>
-        <w:rPr>
-          <w:rFonts w:ascii="Arial" w:eastAsia="Calibri" w:hAnsi="Arial" w:cs="Arial"/>
-          <w:b/>
-          <w:color w:val="000000"/>
-          <w:sz w:val="20"/>
-          <w:szCs w:val="20"/>
-        </w:rPr>
-        <w:t xml:space="preserve"> </w:t>
-      </w:r>
-      <w:r>
-        <w:rPr>
-          <w:rFonts w:ascii="Arial" w:eastAsia="Calibri" w:hAnsi="Arial" w:cs="Arial"/>
-          <w:b/>
-          <w:color w:val="000000"/>
-          <w:sz w:val="20"/>
-          <w:szCs w:val="20"/>
-        </w:rPr>
-        <w:t>University of Edinburg</w:t>
-      </w:r>
-      <w:r>
-        <w:rPr>
-          <w:rFonts w:ascii="Arial" w:eastAsia="Calibri" w:hAnsi="Arial" w:cs="Arial"/>
-          <w:b/>
-          <w:color w:val="000000"/>
-          <w:sz w:val="20"/>
-          <w:szCs w:val="20"/>
-        </w:rPr>
-        <w:t>h</w:t>
-      </w:r>
-      <w:r>
-        <w:rPr>
-          <w:rFonts w:ascii="Arial" w:eastAsia="Calibri" w:hAnsi="Arial" w:cs="Arial"/>
-          <w:bCs/>
-          <w:color w:val="000000"/>
-          <w:sz w:val="20"/>
-          <w:szCs w:val="20"/>
-        </w:rPr>
-        <w:tab/>
-      </w:r>
-      <w:r>
-        <w:rPr>
-          <w:rFonts w:ascii="Arial" w:eastAsia="Calibri" w:hAnsi="Arial" w:cs="Arial"/>
-          <w:bCs/>
-          <w:color w:val="000000"/>
-          <w:sz w:val="20"/>
-          <w:szCs w:val="20"/>
-        </w:rPr>
-        <w:t>20</w:t>
-      </w:r>
-      <w:r>
-        <w:rPr>
-          <w:rFonts w:ascii="Arial" w:eastAsia="Calibri" w:hAnsi="Arial" w:cs="Arial"/>
-          <w:bCs/>
-          <w:color w:val="000000"/>
-          <w:sz w:val="20"/>
-          <w:szCs w:val="20"/>
-        </w:rPr>
-        <w:t>13</w:t>
-      </w:r>
-      <w:r>
-        <w:rPr>
-          <w:rFonts w:ascii="Arial" w:eastAsia="Calibri" w:hAnsi="Arial" w:cs="Arial"/>
-          <w:bCs/>
-          <w:color w:val="000000"/>
-          <w:sz w:val="20"/>
-          <w:szCs w:val="20"/>
-        </w:rPr>
-        <w:t xml:space="preserve"> </w:t>
-      </w:r>
-      <w:r>
-        <w:rPr>
-          <w:rFonts w:ascii="Arial" w:eastAsia="Calibri" w:hAnsi="Arial" w:cs="Arial"/>
-          <w:bCs/>
-          <w:color w:val="000000"/>
-          <w:sz w:val="20"/>
-          <w:szCs w:val="20"/>
-        </w:rPr>
-        <w:t>-</w:t>
-      </w:r>
-      <w:r>
-        <w:rPr>
-          <w:rFonts w:ascii="Arial" w:eastAsia="Calibri" w:hAnsi="Arial" w:cs="Arial"/>
-          <w:bCs/>
-          <w:color w:val="000000"/>
-          <w:sz w:val="20"/>
-          <w:szCs w:val="20"/>
-        </w:rPr>
-        <w:t xml:space="preserve"> </w:t>
-      </w:r>
-      <w:r>
-        <w:rPr>
-          <w:rFonts w:ascii="Arial" w:eastAsia="Calibri" w:hAnsi="Arial" w:cs="Arial"/>
-          <w:bCs/>
-          <w:color w:val="000000"/>
-          <w:sz w:val="20"/>
-          <w:szCs w:val="20"/>
-        </w:rPr>
-        <w:t>2018</w:t>
-      </w:r>
-    </w:p>
-    <w:p>
-      <w:pPr>
-        <w:pStyle w:val="ListParagraph"/>
-        <w:numPr>
-          <w:ilvl w:val="0"/>
-          <w:numId w:val="6"/>
-        </w:numPr>
-        <w:pBdr>
-          <w:top w:val="nil"/>
-          <w:left w:val="nil"/>
-          <w:bottom w:val="nil"/>
-          <w:right w:val="nil"/>
-          <w:between w:val="nil"/>
-        </w:pBdr>
-        <w:rPr>
-          <w:rFonts w:ascii="Arial" w:eastAsia="Calibri" w:hAnsi="Arial" w:cs="Arial"/>
-          <w:bCs/>
-          <w:color w:val="000000"/>
-          <w:sz w:val="20"/>
-          <w:szCs w:val="20"/>
-        </w:rPr>
-      </w:pPr>
-      <w:r>
-        <w:rPr>
-          <w:rFonts w:ascii="Arial" w:eastAsia="Calibri" w:hAnsi="Arial" w:cs="Arial"/>
-          <w:bCs/>
-          <w:color w:val="000000"/>
-          <w:sz w:val="20"/>
-          <w:szCs w:val="20"/>
-        </w:rPr>
-        <w:t xml:space="preserve">Graduated with </w:t>
-      </w:r>
-      <w:r>
-        <w:rPr>
-          <w:rFonts w:ascii="Arial" w:eastAsia="Calibri" w:hAnsi="Arial" w:cs="Arial"/>
-          <w:bCs/>
-          <w:color w:val="000000"/>
-          <w:sz w:val="20"/>
-          <w:szCs w:val="20"/>
-        </w:rPr>
-        <w:t>First Class Honours</w:t>
-      </w:r>
-      <w:r>
-        <w:rPr>
-          <w:rFonts w:ascii="Arial" w:eastAsia="Calibri" w:hAnsi="Arial" w:cs="Arial"/>
-          <w:bCs/>
-          <w:color w:val="000000"/>
-          <w:sz w:val="20"/>
-          <w:szCs w:val="20"/>
-        </w:rPr>
-        <w:t xml:space="preserve">, achieving </w:t>
-      </w:r>
-      <w:r>
-        <w:rPr>
-          <w:rFonts w:ascii="Arial" w:eastAsia="Calibri" w:hAnsi="Arial" w:cs="Arial"/>
-          <w:color w:val="000000"/>
-          <w:sz w:val="20"/>
-          <w:szCs w:val="20"/>
-        </w:rPr>
-        <w:t>83%-</w:t>
-      </w:r>
-      <w:r>
-        <w:rPr>
-          <w:rFonts w:ascii="Arial" w:eastAsia="Calibri" w:hAnsi="Arial" w:cs="Arial"/>
-          <w:color w:val="000000"/>
-          <w:sz w:val="20"/>
-          <w:szCs w:val="20"/>
-        </w:rPr>
-        <w:t>100</w:t>
-      </w:r>
-      <w:r>
-        <w:rPr>
-          <w:rFonts w:ascii="Arial" w:eastAsia="Calibri" w:hAnsi="Arial" w:cs="Arial"/>
-          <w:color w:val="000000"/>
-          <w:sz w:val="20"/>
-          <w:szCs w:val="20"/>
-        </w:rPr>
-        <w:t xml:space="preserve">% in all </w:t>
-      </w:r>
-      <w:r>
-        <w:rPr>
-          <w:rFonts w:ascii="Arial" w:eastAsia="Calibri" w:hAnsi="Arial" w:cs="Arial"/>
-          <w:color w:val="000000"/>
-          <w:sz w:val="20"/>
-          <w:szCs w:val="20"/>
-        </w:rPr>
-        <w:t>10</w:t>
-      </w:r>
-      <w:r>
-        <w:rPr>
-          <w:rFonts w:ascii="Arial" w:eastAsia="Calibri" w:hAnsi="Arial" w:cs="Arial"/>
-          <w:color w:val="000000"/>
-          <w:sz w:val="20"/>
-          <w:szCs w:val="20"/>
-        </w:rPr>
-        <w:t xml:space="preserve"> </w:t>
-      </w:r>
-      <w:r>
-        <w:rPr>
-          <w:rFonts w:ascii="Arial" w:eastAsia="Calibri" w:hAnsi="Arial" w:cs="Arial"/>
-          <w:color w:val="000000"/>
-          <w:sz w:val="20"/>
-          <w:szCs w:val="20"/>
-        </w:rPr>
-        <w:t>software engineering courses.</w:t>
-      </w:r>
-    </w:p>
-    <w:p>
-      <w:pPr>
-        <w:pStyle w:val="ListParagraph"/>
-        <w:numPr>
-          <w:ilvl w:val="0"/>
-          <w:numId w:val="6"/>
-        </w:numPr>
-        <w:pBdr>
-          <w:top w:val="nil"/>
-          <w:left w:val="nil"/>
-          <w:bottom w:val="nil"/>
-          <w:right w:val="nil"/>
-          <w:between w:val="nil"/>
-        </w:pBdr>
-        <w:rPr>
-          <w:rFonts w:ascii="Arial" w:eastAsia="Calibri" w:hAnsi="Arial" w:cs="Arial"/>
-          <w:bCs/>
-          <w:color w:val="000000"/>
-          <w:sz w:val="20"/>
-          <w:szCs w:val="20"/>
-        </w:rPr>
-      </w:pPr>
-      <w:r>
-        <w:rPr>
-          <w:rFonts w:ascii="Arial" w:eastAsia="Calibri" w:hAnsi="Arial" w:cs="Arial"/>
-          <w:bCs/>
-          <w:color w:val="000000"/>
-          <w:sz w:val="20"/>
-          <w:szCs w:val="20"/>
-        </w:rPr>
-        <w:t>Awarded British Computer Society (BCS) Prize for Top Performance in Professional Issues (99%).</w:t>
       </w:r>
     </w:p>
     <w:p>
@@ -3859,6 +4342,119 @@
     <w:nsid w:val="6B625854"/>
     <w:multiLevelType w:val="hybridMultilevel"/>
     <w:tmpl w:val="CB341F6E"/>
+    <w:lvl w:ilvl="0" w:tplc="08090001">
+      <w:start w:val="1"/>
+      <w:numFmt w:val="bullet"/>
+      <w:lvlText w:val=""/>
+      <w:lvlJc w:val="left"/>
+      <w:pPr>
+        <w:ind w:left="720" w:hanging="360"/>
+      </w:pPr>
+      <w:rPr>
+        <w:rFonts w:ascii="Symbol" w:hAnsi="Symbol" w:hint="default"/>
+      </w:rPr>
+    </w:lvl>
+    <w:lvl w:ilvl="1" w:tplc="08090003" w:tentative="1">
+      <w:start w:val="1"/>
+      <w:numFmt w:val="bullet"/>
+      <w:lvlText w:val="o"/>
+      <w:lvlJc w:val="left"/>
+      <w:pPr>
+        <w:ind w:left="1440" w:hanging="360"/>
+      </w:pPr>
+      <w:rPr>
+        <w:rFonts w:ascii="Courier New" w:hAnsi="Courier New" w:cs="Courier New" w:hint="default"/>
+      </w:rPr>
+    </w:lvl>
+    <w:lvl w:ilvl="2" w:tplc="08090005" w:tentative="1">
+      <w:start w:val="1"/>
+      <w:numFmt w:val="bullet"/>
+      <w:lvlText w:val=""/>
+      <w:lvlJc w:val="left"/>
+      <w:pPr>
+        <w:ind w:left="2160" w:hanging="360"/>
+      </w:pPr>
+      <w:rPr>
+        <w:rFonts w:ascii="Wingdings" w:hAnsi="Wingdings" w:hint="default"/>
+      </w:rPr>
+    </w:lvl>
+    <w:lvl w:ilvl="3" w:tplc="08090001" w:tentative="1">
+      <w:start w:val="1"/>
+      <w:numFmt w:val="bullet"/>
+      <w:lvlText w:val=""/>
+      <w:lvlJc w:val="left"/>
+      <w:pPr>
+        <w:ind w:left="2880" w:hanging="360"/>
+      </w:pPr>
+      <w:rPr>
+        <w:rFonts w:ascii="Symbol" w:hAnsi="Symbol" w:hint="default"/>
+      </w:rPr>
+    </w:lvl>
+    <w:lvl w:ilvl="4" w:tplc="08090003" w:tentative="1">
+      <w:start w:val="1"/>
+      <w:numFmt w:val="bullet"/>
+      <w:lvlText w:val="o"/>
+      <w:lvlJc w:val="left"/>
+      <w:pPr>
+        <w:ind w:left="3600" w:hanging="360"/>
+      </w:pPr>
+      <w:rPr>
+        <w:rFonts w:ascii="Courier New" w:hAnsi="Courier New" w:cs="Courier New" w:hint="default"/>
+      </w:rPr>
+    </w:lvl>
+    <w:lvl w:ilvl="5" w:tplc="08090005" w:tentative="1">
+      <w:start w:val="1"/>
+      <w:numFmt w:val="bullet"/>
+      <w:lvlText w:val=""/>
+      <w:lvlJc w:val="left"/>
+      <w:pPr>
+        <w:ind w:left="4320" w:hanging="360"/>
+      </w:pPr>
+      <w:rPr>
+        <w:rFonts w:ascii="Wingdings" w:hAnsi="Wingdings" w:hint="default"/>
+      </w:rPr>
+    </w:lvl>
+    <w:lvl w:ilvl="6" w:tplc="08090001" w:tentative="1">
+      <w:start w:val="1"/>
+      <w:numFmt w:val="bullet"/>
+      <w:lvlText w:val=""/>
+      <w:lvlJc w:val="left"/>
+      <w:pPr>
+        <w:ind w:left="5040" w:hanging="360"/>
+      </w:pPr>
+      <w:rPr>
+        <w:rFonts w:ascii="Symbol" w:hAnsi="Symbol" w:hint="default"/>
+      </w:rPr>
+    </w:lvl>
+    <w:lvl w:ilvl="7" w:tplc="08090003" w:tentative="1">
+      <w:start w:val="1"/>
+      <w:numFmt w:val="bullet"/>
+      <w:lvlText w:val="o"/>
+      <w:lvlJc w:val="left"/>
+      <w:pPr>
+        <w:ind w:left="5760" w:hanging="360"/>
+      </w:pPr>
+      <w:rPr>
+        <w:rFonts w:ascii="Courier New" w:hAnsi="Courier New" w:cs="Courier New" w:hint="default"/>
+      </w:rPr>
+    </w:lvl>
+    <w:lvl w:ilvl="8" w:tplc="08090005" w:tentative="1">
+      <w:start w:val="1"/>
+      <w:numFmt w:val="bullet"/>
+      <w:lvlText w:val=""/>
+      <w:lvlJc w:val="left"/>
+      <w:pPr>
+        <w:ind w:left="6480" w:hanging="360"/>
+      </w:pPr>
+      <w:rPr>
+        <w:rFonts w:ascii="Wingdings" w:hAnsi="Wingdings" w:hint="default"/>
+      </w:rPr>
+    </w:lvl>
+  </w:abstractNum>
+  <w:abstractNum w:abstractNumId="6" w15:restartNumberingAfterBreak="0">
+    <w:nsid w:val="7E501145"/>
+    <w:multiLevelType w:val="hybridMultilevel"/>
+    <w:tmpl w:val="76285D14"/>
     <w:lvl w:ilvl="0" w:tplc="08090001">
       <w:start w:val="1"/>
       <w:numFmt w:val="bullet"/>
@@ -3985,6 +4581,9 @@
   </w:num>
   <w:num w:numId="6" w16cid:durableId="1128821433">
     <w:abstractNumId w:val="5"/>
+  </w:num>
+  <w:num w:numId="7" w16cid:durableId="1264924548">
+    <w:abstractNumId w:val="6"/>
   </w:num>
 </w:numbering>
 </file>

</xml_diff>

<commit_message>
swap resume bullet point order
</commit_message>
<xml_diff>
--- a/apache2/www/public/engineer/engineer-resume.docx
+++ b/apache2/www/public/engineer/engineer-resume.docx
@@ -927,16 +927,7 @@
           <w:sz w:val="20"/>
           <w:szCs w:val="20"/>
         </w:rPr>
-        <w:t>Bash</w:t>
-      </w:r>
-      <w:r>
-        <w:rPr>
-          <w:rFonts w:ascii="Arial" w:eastAsia="Calibri" w:hAnsi="Arial" w:cs="Arial"/>
-          <w:color w:val="000000"/>
-          <w:sz w:val="20"/>
-          <w:szCs w:val="20"/>
-        </w:rPr>
-        <w:t>, Ruby,</w:t>
+        <w:t>Bash, Ruby,</w:t>
       </w:r>
       <w:r>
         <w:rPr>
@@ -1330,19 +1321,8 @@
           <w:sz w:val="20"/>
           <w:szCs w:val="20"/>
         </w:rPr>
-        <w:t xml:space="preserve">object-oriented programming, databases, </w:t>
-      </w:r>
-      <w:proofErr w:type="gramStart"/>
-      <w:r>
-        <w:rPr>
-          <w:rFonts w:ascii="Arial" w:eastAsia="Calibri" w:hAnsi="Arial" w:cs="Arial"/>
-          <w:color w:val="000000"/>
-          <w:sz w:val="20"/>
-          <w:szCs w:val="20"/>
-        </w:rPr>
-        <w:t>algorithms</w:t>
-      </w:r>
-      <w:proofErr w:type="gramEnd"/>
+        <w:t>object-oriented programming, databases, algorithms</w:t>
+      </w:r>
       <w:r>
         <w:rPr>
           <w:rFonts w:ascii="Arial" w:eastAsia="Calibri" w:hAnsi="Arial" w:cs="Arial"/>
@@ -2367,121 +2347,111 @@
         </w:pBdr>
         <w:rPr>
           <w:rFonts w:ascii="Arial" w:eastAsia="Calibri" w:hAnsi="Arial" w:cs="Arial"/>
-          <w:bCs/>
-          <w:color w:val="000000"/>
-          <w:sz w:val="20"/>
-          <w:szCs w:val="20"/>
-        </w:rPr>
-      </w:pPr>
-      <w:r>
-        <w:rPr>
-          <w:rFonts w:ascii="Arial" w:eastAsia="Calibri" w:hAnsi="Arial" w:cs="Arial"/>
-          <w:bCs/>
-          <w:color w:val="000000"/>
-          <w:sz w:val="20"/>
-          <w:szCs w:val="20"/>
-        </w:rPr>
-        <w:t xml:space="preserve">Implemented .docx file handling </w:t>
-      </w:r>
-      <w:r>
-        <w:rPr>
-          <w:rFonts w:ascii="Arial" w:eastAsia="Calibri" w:hAnsi="Arial" w:cs="Arial"/>
-          <w:bCs/>
-          <w:color w:val="000000"/>
-          <w:sz w:val="20"/>
-          <w:szCs w:val="20"/>
-        </w:rPr>
-        <w:t xml:space="preserve">for </w:t>
-      </w:r>
-      <w:r>
-        <w:rPr>
-          <w:rFonts w:ascii="Arial" w:eastAsia="Calibri" w:hAnsi="Arial" w:cs="Arial"/>
-          <w:bCs/>
-          <w:color w:val="000000"/>
-          <w:sz w:val="20"/>
-          <w:szCs w:val="20"/>
-        </w:rPr>
-        <w:t>template uploads</w:t>
-      </w:r>
-      <w:r>
-        <w:rPr>
-          <w:rFonts w:ascii="Arial" w:eastAsia="Calibri" w:hAnsi="Arial" w:cs="Arial"/>
-          <w:bCs/>
-          <w:color w:val="000000"/>
-          <w:sz w:val="20"/>
-          <w:szCs w:val="20"/>
-        </w:rPr>
-        <w:t xml:space="preserve"> and </w:t>
-      </w:r>
-      <w:r>
-        <w:rPr>
-          <w:rFonts w:ascii="Arial" w:eastAsia="Calibri" w:hAnsi="Arial" w:cs="Arial"/>
-          <w:bCs/>
-          <w:color w:val="000000"/>
-          <w:sz w:val="20"/>
-          <w:szCs w:val="20"/>
-        </w:rPr>
-        <w:t>allow</w:t>
-      </w:r>
-      <w:r>
-        <w:rPr>
-          <w:rFonts w:ascii="Arial" w:eastAsia="Calibri" w:hAnsi="Arial" w:cs="Arial"/>
-          <w:bCs/>
-          <w:color w:val="000000"/>
-          <w:sz w:val="20"/>
-          <w:szCs w:val="20"/>
-        </w:rPr>
-        <w:t>ed user</w:t>
-      </w:r>
-      <w:r>
-        <w:rPr>
-          <w:rFonts w:ascii="Arial" w:eastAsia="Calibri" w:hAnsi="Arial" w:cs="Arial"/>
-          <w:bCs/>
-          <w:color w:val="000000"/>
-          <w:sz w:val="20"/>
-          <w:szCs w:val="20"/>
-        </w:rPr>
-        <w:t xml:space="preserve"> customi</w:t>
-      </w:r>
-      <w:r>
-        <w:rPr>
-          <w:rFonts w:ascii="Arial" w:eastAsia="Calibri" w:hAnsi="Arial" w:cs="Arial"/>
-          <w:bCs/>
-          <w:color w:val="000000"/>
-          <w:sz w:val="20"/>
-          <w:szCs w:val="20"/>
-        </w:rPr>
-        <w:t>s</w:t>
-      </w:r>
-      <w:r>
-        <w:rPr>
-          <w:rFonts w:ascii="Arial" w:eastAsia="Calibri" w:hAnsi="Arial" w:cs="Arial"/>
-          <w:bCs/>
-          <w:color w:val="000000"/>
-          <w:sz w:val="20"/>
-          <w:szCs w:val="20"/>
-        </w:rPr>
-        <w:t xml:space="preserve">ation </w:t>
-      </w:r>
-      <w:r>
-        <w:rPr>
-          <w:rFonts w:ascii="Arial" w:eastAsia="Calibri" w:hAnsi="Arial" w:cs="Arial"/>
-          <w:bCs/>
-          <w:color w:val="000000"/>
-          <w:sz w:val="20"/>
-          <w:szCs w:val="20"/>
-        </w:rPr>
-        <w:t>of uploaded templates</w:t>
-      </w:r>
-      <w:r>
-        <w:rPr>
-          <w:rFonts w:ascii="Arial" w:eastAsia="Calibri" w:hAnsi="Arial" w:cs="Arial"/>
-          <w:bCs/>
-          <w:color w:val="000000"/>
-          <w:sz w:val="20"/>
-          <w:szCs w:val="20"/>
-        </w:rPr>
-        <w:t>.</w:t>
+          <w:b/>
+          <w:color w:val="000000"/>
+          <w:sz w:val="20"/>
+          <w:szCs w:val="20"/>
+        </w:rPr>
+      </w:pPr>
+      <w:r>
+        <w:rPr>
+          <w:rFonts w:ascii="Arial" w:eastAsia="Calibri" w:hAnsi="Arial" w:cs="Arial"/>
+          <w:bCs/>
+          <w:color w:val="000000"/>
+          <w:sz w:val="20"/>
+          <w:szCs w:val="20"/>
+        </w:rPr>
+        <w:t>Leveraged OpenAI API to p</w:t>
+      </w:r>
+      <w:r>
+        <w:rPr>
+          <w:rFonts w:ascii="Arial" w:eastAsia="Calibri" w:hAnsi="Arial" w:cs="Arial"/>
+          <w:bCs/>
+          <w:color w:val="000000"/>
+          <w:sz w:val="20"/>
+          <w:szCs w:val="20"/>
+        </w:rPr>
+        <w:t>ionee</w:t>
+      </w:r>
+      <w:r>
+        <w:rPr>
+          <w:rFonts w:ascii="Arial" w:eastAsia="Calibri" w:hAnsi="Arial" w:cs="Arial"/>
+          <w:bCs/>
+          <w:color w:val="000000"/>
+          <w:sz w:val="20"/>
+          <w:szCs w:val="20"/>
+        </w:rPr>
+        <w:t>r</w:t>
+      </w:r>
+      <w:r>
+        <w:rPr>
+          <w:rFonts w:ascii="Arial" w:eastAsia="Calibri" w:hAnsi="Arial" w:cs="Arial"/>
+          <w:bCs/>
+          <w:color w:val="000000"/>
+          <w:sz w:val="20"/>
+          <w:szCs w:val="20"/>
+        </w:rPr>
+        <w:t xml:space="preserve"> AI-driven</w:t>
+      </w:r>
+      <w:r>
+        <w:rPr>
+          <w:rFonts w:ascii="Arial" w:eastAsia="Calibri" w:hAnsi="Arial" w:cs="Arial"/>
+          <w:bCs/>
+          <w:color w:val="000000"/>
+          <w:sz w:val="20"/>
+          <w:szCs w:val="20"/>
+        </w:rPr>
+        <w:t xml:space="preserve"> automatic</w:t>
+      </w:r>
+      <w:r>
+        <w:rPr>
+          <w:rFonts w:ascii="Arial" w:eastAsia="Calibri" w:hAnsi="Arial" w:cs="Arial"/>
+          <w:bCs/>
+          <w:color w:val="000000"/>
+          <w:sz w:val="20"/>
+          <w:szCs w:val="20"/>
+        </w:rPr>
+        <w:t xml:space="preserve"> </w:t>
+      </w:r>
+      <w:r>
+        <w:rPr>
+          <w:rFonts w:ascii="Arial" w:eastAsia="Calibri" w:hAnsi="Arial" w:cs="Arial"/>
+          <w:bCs/>
+          <w:color w:val="000000"/>
+          <w:sz w:val="20"/>
+          <w:szCs w:val="20"/>
+        </w:rPr>
+        <w:t>tailoring of resume</w:t>
+      </w:r>
+      <w:r>
+        <w:rPr>
+          <w:rFonts w:ascii="Arial" w:eastAsia="Calibri" w:hAnsi="Arial" w:cs="Arial"/>
+          <w:bCs/>
+          <w:color w:val="000000"/>
+          <w:sz w:val="20"/>
+          <w:szCs w:val="20"/>
+        </w:rPr>
+        <w:t xml:space="preserve">s and </w:t>
+      </w:r>
+      <w:r>
+        <w:rPr>
+          <w:rFonts w:ascii="Arial" w:eastAsia="Calibri" w:hAnsi="Arial" w:cs="Arial"/>
+          <w:bCs/>
+          <w:color w:val="000000"/>
+          <w:sz w:val="20"/>
+          <w:szCs w:val="20"/>
+        </w:rPr>
+        <w:t>cover letters</w:t>
+      </w:r>
+      <w:r>
+        <w:rPr>
+          <w:rFonts w:ascii="Arial" w:eastAsia="Calibri" w:hAnsi="Arial" w:cs="Arial"/>
+          <w:bCs/>
+          <w:color w:val="000000"/>
+          <w:sz w:val="20"/>
+          <w:szCs w:val="20"/>
+        </w:rPr>
+        <w:t xml:space="preserve"> to each job.</w:t>
       </w:r>
     </w:p>
     <w:p>
@@ -2514,97 +2484,97 @@
           <w:sz w:val="20"/>
           <w:szCs w:val="20"/>
         </w:rPr>
-        <w:t>Leveraged OpenAI API to p</w:t>
-      </w:r>
-      <w:r>
-        <w:rPr>
-          <w:rFonts w:ascii="Arial" w:eastAsia="Calibri" w:hAnsi="Arial" w:cs="Arial"/>
-          <w:bCs/>
-          <w:color w:val="000000"/>
-          <w:sz w:val="20"/>
-          <w:szCs w:val="20"/>
-        </w:rPr>
-        <w:t>ionee</w:t>
-      </w:r>
-      <w:r>
-        <w:rPr>
-          <w:rFonts w:ascii="Arial" w:eastAsia="Calibri" w:hAnsi="Arial" w:cs="Arial"/>
-          <w:bCs/>
-          <w:color w:val="000000"/>
-          <w:sz w:val="20"/>
-          <w:szCs w:val="20"/>
-        </w:rPr>
-        <w:t>r</w:t>
-      </w:r>
-      <w:r>
-        <w:rPr>
-          <w:rFonts w:ascii="Arial" w:eastAsia="Calibri" w:hAnsi="Arial" w:cs="Arial"/>
-          <w:bCs/>
-          <w:color w:val="000000"/>
-          <w:sz w:val="20"/>
-          <w:szCs w:val="20"/>
-        </w:rPr>
-        <w:t xml:space="preserve"> AI-driven</w:t>
-      </w:r>
-      <w:r>
-        <w:rPr>
-          <w:rFonts w:ascii="Arial" w:eastAsia="Calibri" w:hAnsi="Arial" w:cs="Arial"/>
-          <w:bCs/>
-          <w:color w:val="000000"/>
-          <w:sz w:val="20"/>
-          <w:szCs w:val="20"/>
-        </w:rPr>
-        <w:t xml:space="preserve"> automatic</w:t>
-      </w:r>
-      <w:r>
-        <w:rPr>
-          <w:rFonts w:ascii="Arial" w:eastAsia="Calibri" w:hAnsi="Arial" w:cs="Arial"/>
-          <w:bCs/>
-          <w:color w:val="000000"/>
-          <w:sz w:val="20"/>
-          <w:szCs w:val="20"/>
-        </w:rPr>
-        <w:t xml:space="preserve"> </w:t>
-      </w:r>
-      <w:r>
-        <w:rPr>
-          <w:rFonts w:ascii="Arial" w:eastAsia="Calibri" w:hAnsi="Arial" w:cs="Arial"/>
-          <w:bCs/>
-          <w:color w:val="000000"/>
-          <w:sz w:val="20"/>
-          <w:szCs w:val="20"/>
-        </w:rPr>
-        <w:t>tailoring of resume</w:t>
-      </w:r>
-      <w:r>
-        <w:rPr>
-          <w:rFonts w:ascii="Arial" w:eastAsia="Calibri" w:hAnsi="Arial" w:cs="Arial"/>
-          <w:bCs/>
-          <w:color w:val="000000"/>
-          <w:sz w:val="20"/>
-          <w:szCs w:val="20"/>
-        </w:rPr>
-        <w:t xml:space="preserve">s and </w:t>
-      </w:r>
-      <w:r>
-        <w:rPr>
-          <w:rFonts w:ascii="Arial" w:eastAsia="Calibri" w:hAnsi="Arial" w:cs="Arial"/>
-          <w:bCs/>
-          <w:color w:val="000000"/>
-          <w:sz w:val="20"/>
-          <w:szCs w:val="20"/>
-        </w:rPr>
-        <w:t>cover letters</w:t>
-      </w:r>
-      <w:r>
-        <w:rPr>
-          <w:rFonts w:ascii="Arial" w:eastAsia="Calibri" w:hAnsi="Arial" w:cs="Arial"/>
-          <w:bCs/>
-          <w:color w:val="000000"/>
-          <w:sz w:val="20"/>
-          <w:szCs w:val="20"/>
-        </w:rPr>
-        <w:t xml:space="preserve"> to each job.</w:t>
+        <w:t xml:space="preserve">Implemented .docx file handling </w:t>
+      </w:r>
+      <w:r>
+        <w:rPr>
+          <w:rFonts w:ascii="Arial" w:eastAsia="Calibri" w:hAnsi="Arial" w:cs="Arial"/>
+          <w:bCs/>
+          <w:color w:val="000000"/>
+          <w:sz w:val="20"/>
+          <w:szCs w:val="20"/>
+        </w:rPr>
+        <w:t xml:space="preserve">for </w:t>
+      </w:r>
+      <w:r>
+        <w:rPr>
+          <w:rFonts w:ascii="Arial" w:eastAsia="Calibri" w:hAnsi="Arial" w:cs="Arial"/>
+          <w:bCs/>
+          <w:color w:val="000000"/>
+          <w:sz w:val="20"/>
+          <w:szCs w:val="20"/>
+        </w:rPr>
+        <w:t>template uploads</w:t>
+      </w:r>
+      <w:r>
+        <w:rPr>
+          <w:rFonts w:ascii="Arial" w:eastAsia="Calibri" w:hAnsi="Arial" w:cs="Arial"/>
+          <w:bCs/>
+          <w:color w:val="000000"/>
+          <w:sz w:val="20"/>
+          <w:szCs w:val="20"/>
+        </w:rPr>
+        <w:t xml:space="preserve"> and </w:t>
+      </w:r>
+      <w:r>
+        <w:rPr>
+          <w:rFonts w:ascii="Arial" w:eastAsia="Calibri" w:hAnsi="Arial" w:cs="Arial"/>
+          <w:bCs/>
+          <w:color w:val="000000"/>
+          <w:sz w:val="20"/>
+          <w:szCs w:val="20"/>
+        </w:rPr>
+        <w:t>allow</w:t>
+      </w:r>
+      <w:r>
+        <w:rPr>
+          <w:rFonts w:ascii="Arial" w:eastAsia="Calibri" w:hAnsi="Arial" w:cs="Arial"/>
+          <w:bCs/>
+          <w:color w:val="000000"/>
+          <w:sz w:val="20"/>
+          <w:szCs w:val="20"/>
+        </w:rPr>
+        <w:t>ed user</w:t>
+      </w:r>
+      <w:r>
+        <w:rPr>
+          <w:rFonts w:ascii="Arial" w:eastAsia="Calibri" w:hAnsi="Arial" w:cs="Arial"/>
+          <w:bCs/>
+          <w:color w:val="000000"/>
+          <w:sz w:val="20"/>
+          <w:szCs w:val="20"/>
+        </w:rPr>
+        <w:t xml:space="preserve"> customi</w:t>
+      </w:r>
+      <w:r>
+        <w:rPr>
+          <w:rFonts w:ascii="Arial" w:eastAsia="Calibri" w:hAnsi="Arial" w:cs="Arial"/>
+          <w:bCs/>
+          <w:color w:val="000000"/>
+          <w:sz w:val="20"/>
+          <w:szCs w:val="20"/>
+        </w:rPr>
+        <w:t>s</w:t>
+      </w:r>
+      <w:r>
+        <w:rPr>
+          <w:rFonts w:ascii="Arial" w:eastAsia="Calibri" w:hAnsi="Arial" w:cs="Arial"/>
+          <w:bCs/>
+          <w:color w:val="000000"/>
+          <w:sz w:val="20"/>
+          <w:szCs w:val="20"/>
+        </w:rPr>
+        <w:t xml:space="preserve">ation </w:t>
+      </w:r>
+      <w:r>
+        <w:rPr>
+          <w:rFonts w:ascii="Arial" w:eastAsia="Calibri" w:hAnsi="Arial" w:cs="Arial"/>
+          <w:bCs/>
+          <w:color w:val="000000"/>
+          <w:sz w:val="20"/>
+          <w:szCs w:val="20"/>
+        </w:rPr>
+        <w:t>of uploaded templates.</w:t>
       </w:r>
     </w:p>
     <w:p>
@@ -2684,27 +2654,7 @@
             <w:sz w:val="20"/>
             <w:szCs w:val="20"/>
           </w:rPr>
-          <w:t>https://rmsy.</w:t>
-        </w:r>
-        <w:r>
-          <w:rPr>
-            <w:rStyle w:val="Hyperlink"/>
-            <w:rFonts w:ascii="Arial" w:eastAsia="Calibri" w:hAnsi="Arial" w:cs="Arial"/>
-            <w:b/>
-            <w:sz w:val="20"/>
-            <w:szCs w:val="20"/>
-          </w:rPr>
-          <w:t>m</w:t>
-        </w:r>
-        <w:r>
-          <w:rPr>
-            <w:rStyle w:val="Hyperlink"/>
-            <w:rFonts w:ascii="Arial" w:eastAsia="Calibri" w:hAnsi="Arial" w:cs="Arial"/>
-            <w:b/>
-            <w:sz w:val="20"/>
-            <w:szCs w:val="20"/>
-          </w:rPr>
-          <w:t>e/projects/website/</w:t>
+          <w:t>https://rmsy.me/projects/website/</w:t>
         </w:r>
       </w:hyperlink>
     </w:p>
@@ -3665,29 +3615,7 @@
           <w:sz w:val="20"/>
           <w:szCs w:val="20"/>
         </w:rPr>
-        <w:t xml:space="preserve">High school: outperformed typical academic path with straight </w:t>
-      </w:r>
-      <w:proofErr w:type="gramStart"/>
-      <w:r>
-        <w:rPr>
-          <w:rFonts w:ascii="Arial" w:eastAsia="Calibri" w:hAnsi="Arial" w:cs="Arial"/>
-          <w:bCs/>
-          <w:color w:val="000000"/>
-          <w:sz w:val="20"/>
-          <w:szCs w:val="20"/>
-        </w:rPr>
-        <w:t>As</w:t>
-      </w:r>
-      <w:proofErr w:type="gramEnd"/>
-      <w:r>
-        <w:rPr>
-          <w:rFonts w:ascii="Arial" w:eastAsia="Calibri" w:hAnsi="Arial" w:cs="Arial"/>
-          <w:bCs/>
-          <w:color w:val="000000"/>
-          <w:sz w:val="20"/>
-          <w:szCs w:val="20"/>
-        </w:rPr>
-        <w:t xml:space="preserve"> in 4 Advanced Highers (typical path is 3)</w:t>
+        <w:t>High school: outperformed typical academic path with straight As in 4 Advanced Highers (typical path is 3)</w:t>
       </w:r>
       <w:r>
         <w:rPr>

</xml_diff>

<commit_message>
fix resume formatting issue
</commit_message>
<xml_diff>
--- a/apache2/www/public/engineer/engineer-resume.docx
+++ b/apache2/www/public/engineer/engineer-resume.docx
@@ -147,9 +147,10 @@
           <w:rStyle w:val="Hyperlink"/>
           <w:rFonts w:ascii="Arial" w:eastAsia="Calibri" w:hAnsi="Arial" w:cs="Arial"/>
           <w:bCs/>
-          <w:color w:val="4472C4" w:themeColor="accent1"/>
-          <w:sz w:val="20"/>
-          <w:szCs w:val="20"/>
+          <w:color w:val="000000" w:themeColor="text1"/>
+          <w:sz w:val="20"/>
+          <w:szCs w:val="20"/>
+          <w:u w:val="none"/>
         </w:rPr>
         <w:t xml:space="preserve"> |</w:t>
       </w:r>
@@ -1321,8 +1322,19 @@
           <w:sz w:val="20"/>
           <w:szCs w:val="20"/>
         </w:rPr>
-        <w:t>object-oriented programming, databases, algorithms</w:t>
-      </w:r>
+        <w:t xml:space="preserve">object-oriented programming, databases, </w:t>
+      </w:r>
+      <w:proofErr w:type="gramStart"/>
+      <w:r>
+        <w:rPr>
+          <w:rFonts w:ascii="Arial" w:eastAsia="Calibri" w:hAnsi="Arial" w:cs="Arial"/>
+          <w:color w:val="000000"/>
+          <w:sz w:val="20"/>
+          <w:szCs w:val="20"/>
+        </w:rPr>
+        <w:t>algorithms</w:t>
+      </w:r>
+      <w:proofErr w:type="gramEnd"/>
       <w:r>
         <w:rPr>
           <w:rFonts w:ascii="Arial" w:eastAsia="Calibri" w:hAnsi="Arial" w:cs="Arial"/>
@@ -3615,7 +3627,29 @@
           <w:sz w:val="20"/>
           <w:szCs w:val="20"/>
         </w:rPr>
-        <w:t>High school: outperformed typical academic path with straight As in 4 Advanced Highers (typical path is 3)</w:t>
+        <w:t xml:space="preserve">High school: outperformed typical academic path with straight </w:t>
+      </w:r>
+      <w:proofErr w:type="gramStart"/>
+      <w:r>
+        <w:rPr>
+          <w:rFonts w:ascii="Arial" w:eastAsia="Calibri" w:hAnsi="Arial" w:cs="Arial"/>
+          <w:bCs/>
+          <w:color w:val="000000"/>
+          <w:sz w:val="20"/>
+          <w:szCs w:val="20"/>
+        </w:rPr>
+        <w:t>As</w:t>
+      </w:r>
+      <w:proofErr w:type="gramEnd"/>
+      <w:r>
+        <w:rPr>
+          <w:rFonts w:ascii="Arial" w:eastAsia="Calibri" w:hAnsi="Arial" w:cs="Arial"/>
+          <w:bCs/>
+          <w:color w:val="000000"/>
+          <w:sz w:val="20"/>
+          <w:szCs w:val="20"/>
+        </w:rPr>
+        <w:t xml:space="preserve"> in 4 Advanced Highers (typical path is 3)</w:t>
       </w:r>
       <w:r>
         <w:rPr>

</xml_diff>